<commit_message>
chore: Se declara la Arquitectura, patrones de diseño y herramientas que se utilizaran tanto en el frontend como en el backend.
</commit_message>
<xml_diff>
--- a/documentacion/ADD - Documento de Definición de Arquitectura - PideAlToke .docx
+++ b/documentacion/ADD - Documento de Definición de Arquitectura - PideAlToke .docx
@@ -1,6 +1,6 @@
 
 <file path=word/document.xml><?xml version="1.0" encoding="utf-8"?>
-<w:document xmlns:wpc="http://schemas.microsoft.com/office/word/2010/wordprocessingCanvas" xmlns:cx="http://schemas.microsoft.com/office/drawing/2014/chartex" xmlns:cx1="http://schemas.microsoft.com/office/drawing/2015/9/8/chartex" xmlns:cx2="http://schemas.microsoft.com/office/drawing/2015/10/21/chartex" xmlns:cx3="http://schemas.microsoft.com/office/drawing/2016/5/9/chartex" xmlns:cx4="http://schemas.microsoft.com/office/drawing/2016/5/10/chartex" xmlns:cx5="http://schemas.microsoft.com/office/drawing/2016/5/11/chartex" xmlns:cx6="http://schemas.microsoft.com/office/drawing/2016/5/12/chartex" xmlns:cx7="http://schemas.microsoft.com/office/drawing/2016/5/13/chartex" xmlns:cx8="http://schemas.microsoft.com/office/drawing/2016/5/14/chartex" xmlns:mc="http://schemas.openxmlformats.org/markup-compatibility/2006" xmlns:aink="http://schemas.microsoft.com/office/drawing/2016/ink" xmlns:am3d="http://schemas.microsoft.com/office/drawing/2017/model3d" xmlns:o="urn:schemas-microsoft-com:office:office" xmlns:oel="http://schemas.microsoft.com/office/2019/extlst" xmlns:r="http://schemas.openxmlformats.org/officeDocument/2006/relationships" xmlns:m="http://schemas.openxmlformats.org/officeDocument/2006/math" xmlns:v="urn:schemas-microsoft-com:vml" xmlns:wp14="http://schemas.microsoft.com/office/word/2010/wordprocessingDrawing" xmlns:wp="http://schemas.openxmlformats.org/drawingml/2006/wordprocessingDrawing" xmlns:w10="urn:schemas-microsoft-com:office:word" xmlns:w="http://schemas.openxmlformats.org/wordprocessingml/2006/main" xmlns:w14="http://schemas.microsoft.com/office/word/2010/wordml" xmlns:w15="http://schemas.microsoft.com/office/word/2012/wordml" xmlns:w16cex="http://schemas.microsoft.com/office/word/2018/wordml/cex" xmlns:w16cid="http://schemas.microsoft.com/office/word/2016/wordml/cid" xmlns:w16="http://schemas.microsoft.com/office/word/2018/wordml" xmlns:w16du="http://schemas.microsoft.com/office/word/2023/wordml/word16du" xmlns:w16sdtdh="http://schemas.microsoft.com/office/word/2020/wordml/sdtdatahash" xmlns:w16sdtfl="http://schemas.microsoft.com/office/word/2024/wordml/sdtformatlock" xmlns:w16se="http://schemas.microsoft.com/office/word/2015/wordml/symex" xmlns:wpg="http://schemas.microsoft.com/office/word/2010/wordprocessingGroup" xmlns:wpi="http://schemas.microsoft.com/office/word/2010/wordprocessingInk" xmlns:wne="http://schemas.microsoft.com/office/word/2006/wordml" xmlns:wps="http://schemas.microsoft.com/office/word/2010/wordprocessingShape" mc:Ignorable="w14 w15 w16se w16cid w16 w16cex w16sdtdh w16sdtfl w16du wp14">
+<w:document xmlns:wpc="http://schemas.microsoft.com/office/word/2010/wordprocessingCanvas" xmlns:cx="http://schemas.microsoft.com/office/drawing/2014/chartex" xmlns:cx1="http://schemas.microsoft.com/office/drawing/2015/9/8/chartex" xmlns:cx2="http://schemas.microsoft.com/office/drawing/2015/10/21/chartex" xmlns:cx3="http://schemas.microsoft.com/office/drawing/2016/5/9/chartex" xmlns:cx4="http://schemas.microsoft.com/office/drawing/2016/5/10/chartex" xmlns:cx5="http://schemas.microsoft.com/office/drawing/2016/5/11/chartex" xmlns:cx6="http://schemas.microsoft.com/office/drawing/2016/5/12/chartex" xmlns:cx7="http://schemas.microsoft.com/office/drawing/2016/5/13/chartex" xmlns:cx8="http://schemas.microsoft.com/office/drawing/2016/5/14/chartex" xmlns:mc="http://schemas.openxmlformats.org/markup-compatibility/2006" xmlns:aink="http://schemas.microsoft.com/office/drawing/2016/ink" xmlns:am3d="http://schemas.microsoft.com/office/drawing/2017/model3d" xmlns:o="urn:schemas-microsoft-com:office:office" xmlns:r="http://schemas.openxmlformats.org/officeDocument/2006/relationships" xmlns:m="http://schemas.openxmlformats.org/officeDocument/2006/math" xmlns:v="urn:schemas-microsoft-com:vml" xmlns:wp14="http://schemas.microsoft.com/office/word/2010/wordprocessingDrawing" xmlns:wp="http://schemas.openxmlformats.org/drawingml/2006/wordprocessingDrawing" xmlns:w10="urn:schemas-microsoft-com:office:word" xmlns:w="http://schemas.openxmlformats.org/wordprocessingml/2006/main" xmlns:w14="http://schemas.microsoft.com/office/word/2010/wordml" xmlns:w15="http://schemas.microsoft.com/office/word/2012/wordml" xmlns:w16cex="http://schemas.microsoft.com/office/word/2018/wordml/cex" xmlns:w16cid="http://schemas.microsoft.com/office/word/2016/wordml/cid" xmlns:w16="http://schemas.microsoft.com/office/word/2018/wordml" xmlns:w16sdtdh="http://schemas.microsoft.com/office/word/2020/wordml/sdtdatahash" xmlns:w16se="http://schemas.microsoft.com/office/word/2015/wordml/symex" xmlns:wpg="http://schemas.microsoft.com/office/word/2010/wordprocessingGroup" xmlns:wpi="http://schemas.microsoft.com/office/word/2010/wordprocessingInk" xmlns:wne="http://schemas.microsoft.com/office/word/2006/wordml" xmlns:wps="http://schemas.microsoft.com/office/word/2010/wordprocessingShape" mc:Ignorable="w14 w15 w16se w16cid w16 w16cex w16sdtdh wp14">
   <w:body>
     <w:sdt>
       <w:sdtPr>
@@ -119,6 +119,7 @@
                 <w:dataBinding w:prefixMappings="xmlns:ns0='http://schemas.openxmlformats.org/package/2006/metadata/core-properties' xmlns:ns1='http://purl.org/dc/elements/1.1/'" w:xpath="/ns0:coreProperties[1]/ns1:title[1]" w:storeItemID="{6C3C8BC8-F283-45AE-878A-BAB7291924A1}"/>
                 <w:text/>
               </w:sdtPr>
+              <w:sdtEndPr/>
               <w:sdtContent>
                 <w:tc>
                   <w:tcPr>
@@ -171,6 +172,7 @@
                 <w:dataBinding w:prefixMappings="xmlns:ns0='http://schemas.openxmlformats.org/package/2006/metadata/core-properties' xmlns:ns1='http://purl.org/dc/elements/1.1/'" w:xpath="/ns0:coreProperties[1]/ns1:subject[1]" w:storeItemID="{6C3C8BC8-F283-45AE-878A-BAB7291924A1}"/>
                 <w:text/>
               </w:sdtPr>
+              <w:sdtEndPr/>
               <w:sdtContent>
                 <w:tc>
                   <w:tcPr>
@@ -337,13 +339,14 @@
                 <w:alias w:val="Fecha"/>
                 <w:id w:val="516659546"/>
                 <w:dataBinding w:prefixMappings="xmlns:ns0='http://schemas.microsoft.com/office/2006/coverPageProps'" w:xpath="/ns0:CoverPageProperties[1]/ns0:PublishDate[1]" w:storeItemID="{55AF091B-3C7A-41E3-B477-F2FDAA23CFDA}"/>
-                <w:date w:fullDate="2026-09-01T00:00:00Z">
+                <w:date w:fullDate="2026-09-02T00:00:00Z">
                   <w:dateFormat w:val="dd/MM/yyyy"/>
                   <w:lid w:val="es-ES"/>
                   <w:storeMappedDataAs w:val="dateTime"/>
                   <w:calendar w:val="gregorian"/>
                 </w:date>
               </w:sdtPr>
+              <w:sdtEndPr/>
               <w:sdtContent>
                 <w:tc>
                   <w:tcPr>
@@ -366,7 +369,15 @@
                         <w:b/>
                         <w:bCs/>
                       </w:rPr>
-                      <w:t>01</w:t>
+                      <w:t>0</w:t>
+                    </w:r>
+                    <w:r>
+                      <w:rPr>
+                        <w:rFonts w:cstheme="minorHAnsi"/>
+                        <w:b/>
+                        <w:bCs/>
+                      </w:rPr>
+                      <w:t>2</w:t>
                     </w:r>
                     <w:r>
                       <w:rPr>
@@ -712,7 +723,7 @@
                 <w:rFonts w:cstheme="minorHAnsi"/>
                 <w:noProof/>
               </w:rPr>
-              <w:t>Vista de contexto y contenedores (Modelo c4 – nivel 1 y 2)</w:t>
+              <w:t>Vista de contexto y contenedores (Modelo c4)</w:t>
             </w:r>
             <w:r>
               <w:rPr>
@@ -1378,7 +1389,16 @@
                 <w:szCs w:val="24"/>
                 <w:lang w:val="es-ES" w:eastAsia="es-ES"/>
               </w:rPr>
-              <w:t>01</w:t>
+              <w:t>0</w:t>
+            </w:r>
+            <w:r>
+              <w:rPr>
+                <w:i/>
+                <w:color w:val="215868" w:themeColor="accent5" w:themeShade="80"/>
+                <w:szCs w:val="24"/>
+                <w:lang w:val="es-ES" w:eastAsia="es-ES"/>
+              </w:rPr>
+              <w:t>2</w:t>
             </w:r>
             <w:r>
               <w:rPr>
@@ -1521,7 +1541,27 @@
                 <w:szCs w:val="24"/>
                 <w:lang w:val="es-ES" w:eastAsia="es-ES"/>
               </w:rPr>
-              <w:t>01/09/2026</w:t>
+              <w:t>0</w:t>
+            </w:r>
+            <w:r>
+              <w:rPr>
+                <w:rFonts w:cstheme="minorHAnsi"/>
+                <w:i/>
+                <w:color w:val="215868" w:themeColor="accent5" w:themeShade="80"/>
+                <w:szCs w:val="24"/>
+                <w:lang w:val="es-ES" w:eastAsia="es-ES"/>
+              </w:rPr>
+              <w:t>2</w:t>
+            </w:r>
+            <w:r>
+              <w:rPr>
+                <w:rFonts w:cstheme="minorHAnsi"/>
+                <w:i/>
+                <w:color w:val="215868" w:themeColor="accent5" w:themeShade="80"/>
+                <w:szCs w:val="24"/>
+                <w:lang w:val="es-ES" w:eastAsia="es-ES"/>
+              </w:rPr>
+              <w:t>/09/2026</w:t>
             </w:r>
           </w:p>
         </w:tc>
@@ -1621,6 +1661,7 @@
           <w:ilvl w:val="0"/>
           <w:numId w:val="13"/>
         </w:numPr>
+        <w:spacing w:line="360" w:lineRule="auto"/>
         <w:jc w:val="both"/>
         <w:rPr>
           <w:rFonts w:asciiTheme="minorHAnsi" w:hAnsiTheme="minorHAnsi" w:cstheme="minorHAnsi"/>
@@ -1637,7 +1678,11 @@
         <w:t>Contexto y Atributos de Calidad</w:t>
       </w:r>
     </w:p>
-    <w:p/>
+    <w:p>
+      <w:pPr>
+        <w:spacing w:line="360" w:lineRule="auto"/>
+      </w:pPr>
+    </w:p>
     <w:p>
       <w:pPr>
         <w:pStyle w:val="Prrafodelista"/>
@@ -1645,6 +1690,7 @@
           <w:ilvl w:val="1"/>
           <w:numId w:val="13"/>
         </w:numPr>
+        <w:spacing w:line="360" w:lineRule="auto"/>
         <w:rPr>
           <w:color w:val="215868" w:themeColor="accent5" w:themeShade="80"/>
           <w:sz w:val="28"/>
@@ -1666,6 +1712,115 @@
           <w:szCs w:val="28"/>
         </w:rPr>
         <w:t>Contexto del Sistema</w:t>
+      </w:r>
+    </w:p>
+    <w:p>
+      <w:pPr>
+        <w:spacing w:line="360" w:lineRule="auto"/>
+      </w:pPr>
+      <w:proofErr w:type="spellStart"/>
+      <w:r>
+        <w:t>PideAlToke</w:t>
+      </w:r>
+      <w:proofErr w:type="spellEnd"/>
+      <w:r>
+        <w:t xml:space="preserve"> es una plataforma Cloud Native orientada al procesamiento y gestión ágil de pedidos comerciales. El sistema está diseñado sobre una arquitectura de microservicios desacoplada expuesta por medio de Amazon API Gateway. En esta etapa de desarrollo, el sistema centra su operación en los 5 microservicios prioritarios:</w:t>
+      </w:r>
+    </w:p>
+    <w:p>
+      <w:pPr>
+        <w:pStyle w:val="Prrafodelista"/>
+        <w:numPr>
+          <w:ilvl w:val="0"/>
+          <w:numId w:val="38"/>
+        </w:numPr>
+        <w:spacing w:line="360" w:lineRule="auto"/>
+        <w:rPr>
+          <w:color w:val="000000" w:themeColor="text1"/>
+        </w:rPr>
+      </w:pPr>
+      <w:r>
+        <w:rPr>
+          <w:color w:val="000000" w:themeColor="text1"/>
+        </w:rPr>
+        <w:t>Usuarios y Roles: Gestión de identidades y permisos del sistema.</w:t>
+      </w:r>
+    </w:p>
+    <w:p>
+      <w:pPr>
+        <w:pStyle w:val="Prrafodelista"/>
+        <w:numPr>
+          <w:ilvl w:val="0"/>
+          <w:numId w:val="38"/>
+        </w:numPr>
+        <w:spacing w:line="360" w:lineRule="auto"/>
+        <w:rPr>
+          <w:color w:val="000000" w:themeColor="text1"/>
+        </w:rPr>
+      </w:pPr>
+      <w:r>
+        <w:rPr>
+          <w:color w:val="000000" w:themeColor="text1"/>
+        </w:rPr>
+        <w:t>Catálogo de Productos: Consulta y mantención de productos.</w:t>
+      </w:r>
+    </w:p>
+    <w:p>
+      <w:pPr>
+        <w:pStyle w:val="Prrafodelista"/>
+        <w:numPr>
+          <w:ilvl w:val="0"/>
+          <w:numId w:val="38"/>
+        </w:numPr>
+        <w:spacing w:line="360" w:lineRule="auto"/>
+        <w:rPr>
+          <w:color w:val="000000" w:themeColor="text1"/>
+        </w:rPr>
+      </w:pPr>
+      <w:r>
+        <w:rPr>
+          <w:color w:val="000000" w:themeColor="text1"/>
+        </w:rPr>
+        <w:t>Inventario: Control de stock disponible en tiempo real.</w:t>
+      </w:r>
+    </w:p>
+    <w:p>
+      <w:pPr>
+        <w:pStyle w:val="Prrafodelista"/>
+        <w:numPr>
+          <w:ilvl w:val="0"/>
+          <w:numId w:val="38"/>
+        </w:numPr>
+        <w:spacing w:line="360" w:lineRule="auto"/>
+        <w:rPr>
+          <w:color w:val="000000" w:themeColor="text1"/>
+        </w:rPr>
+      </w:pPr>
+      <w:r>
+        <w:rPr>
+          <w:color w:val="000000" w:themeColor="text1"/>
+        </w:rPr>
+        <w:lastRenderedPageBreak/>
+        <w:t>Pedidos: Orquestación y ciclo de vida de cada compra realizada.</w:t>
+      </w:r>
+    </w:p>
+    <w:p>
+      <w:pPr>
+        <w:pStyle w:val="Prrafodelista"/>
+        <w:numPr>
+          <w:ilvl w:val="0"/>
+          <w:numId w:val="38"/>
+        </w:numPr>
+        <w:spacing w:line="360" w:lineRule="auto"/>
+        <w:rPr>
+          <w:color w:val="000000" w:themeColor="text1"/>
+        </w:rPr>
+      </w:pPr>
+      <w:r>
+        <w:rPr>
+          <w:color w:val="000000" w:themeColor="text1"/>
+        </w:rPr>
+        <w:t>Pagos: Procesamiento de transacciones financieras.</w:t>
       </w:r>
     </w:p>
     <w:p>
@@ -1675,6 +1830,7 @@
           <w:ilvl w:val="1"/>
           <w:numId w:val="13"/>
         </w:numPr>
+        <w:spacing w:line="360" w:lineRule="auto"/>
         <w:rPr>
           <w:color w:val="215868" w:themeColor="accent5" w:themeShade="80"/>
           <w:sz w:val="28"/>
@@ -1743,6 +1899,159 @@
         <w:t>Requirements</w:t>
       </w:r>
       <w:proofErr w:type="spellEnd"/>
+    </w:p>
+    <w:p>
+      <w:pPr>
+        <w:pStyle w:val="Prrafodelista"/>
+        <w:numPr>
+          <w:ilvl w:val="0"/>
+          <w:numId w:val="37"/>
+        </w:numPr>
+        <w:spacing w:line="360" w:lineRule="auto"/>
+      </w:pPr>
+      <w:r>
+        <w:t>NFR-SEC (Seguridad): Autenticación delegada a Azure AD (</w:t>
+      </w:r>
+      <w:proofErr w:type="spellStart"/>
+      <w:r>
+        <w:t>IDaaS</w:t>
+      </w:r>
+      <w:proofErr w:type="spellEnd"/>
+      <w:r>
+        <w:t xml:space="preserve">) mediante protocolo OAuth2 / OIDC con tokens JWT. Validación obligatoria de JWT en el </w:t>
+      </w:r>
+      <w:proofErr w:type="spellStart"/>
+      <w:r>
+        <w:t>backend</w:t>
+      </w:r>
+      <w:proofErr w:type="spellEnd"/>
+      <w:r>
+        <w:t xml:space="preserve"> (firma, vigencia, </w:t>
+      </w:r>
+      <w:proofErr w:type="spellStart"/>
+      <w:r>
+        <w:rPr>
+          <w:i/>
+          <w:iCs/>
+        </w:rPr>
+        <w:t>issuer</w:t>
+      </w:r>
+      <w:proofErr w:type="spellEnd"/>
+      <w:r>
+        <w:t xml:space="preserve">, </w:t>
+      </w:r>
+      <w:proofErr w:type="spellStart"/>
+      <w:r>
+        <w:rPr>
+          <w:i/>
+          <w:iCs/>
+        </w:rPr>
+        <w:t>audience</w:t>
+      </w:r>
+      <w:proofErr w:type="spellEnd"/>
+      <w:r>
+        <w:t xml:space="preserve"> y </w:t>
+      </w:r>
+      <w:proofErr w:type="spellStart"/>
+      <w:r>
+        <w:rPr>
+          <w:i/>
+          <w:iCs/>
+        </w:rPr>
+        <w:t>claims</w:t>
+      </w:r>
+      <w:proofErr w:type="spellEnd"/>
+      <w:r>
+        <w:t>).</w:t>
+      </w:r>
+    </w:p>
+    <w:p>
+      <w:pPr>
+        <w:pStyle w:val="Prrafodelista"/>
+        <w:numPr>
+          <w:ilvl w:val="0"/>
+          <w:numId w:val="37"/>
+        </w:numPr>
+        <w:spacing w:line="360" w:lineRule="auto"/>
+      </w:pPr>
+      <w:r>
+        <w:t>NFR-ESC (Escalabilidad): Despliegue de microservicios independientes sobre instancias AWS EC2 provisionadas mediante Infraestructura como Código (</w:t>
+      </w:r>
+      <w:proofErr w:type="spellStart"/>
+      <w:r>
+        <w:t>Terraform</w:t>
+      </w:r>
+      <w:proofErr w:type="spellEnd"/>
+      <w:r>
+        <w:t>)</w:t>
+      </w:r>
+      <w:r>
+        <w:t>.</w:t>
+      </w:r>
+    </w:p>
+    <w:p>
+      <w:pPr>
+        <w:pStyle w:val="Prrafodelista"/>
+        <w:numPr>
+          <w:ilvl w:val="0"/>
+          <w:numId w:val="37"/>
+        </w:numPr>
+        <w:spacing w:line="360" w:lineRule="auto"/>
+      </w:pPr>
+      <w:r>
+        <w:t xml:space="preserve">NFR-MNT (Mantenibilidad): Aplicación estricta de la Arquitectura Hexagonal en </w:t>
+      </w:r>
+      <w:proofErr w:type="spellStart"/>
+      <w:r>
+        <w:t>backend</w:t>
+      </w:r>
+      <w:proofErr w:type="spellEnd"/>
+      <w:r>
+        <w:t xml:space="preserve"> y Arquitectura Modular por Dominio en </w:t>
+      </w:r>
+      <w:proofErr w:type="spellStart"/>
+      <w:r>
+        <w:t>frontend</w:t>
+      </w:r>
+      <w:proofErr w:type="spellEnd"/>
+      <w:r>
+        <w:t xml:space="preserve"> para desacoplar capas de infraestructura de las reglas de negocio</w:t>
+      </w:r>
+      <w:r>
+        <w:t>.</w:t>
+      </w:r>
+    </w:p>
+    <w:p>
+      <w:pPr>
+        <w:pStyle w:val="Prrafodelista"/>
+        <w:numPr>
+          <w:ilvl w:val="0"/>
+          <w:numId w:val="37"/>
+        </w:numPr>
+        <w:spacing w:line="360" w:lineRule="auto"/>
+        <w:rPr>
+          <w:color w:val="000000" w:themeColor="text1"/>
+        </w:rPr>
+      </w:pPr>
+      <w:r>
+        <w:t xml:space="preserve">NFR-PERF (Rendimiento): Uso del </w:t>
+      </w:r>
+      <w:proofErr w:type="spellStart"/>
+      <w:r>
+        <w:t>framework</w:t>
+      </w:r>
+      <w:proofErr w:type="spellEnd"/>
+      <w:r>
+        <w:t xml:space="preserve"> asíncrono </w:t>
+      </w:r>
+      <w:proofErr w:type="spellStart"/>
+      <w:r>
+        <w:t>FastAPI</w:t>
+      </w:r>
+      <w:proofErr w:type="spellEnd"/>
+      <w:r>
+        <w:t xml:space="preserve"> (Python) para un procesamiento eficiente de concurrencia e I/O sin bloqueos.</w:t>
+      </w:r>
     </w:p>
     <w:p>
       <w:pPr>
@@ -1751,6 +2060,7 @@
           <w:ilvl w:val="0"/>
           <w:numId w:val="13"/>
         </w:numPr>
+        <w:spacing w:line="360" w:lineRule="auto"/>
         <w:jc w:val="both"/>
         <w:rPr>
           <w:rFonts w:asciiTheme="minorHAnsi" w:hAnsiTheme="minorHAnsi" w:cstheme="minorHAnsi"/>
@@ -1769,27 +2079,18 @@
     </w:p>
     <w:p>
       <w:pPr>
-        <w:ind w:left="360"/>
-        <w:rPr>
-          <w:color w:val="215868" w:themeColor="accent5" w:themeShade="80"/>
-        </w:rPr>
-      </w:pPr>
-      <w:r>
+        <w:pStyle w:val="Prrafodelista"/>
+        <w:numPr>
+          <w:ilvl w:val="1"/>
+          <w:numId w:val="13"/>
+        </w:numPr>
+        <w:spacing w:line="360" w:lineRule="auto"/>
         <w:rPr>
           <w:rFonts w:cstheme="minorHAnsi"/>
           <w:color w:val="215868" w:themeColor="accent5" w:themeShade="80"/>
           <w:sz w:val="32"/>
           <w:szCs w:val="32"/>
         </w:rPr>
-        <w:t xml:space="preserve">2.1 Nivel </w:t>
-      </w:r>
-    </w:p>
-    <w:p>
-      <w:pPr>
-        <w:ind w:left="360"/>
-        <w:rPr>
-          <w:color w:val="215868" w:themeColor="accent5" w:themeShade="80"/>
-        </w:rPr>
       </w:pPr>
       <w:r>
         <w:rPr>
@@ -1798,7 +2099,7 @@
           <w:sz w:val="32"/>
           <w:szCs w:val="32"/>
         </w:rPr>
-        <w:t>2.</w:t>
+        <w:t xml:space="preserve">Nivel </w:t>
       </w:r>
       <w:r>
         <w:rPr>
@@ -1807,16 +2108,221 @@
           <w:sz w:val="32"/>
           <w:szCs w:val="32"/>
         </w:rPr>
-        <w:t>2</w:t>
-      </w:r>
-      <w:r>
+        <w:t>1 – Diagrama del Contexto</w:t>
+      </w:r>
+    </w:p>
+    <w:p>
+      <w:pPr>
+        <w:pStyle w:val="Prrafodelista"/>
+        <w:numPr>
+          <w:ilvl w:val="0"/>
+          <w:numId w:val="36"/>
+        </w:numPr>
+        <w:spacing w:line="360" w:lineRule="auto"/>
+        <w:rPr>
+          <w:color w:val="000000" w:themeColor="text1"/>
+        </w:rPr>
+      </w:pPr>
+      <w:r>
+        <w:rPr>
+          <w:color w:val="000000" w:themeColor="text1"/>
+        </w:rPr>
+        <w:t xml:space="preserve">Usuario / Cliente: Interactúa con la SPA en Angular para </w:t>
+      </w:r>
+      <w:r>
+        <w:rPr>
+          <w:color w:val="000000" w:themeColor="text1"/>
+        </w:rPr>
+        <w:t xml:space="preserve">mirar el catálogo, </w:t>
+      </w:r>
+      <w:r>
+        <w:rPr>
+          <w:color w:val="000000" w:themeColor="text1"/>
+        </w:rPr>
+        <w:t>realizar pedidos y gestionar su perfil.</w:t>
+      </w:r>
+    </w:p>
+    <w:p>
+      <w:pPr>
+        <w:pStyle w:val="Prrafodelista"/>
+        <w:numPr>
+          <w:ilvl w:val="0"/>
+          <w:numId w:val="36"/>
+        </w:numPr>
+        <w:spacing w:line="360" w:lineRule="auto"/>
+      </w:pPr>
+      <w:r>
+        <w:t>Azure AD (Entra ID): Proveedor de Identidad (</w:t>
+      </w:r>
+      <w:proofErr w:type="spellStart"/>
+      <w:r>
+        <w:t>IDaaS</w:t>
+      </w:r>
+      <w:proofErr w:type="spellEnd"/>
+      <w:r>
+        <w:t>) externo que autentica al usuario y emite tokens JWT (Access Token &amp; ID Token).</w:t>
+      </w:r>
+    </w:p>
+    <w:p>
+      <w:pPr>
+        <w:pStyle w:val="Prrafodelista"/>
+        <w:numPr>
+          <w:ilvl w:val="0"/>
+          <w:numId w:val="36"/>
+        </w:numPr>
+        <w:spacing w:line="360" w:lineRule="auto"/>
+        <w:rPr>
+          <w:color w:val="000000" w:themeColor="text1"/>
+        </w:rPr>
+      </w:pPr>
+      <w:r>
+        <w:t xml:space="preserve">Sistema </w:t>
+      </w:r>
+      <w:proofErr w:type="spellStart"/>
+      <w:r>
+        <w:t>PideAlToke</w:t>
+      </w:r>
+      <w:proofErr w:type="spellEnd"/>
+      <w:r>
+        <w:t xml:space="preserve"> (Límite del Sistema): Recibe las solicitudes cifradas vía HTTPS, valida la autorización del usuario a través del API Gateway y delega la ejecución a los microservicios </w:t>
+      </w:r>
+      <w:proofErr w:type="spellStart"/>
+      <w:r>
+        <w:t>backend</w:t>
+      </w:r>
+      <w:proofErr w:type="spellEnd"/>
+      <w:r>
+        <w:t xml:space="preserve"> correspondientes.</w:t>
+      </w:r>
+    </w:p>
+    <w:p>
+      <w:pPr>
+        <w:pStyle w:val="Prrafodelista"/>
+        <w:numPr>
+          <w:ilvl w:val="1"/>
+          <w:numId w:val="13"/>
+        </w:numPr>
+        <w:spacing w:line="360" w:lineRule="auto"/>
         <w:rPr>
           <w:rFonts w:cstheme="minorHAnsi"/>
           <w:color w:val="215868" w:themeColor="accent5" w:themeShade="80"/>
           <w:sz w:val="32"/>
           <w:szCs w:val="32"/>
         </w:rPr>
-        <w:t xml:space="preserve"> Nivel </w:t>
+      </w:pPr>
+      <w:r>
+        <w:rPr>
+          <w:rFonts w:cstheme="minorHAnsi"/>
+          <w:color w:val="215868" w:themeColor="accent5" w:themeShade="80"/>
+          <w:sz w:val="32"/>
+          <w:szCs w:val="32"/>
+        </w:rPr>
+        <w:t xml:space="preserve">Nivel </w:t>
+      </w:r>
+      <w:r>
+        <w:rPr>
+          <w:rFonts w:cstheme="minorHAnsi"/>
+          <w:color w:val="215868" w:themeColor="accent5" w:themeShade="80"/>
+          <w:sz w:val="32"/>
+          <w:szCs w:val="32"/>
+        </w:rPr>
+        <w:t>2 – Diagrama de Contenedores</w:t>
+      </w:r>
+    </w:p>
+    <w:p>
+      <w:pPr>
+        <w:pStyle w:val="Prrafodelista"/>
+        <w:numPr>
+          <w:ilvl w:val="0"/>
+          <w:numId w:val="35"/>
+        </w:numPr>
+        <w:spacing w:line="360" w:lineRule="auto"/>
+      </w:pPr>
+      <w:proofErr w:type="spellStart"/>
+      <w:r>
+        <w:t>Frontend</w:t>
+      </w:r>
+      <w:proofErr w:type="spellEnd"/>
+      <w:r>
+        <w:t xml:space="preserve"> SPA (Angular): Aplicación cliente descargada en el navegador web del usuario, encargada de la interfaz de usuario y la inyección automática del token de Azure AD mediante</w:t>
+      </w:r>
+      <w:r>
+        <w:t xml:space="preserve"> </w:t>
+      </w:r>
+      <w:proofErr w:type="spellStart"/>
+      <w:r>
+        <w:t>MsalInterceptor</w:t>
+      </w:r>
+      <w:proofErr w:type="spellEnd"/>
+      <w:r>
+        <w:t>.</w:t>
+      </w:r>
+    </w:p>
+    <w:p>
+      <w:pPr>
+        <w:pStyle w:val="Prrafodelista"/>
+        <w:numPr>
+          <w:ilvl w:val="0"/>
+          <w:numId w:val="35"/>
+        </w:numPr>
+        <w:spacing w:line="360" w:lineRule="auto"/>
+      </w:pPr>
+      <w:r>
+        <w:t xml:space="preserve">API Manager / API Gateway (Amazon API Gateway): </w:t>
+      </w:r>
+      <w:r>
+        <w:t>Punto único de entrada seguro (Reverse Proxy / Edge Gateway) que enruta el tráfico hacia las instancias EC2.</w:t>
+      </w:r>
+    </w:p>
+    <w:p>
+      <w:pPr>
+        <w:pStyle w:val="Prrafodelista"/>
+        <w:numPr>
+          <w:ilvl w:val="0"/>
+          <w:numId w:val="35"/>
+        </w:numPr>
+        <w:spacing w:line="360" w:lineRule="auto"/>
+      </w:pPr>
+      <w:proofErr w:type="spellStart"/>
+      <w:r>
+        <w:lastRenderedPageBreak/>
+        <w:t>Backend</w:t>
+      </w:r>
+      <w:proofErr w:type="spellEnd"/>
+      <w:r>
+        <w:t xml:space="preserve"> / Microservicios (</w:t>
+      </w:r>
+      <w:proofErr w:type="spellStart"/>
+      <w:r>
+        <w:t>FastAPI</w:t>
+      </w:r>
+      <w:proofErr w:type="spellEnd"/>
+      <w:r>
+        <w:t xml:space="preserve"> en AWS EC2): Conjunto de contenedores/servicios construidos en Python que contienen la lógica de negocio (Usuarios, Catálogo, Inventario, Pedidos, Pagos).</w:t>
+      </w:r>
+    </w:p>
+    <w:p>
+      <w:pPr>
+        <w:pStyle w:val="Prrafodelista"/>
+        <w:numPr>
+          <w:ilvl w:val="0"/>
+          <w:numId w:val="35"/>
+        </w:numPr>
+        <w:spacing w:line="360" w:lineRule="auto"/>
+        <w:rPr>
+          <w:color w:val="000000" w:themeColor="text1"/>
+        </w:rPr>
+      </w:pPr>
+      <w:r>
+        <w:t xml:space="preserve">Persistencia (Cloud </w:t>
+      </w:r>
+      <w:proofErr w:type="spellStart"/>
+      <w:r>
+        <w:t>Database</w:t>
+      </w:r>
+      <w:proofErr w:type="spellEnd"/>
+      <w:r>
+        <w:t>): Base de datos relacional hospedada en la nube para el almacenamiento persistente.</w:t>
       </w:r>
     </w:p>
     <w:p>
@@ -1826,6 +2332,7 @@
           <w:ilvl w:val="0"/>
           <w:numId w:val="13"/>
         </w:numPr>
+        <w:spacing w:line="360" w:lineRule="auto"/>
         <w:jc w:val="both"/>
         <w:rPr>
           <w:rFonts w:asciiTheme="minorHAnsi" w:hAnsiTheme="minorHAnsi" w:cstheme="minorHAnsi"/>
@@ -1840,7 +2347,6 @@
           <w:sz w:val="32"/>
           <w:szCs w:val="32"/>
         </w:rPr>
-        <w:lastRenderedPageBreak/>
         <w:t>Decisiones</w:t>
       </w:r>
       <w:r>
@@ -1889,10 +2395,13 @@
     </w:p>
     <w:p>
       <w:pPr>
-        <w:ind w:left="360"/>
-        <w:rPr>
-          <w:b/>
-          <w:bCs/>
+        <w:pStyle w:val="Prrafodelista"/>
+        <w:numPr>
+          <w:ilvl w:val="1"/>
+          <w:numId w:val="13"/>
+        </w:numPr>
+        <w:spacing w:line="360" w:lineRule="auto"/>
+        <w:rPr>
           <w:color w:val="215868" w:themeColor="accent5" w:themeShade="80"/>
           <w:sz w:val="28"/>
           <w:szCs w:val="28"/>
@@ -1901,19 +2410,15 @@
       </w:pPr>
       <w:r>
         <w:rPr>
-          <w:b/>
-          <w:bCs/>
           <w:color w:val="215868" w:themeColor="accent5" w:themeShade="80"/>
           <w:sz w:val="28"/>
           <w:szCs w:val="28"/>
           <w:lang w:val="es-CL"/>
         </w:rPr>
-        <w:t xml:space="preserve">3.1 </w:t>
-      </w:r>
-      <w:r>
-        <w:rPr>
-          <w:b/>
-          <w:bCs/>
+        <w:t xml:space="preserve"> </w:t>
+      </w:r>
+      <w:r>
+        <w:rPr>
           <w:color w:val="215868" w:themeColor="accent5" w:themeShade="80"/>
           <w:sz w:val="28"/>
           <w:szCs w:val="28"/>
@@ -1921,53 +2426,745 @@
         </w:rPr>
         <w:t xml:space="preserve">Arquitectura Hexagonal </w:t>
       </w:r>
-    </w:p>
-    <w:p>
-      <w:pPr>
-        <w:ind w:left="360"/>
-        <w:rPr>
-          <w:b/>
-          <w:bCs/>
+      <w:r>
+        <w:rPr>
           <w:color w:val="215868" w:themeColor="accent5" w:themeShade="80"/>
           <w:sz w:val="28"/>
           <w:szCs w:val="28"/>
           <w:lang w:val="es-CL"/>
         </w:rPr>
-      </w:pPr>
-      <w:r>
-        <w:rPr>
-          <w:b/>
-          <w:bCs/>
+        <w:t>(</w:t>
+      </w:r>
+      <w:proofErr w:type="spellStart"/>
+      <w:r>
+        <w:rPr>
           <w:color w:val="215868" w:themeColor="accent5" w:themeShade="80"/>
           <w:sz w:val="28"/>
           <w:szCs w:val="28"/>
           <w:lang w:val="es-CL"/>
         </w:rPr>
-        <w:t xml:space="preserve">3.2 Patrones de Diseño de </w:t>
-      </w:r>
-      <w:proofErr w:type="spellStart"/>
-      <w:r>
-        <w:rPr>
-          <w:b/>
-          <w:bCs/>
+        <w:t>Ports</w:t>
+      </w:r>
+      <w:proofErr w:type="spellEnd"/>
+      <w:r>
+        <w:rPr>
           <w:color w:val="215868" w:themeColor="accent5" w:themeShade="80"/>
           <w:sz w:val="28"/>
           <w:szCs w:val="28"/>
           <w:lang w:val="es-CL"/>
         </w:rPr>
-        <w:t>Backend</w:t>
-      </w:r>
-      <w:proofErr w:type="spellEnd"/>
-      <w:r>
-        <w:rPr>
-          <w:b/>
-          <w:bCs/>
+        <w:t xml:space="preserve"> and </w:t>
+      </w:r>
+      <w:proofErr w:type="spellStart"/>
+      <w:r>
+        <w:rPr>
           <w:color w:val="215868" w:themeColor="accent5" w:themeShade="80"/>
           <w:sz w:val="28"/>
           <w:szCs w:val="28"/>
           <w:lang w:val="es-CL"/>
         </w:rPr>
+        <w:t>Adapters</w:t>
+      </w:r>
+      <w:proofErr w:type="spellEnd"/>
+      <w:r>
+        <w:rPr>
+          <w:color w:val="215868" w:themeColor="accent5" w:themeShade="80"/>
+          <w:sz w:val="28"/>
+          <w:szCs w:val="28"/>
+          <w:lang w:val="es-CL"/>
+        </w:rPr>
+        <w:t>)</w:t>
+      </w:r>
+    </w:p>
+    <w:p>
+      <w:pPr>
+        <w:spacing w:line="360" w:lineRule="auto"/>
+      </w:pPr>
+      <w:r>
+        <w:t>Se adopta formalmente el patrón de Arquitectura Hexagonal (</w:t>
+      </w:r>
+      <w:proofErr w:type="spellStart"/>
+      <w:r>
+        <w:t>Ports</w:t>
+      </w:r>
+      <w:proofErr w:type="spellEnd"/>
+      <w:r>
+        <w:t xml:space="preserve"> and </w:t>
+      </w:r>
+      <w:proofErr w:type="spellStart"/>
+      <w:r>
+        <w:t>Adapters</w:t>
+      </w:r>
+      <w:proofErr w:type="spellEnd"/>
+      <w:r>
+        <w:t xml:space="preserve">) para el desarrollo de cada microservicio en </w:t>
+      </w:r>
+      <w:proofErr w:type="spellStart"/>
+      <w:r>
+        <w:t>FastAPI</w:t>
+      </w:r>
+      <w:proofErr w:type="spellEnd"/>
+      <w:r>
+        <w:t xml:space="preserve">. A diferencia de patrones tradicionales orientados a interfaz como MVC, la Arquitectura Hexagonal coloca la lógica del dominio en el centro, aislándola de detalles tecnológicos como </w:t>
+      </w:r>
+      <w:proofErr w:type="spellStart"/>
+      <w:r>
+        <w:t>frameworks</w:t>
+      </w:r>
+      <w:proofErr w:type="spellEnd"/>
+      <w:r>
+        <w:t xml:space="preserve"> web o motores de base de datos.</w:t>
+      </w:r>
+    </w:p>
+    <w:p>
+      <w:pPr>
+        <w:spacing w:line="360" w:lineRule="auto"/>
+      </w:pPr>
+      <w:r>
+        <w:t xml:space="preserve">Estructura interna del microservicio en </w:t>
+      </w:r>
+      <w:proofErr w:type="spellStart"/>
+      <w:r>
+        <w:t>FastAPI</w:t>
+      </w:r>
+      <w:proofErr w:type="spellEnd"/>
+      <w:r>
+        <w:t>:</w:t>
+      </w:r>
+    </w:p>
+    <w:p>
+      <w:pPr>
+        <w:pStyle w:val="Prrafodelista"/>
+        <w:numPr>
+          <w:ilvl w:val="0"/>
+          <w:numId w:val="39"/>
+        </w:numPr>
+        <w:spacing w:line="360" w:lineRule="auto"/>
+        <w:rPr>
+          <w:color w:val="000000" w:themeColor="text1"/>
+          <w:lang w:val="es-CL"/>
+        </w:rPr>
+      </w:pPr>
+      <w:proofErr w:type="spellStart"/>
+      <w:r>
+        <w:rPr>
+          <w:color w:val="000000" w:themeColor="text1"/>
+          <w:lang w:val="es-CL"/>
+        </w:rPr>
+        <w:t>Adapters</w:t>
+      </w:r>
+      <w:proofErr w:type="spellEnd"/>
+      <w:r>
+        <w:rPr>
+          <w:color w:val="000000" w:themeColor="text1"/>
+          <w:lang w:val="es-CL"/>
+        </w:rPr>
+        <w:t xml:space="preserve">: Exposición de </w:t>
+      </w:r>
+      <w:proofErr w:type="spellStart"/>
+      <w:r>
+        <w:rPr>
+          <w:color w:val="000000" w:themeColor="text1"/>
+          <w:lang w:val="es-CL"/>
+        </w:rPr>
+        <w:t>endpoints</w:t>
+      </w:r>
+      <w:proofErr w:type="spellEnd"/>
+      <w:r>
+        <w:rPr>
+          <w:color w:val="000000" w:themeColor="text1"/>
+          <w:lang w:val="es-CL"/>
+        </w:rPr>
+        <w:t xml:space="preserve"> HTTP construidos con API </w:t>
+      </w:r>
+      <w:proofErr w:type="spellStart"/>
+      <w:r>
+        <w:rPr>
+          <w:color w:val="000000" w:themeColor="text1"/>
+          <w:lang w:val="es-CL"/>
+        </w:rPr>
+        <w:t>Router</w:t>
+      </w:r>
+      <w:proofErr w:type="spellEnd"/>
+      <w:r>
+        <w:rPr>
+          <w:color w:val="000000" w:themeColor="text1"/>
+          <w:lang w:val="es-CL"/>
+        </w:rPr>
+        <w:t xml:space="preserve"> de </w:t>
+      </w:r>
+      <w:proofErr w:type="spellStart"/>
+      <w:r>
+        <w:rPr>
+          <w:color w:val="000000" w:themeColor="text1"/>
+          <w:lang w:val="es-CL"/>
+        </w:rPr>
+        <w:t>FastAPI</w:t>
+      </w:r>
+      <w:proofErr w:type="spellEnd"/>
+      <w:r>
+        <w:rPr>
+          <w:color w:val="000000" w:themeColor="text1"/>
+          <w:lang w:val="es-CL"/>
+        </w:rPr>
+        <w:t>. Transforma las solicitudes HTTP entrantes en llamadas al dominio.</w:t>
+      </w:r>
+      <w:r>
+        <w:rPr>
+          <w:color w:val="000000" w:themeColor="text1"/>
+          <w:lang w:val="es-CL"/>
+        </w:rPr>
+        <w:t xml:space="preserve"> En un patrón tradicional, como MVC, esta capa corresponde al </w:t>
+      </w:r>
+      <w:proofErr w:type="spellStart"/>
+      <w:r>
+        <w:rPr>
+          <w:color w:val="000000" w:themeColor="text1"/>
+          <w:lang w:val="es-CL"/>
+        </w:rPr>
+        <w:t>Controller</w:t>
+      </w:r>
+      <w:proofErr w:type="spellEnd"/>
+      <w:r>
+        <w:rPr>
+          <w:color w:val="000000" w:themeColor="text1"/>
+          <w:lang w:val="es-CL"/>
+        </w:rPr>
+        <w:t>.</w:t>
+      </w:r>
+    </w:p>
+    <w:p>
+      <w:pPr>
+        <w:pStyle w:val="Prrafodelista"/>
+        <w:numPr>
+          <w:ilvl w:val="0"/>
+          <w:numId w:val="39"/>
+        </w:numPr>
+        <w:spacing w:line="360" w:lineRule="auto"/>
+        <w:rPr>
+          <w:color w:val="000000" w:themeColor="text1"/>
+          <w:lang w:val="es-CL"/>
+        </w:rPr>
+      </w:pPr>
+      <w:proofErr w:type="spellStart"/>
+      <w:proofErr w:type="gramStart"/>
+      <w:r>
+        <w:rPr>
+          <w:color w:val="000000" w:themeColor="text1"/>
+          <w:lang w:val="es-CL"/>
+        </w:rPr>
+        <w:t>DTOs</w:t>
+      </w:r>
+      <w:proofErr w:type="spellEnd"/>
+      <w:r>
+        <w:rPr>
+          <w:color w:val="000000" w:themeColor="text1"/>
+          <w:lang w:val="es-CL"/>
+        </w:rPr>
+        <w:t xml:space="preserve"> :</w:t>
+      </w:r>
+      <w:proofErr w:type="gramEnd"/>
+      <w:r>
+        <w:rPr>
+          <w:color w:val="000000" w:themeColor="text1"/>
+          <w:lang w:val="es-CL"/>
+        </w:rPr>
+        <w:t xml:space="preserve"> Modelos que validen la entrada y salida mediante </w:t>
+      </w:r>
+      <w:proofErr w:type="spellStart"/>
+      <w:r>
+        <w:rPr>
+          <w:color w:val="000000" w:themeColor="text1"/>
+          <w:lang w:val="es-CL"/>
+        </w:rPr>
+        <w:t>Pydantic</w:t>
+      </w:r>
+      <w:proofErr w:type="spellEnd"/>
+      <w:r>
+        <w:rPr>
+          <w:color w:val="000000" w:themeColor="text1"/>
+          <w:lang w:val="es-CL"/>
+        </w:rPr>
+        <w:t>. Garantiza el tipado estricto de los datos.</w:t>
+      </w:r>
+    </w:p>
+    <w:p>
+      <w:pPr>
+        <w:pStyle w:val="Prrafodelista"/>
+        <w:numPr>
+          <w:ilvl w:val="0"/>
+          <w:numId w:val="39"/>
+        </w:numPr>
+        <w:spacing w:line="360" w:lineRule="auto"/>
+        <w:rPr>
+          <w:color w:val="000000" w:themeColor="text1"/>
+          <w:lang w:val="es-CL"/>
+        </w:rPr>
+      </w:pPr>
+      <w:proofErr w:type="spellStart"/>
+      <w:r>
+        <w:rPr>
+          <w:color w:val="000000" w:themeColor="text1"/>
+          <w:lang w:val="es-CL"/>
+        </w:rPr>
+        <w:t>Domain</w:t>
+      </w:r>
+      <w:proofErr w:type="spellEnd"/>
+      <w:r>
+        <w:rPr>
+          <w:color w:val="000000" w:themeColor="text1"/>
+          <w:lang w:val="es-CL"/>
+        </w:rPr>
+        <w:t xml:space="preserve">: Implementación de las reglas de negocio como el cálculo de montos de pedidos, reducción de stock, entre otras. Sin dependencias directas de bases de datos ni de </w:t>
+      </w:r>
+      <w:proofErr w:type="spellStart"/>
+      <w:r>
+        <w:rPr>
+          <w:color w:val="000000" w:themeColor="text1"/>
+          <w:lang w:val="es-CL"/>
+        </w:rPr>
+        <w:t>FastAPI</w:t>
+      </w:r>
+      <w:proofErr w:type="spellEnd"/>
+      <w:r>
+        <w:rPr>
+          <w:color w:val="000000" w:themeColor="text1"/>
+          <w:lang w:val="es-CL"/>
+        </w:rPr>
+        <w:t>.</w:t>
+      </w:r>
+    </w:p>
+    <w:p>
+      <w:pPr>
+        <w:pStyle w:val="Prrafodelista"/>
+        <w:numPr>
+          <w:ilvl w:val="0"/>
+          <w:numId w:val="39"/>
+        </w:numPr>
+        <w:spacing w:line="360" w:lineRule="auto"/>
+        <w:rPr>
+          <w:color w:val="000000" w:themeColor="text1"/>
+          <w:lang w:val="es-CL"/>
+        </w:rPr>
+      </w:pPr>
+      <w:proofErr w:type="spellStart"/>
+      <w:r>
+        <w:rPr>
+          <w:color w:val="000000" w:themeColor="text1"/>
+          <w:lang w:val="es-CL"/>
+        </w:rPr>
+        <w:t>Ports</w:t>
+      </w:r>
+      <w:proofErr w:type="spellEnd"/>
+      <w:r>
+        <w:rPr>
+          <w:color w:val="000000" w:themeColor="text1"/>
+          <w:lang w:val="es-CL"/>
+        </w:rPr>
+        <w:t>: Interfaces abstractas que define la comunicación con otros repositorios externos.</w:t>
+      </w:r>
+    </w:p>
+    <w:p>
+      <w:pPr>
+        <w:pStyle w:val="Prrafodelista"/>
+        <w:numPr>
+          <w:ilvl w:val="0"/>
+          <w:numId w:val="39"/>
+        </w:numPr>
+        <w:spacing w:line="360" w:lineRule="auto"/>
+        <w:rPr>
+          <w:color w:val="000000" w:themeColor="text1"/>
+          <w:lang w:val="es-CL"/>
+        </w:rPr>
+      </w:pPr>
+      <w:proofErr w:type="spellStart"/>
+      <w:r>
+        <w:rPr>
+          <w:color w:val="000000" w:themeColor="text1"/>
+          <w:lang w:val="es-CL"/>
+        </w:rPr>
+        <w:t>Repositories</w:t>
+      </w:r>
+      <w:proofErr w:type="spellEnd"/>
+      <w:r>
+        <w:rPr>
+          <w:color w:val="000000" w:themeColor="text1"/>
+          <w:lang w:val="es-CL"/>
+        </w:rPr>
+        <w:t>: Implementación de acceso a la base de datos mediante ORM (</w:t>
+      </w:r>
+      <w:proofErr w:type="spellStart"/>
+      <w:r>
+        <w:rPr>
+          <w:color w:val="000000" w:themeColor="text1"/>
+          <w:lang w:val="es-CL"/>
+        </w:rPr>
+        <w:t>SQLAlchemy</w:t>
+      </w:r>
+      <w:proofErr w:type="spellEnd"/>
+      <w:r>
+        <w:rPr>
+          <w:color w:val="000000" w:themeColor="text1"/>
+          <w:lang w:val="es-CL"/>
+        </w:rPr>
+        <w:t xml:space="preserve">) respetando </w:t>
+      </w:r>
+      <w:r>
+        <w:rPr>
+          <w:color w:val="000000" w:themeColor="text1"/>
+          <w:lang w:val="es-CL"/>
+        </w:rPr>
+        <w:t xml:space="preserve">la configuración definida en los </w:t>
+      </w:r>
+      <w:proofErr w:type="spellStart"/>
+      <w:r>
+        <w:rPr>
+          <w:color w:val="000000" w:themeColor="text1"/>
+          <w:lang w:val="es-CL"/>
+        </w:rPr>
+        <w:t>ports</w:t>
+      </w:r>
+      <w:proofErr w:type="spellEnd"/>
+      <w:r>
+        <w:rPr>
+          <w:color w:val="000000" w:themeColor="text1"/>
+          <w:lang w:val="es-CL"/>
+        </w:rPr>
+        <w:t>.</w:t>
+      </w:r>
+    </w:p>
+    <w:p>
+      <w:pPr>
+        <w:pStyle w:val="Prrafodelista"/>
+        <w:numPr>
+          <w:ilvl w:val="1"/>
+          <w:numId w:val="13"/>
+        </w:numPr>
+        <w:spacing w:line="360" w:lineRule="auto"/>
+        <w:rPr>
+          <w:color w:val="215868" w:themeColor="accent5" w:themeShade="80"/>
+          <w:sz w:val="28"/>
+          <w:szCs w:val="28"/>
+          <w:lang w:val="es-CL"/>
+        </w:rPr>
+      </w:pPr>
+      <w:r>
+        <w:rPr>
+          <w:color w:val="215868" w:themeColor="accent5" w:themeShade="80"/>
+          <w:sz w:val="28"/>
+          <w:szCs w:val="28"/>
+          <w:lang w:val="es-CL"/>
+        </w:rPr>
+        <w:t xml:space="preserve">  </w:t>
+      </w:r>
+      <w:r>
+        <w:rPr>
+          <w:color w:val="215868" w:themeColor="accent5" w:themeShade="80"/>
+          <w:sz w:val="28"/>
+          <w:szCs w:val="28"/>
+          <w:lang w:val="es-CL"/>
+        </w:rPr>
+        <w:t xml:space="preserve">Patrones de Diseño de </w:t>
+      </w:r>
+      <w:proofErr w:type="spellStart"/>
+      <w:r>
+        <w:rPr>
+          <w:color w:val="215868" w:themeColor="accent5" w:themeShade="80"/>
+          <w:sz w:val="28"/>
+          <w:szCs w:val="28"/>
+          <w:lang w:val="es-CL"/>
+        </w:rPr>
+        <w:t>Backend</w:t>
+      </w:r>
+      <w:proofErr w:type="spellEnd"/>
+      <w:r>
+        <w:rPr>
+          <w:color w:val="215868" w:themeColor="accent5" w:themeShade="80"/>
+          <w:sz w:val="28"/>
+          <w:szCs w:val="28"/>
+          <w:lang w:val="es-CL"/>
+        </w:rPr>
         <w:t xml:space="preserve"> Aplicados</w:t>
+      </w:r>
+    </w:p>
+    <w:p>
+      <w:pPr>
+        <w:pStyle w:val="Prrafodelista"/>
+        <w:numPr>
+          <w:ilvl w:val="0"/>
+          <w:numId w:val="40"/>
+        </w:numPr>
+        <w:spacing w:line="360" w:lineRule="auto"/>
+      </w:pPr>
+      <w:r>
+        <w:rPr>
+          <w:color w:val="000000" w:themeColor="text1"/>
+          <w:lang w:val="es-CL"/>
+        </w:rPr>
+        <w:t>BFF (</w:t>
+      </w:r>
+      <w:proofErr w:type="spellStart"/>
+      <w:r>
+        <w:rPr>
+          <w:color w:val="000000" w:themeColor="text1"/>
+          <w:lang w:val="es-CL"/>
+        </w:rPr>
+        <w:t>Backend</w:t>
+      </w:r>
+      <w:proofErr w:type="spellEnd"/>
+      <w:r>
+        <w:rPr>
+          <w:color w:val="000000" w:themeColor="text1"/>
+          <w:lang w:val="es-CL"/>
+        </w:rPr>
+        <w:t xml:space="preserve"> </w:t>
+      </w:r>
+      <w:proofErr w:type="spellStart"/>
+      <w:r>
+        <w:rPr>
+          <w:color w:val="000000" w:themeColor="text1"/>
+          <w:lang w:val="es-CL"/>
+        </w:rPr>
+        <w:t>For</w:t>
+      </w:r>
+      <w:proofErr w:type="spellEnd"/>
+      <w:r>
+        <w:rPr>
+          <w:color w:val="000000" w:themeColor="text1"/>
+          <w:lang w:val="es-CL"/>
+        </w:rPr>
+        <w:t xml:space="preserve"> </w:t>
+      </w:r>
+      <w:proofErr w:type="spellStart"/>
+      <w:r>
+        <w:rPr>
+          <w:color w:val="000000" w:themeColor="text1"/>
+          <w:lang w:val="es-CL"/>
+        </w:rPr>
+        <w:t>Frontend</w:t>
+      </w:r>
+      <w:proofErr w:type="spellEnd"/>
+      <w:r>
+        <w:rPr>
+          <w:color w:val="000000" w:themeColor="text1"/>
+          <w:lang w:val="es-CL"/>
+        </w:rPr>
+        <w:t xml:space="preserve">): </w:t>
+      </w:r>
+      <w:r>
+        <w:t xml:space="preserve">Capa API intermedia que actúa como fachada orientada a satisfacer las necesidades específicas del </w:t>
+      </w:r>
+      <w:proofErr w:type="spellStart"/>
+      <w:r>
+        <w:t>frontend</w:t>
+      </w:r>
+      <w:proofErr w:type="spellEnd"/>
+      <w:r>
+        <w:t xml:space="preserve"> Angular. En nuestro diseño, asume la responsabilidad de validar la seguridad del token JWT emitido por Azure AD (firma, expiración, </w:t>
+      </w:r>
+      <w:proofErr w:type="spellStart"/>
+      <w:r>
+        <w:rPr>
+          <w:i/>
+          <w:iCs/>
+        </w:rPr>
+        <w:t>claims</w:t>
+      </w:r>
+      <w:proofErr w:type="spellEnd"/>
+      <w:r>
+        <w:t>) antes de encaminar o procesar peticiones hacia la lógica interna.</w:t>
+      </w:r>
+    </w:p>
+    <w:p>
+      <w:pPr>
+        <w:pStyle w:val="Prrafodelista"/>
+        <w:numPr>
+          <w:ilvl w:val="0"/>
+          <w:numId w:val="40"/>
+        </w:numPr>
+        <w:spacing w:line="360" w:lineRule="auto"/>
+      </w:pPr>
+      <w:proofErr w:type="spellStart"/>
+      <w:r>
+        <w:lastRenderedPageBreak/>
+        <w:t>Database</w:t>
+      </w:r>
+      <w:proofErr w:type="spellEnd"/>
+      <w:r>
+        <w:t xml:space="preserve"> per Servicio: </w:t>
+      </w:r>
+      <w:r>
+        <w:t>Aislamiento de esquemas o tablas independientes para cada uno de los 5 microservicios prioritarios (Usuarios, Catálogo, Inventario, Pedidos, Pagos), evitando referencias cruzadas directas a nivel de SQL.</w:t>
+      </w:r>
+    </w:p>
+    <w:p>
+      <w:pPr>
+        <w:pStyle w:val="Prrafodelista"/>
+        <w:numPr>
+          <w:ilvl w:val="0"/>
+          <w:numId w:val="40"/>
+        </w:numPr>
+        <w:spacing w:line="360" w:lineRule="auto"/>
+      </w:pPr>
+      <w:proofErr w:type="spellStart"/>
+      <w:r>
+        <w:t>Repository</w:t>
+      </w:r>
+      <w:proofErr w:type="spellEnd"/>
+      <w:r>
+        <w:t xml:space="preserve"> </w:t>
+      </w:r>
+      <w:proofErr w:type="spellStart"/>
+      <w:r>
+        <w:t>Pattern</w:t>
+      </w:r>
+      <w:proofErr w:type="spellEnd"/>
+      <w:r>
+        <w:t xml:space="preserve">: </w:t>
+      </w:r>
+      <w:r>
+        <w:t>Abstrae los detalles de persistencia y acceso a datos tras una interfaz genérica. La capa de negocio interactúa con el repositorio como si fuera una colección en memoria, sin saber si los datos provienen de una base de datos SQL en AWS RDS, una base de datos NoSQL o archivos locales.</w:t>
+      </w:r>
+    </w:p>
+    <w:p>
+      <w:pPr>
+        <w:pStyle w:val="Prrafodelista"/>
+        <w:numPr>
+          <w:ilvl w:val="0"/>
+          <w:numId w:val="40"/>
+        </w:numPr>
+        <w:spacing w:line="360" w:lineRule="auto"/>
+      </w:pPr>
+      <w:r>
+        <w:t xml:space="preserve">DTO (Data Transfer </w:t>
+      </w:r>
+      <w:proofErr w:type="spellStart"/>
+      <w:r>
+        <w:t>Object</w:t>
+      </w:r>
+      <w:proofErr w:type="spellEnd"/>
+      <w:r>
+        <w:t xml:space="preserve">): </w:t>
+      </w:r>
+      <w:r>
+        <w:t>Objeto diseñado para encapsular y transportar datos entre las distintas capas del sistema sin exponer las entidades internas del dominio ni los modelos ORM de la base de datos.</w:t>
+      </w:r>
+      <w:r>
+        <w:t xml:space="preserve"> </w:t>
+      </w:r>
+      <w:r>
+        <w:t xml:space="preserve">Se implementa utilizando modelos de </w:t>
+      </w:r>
+      <w:proofErr w:type="spellStart"/>
+      <w:r>
+        <w:t>Pydantic</w:t>
+      </w:r>
+      <w:proofErr w:type="spellEnd"/>
+      <w:r>
+        <w:t xml:space="preserve"> </w:t>
+      </w:r>
+      <w:r>
+        <w:t>(</w:t>
+      </w:r>
+      <w:proofErr w:type="spellStart"/>
+      <w:r>
+        <w:t>Model</w:t>
+      </w:r>
+      <w:proofErr w:type="spellEnd"/>
+      <w:r>
+        <w:t>)</w:t>
+      </w:r>
+      <w:r>
+        <w:t xml:space="preserve"> en </w:t>
+      </w:r>
+      <w:proofErr w:type="spellStart"/>
+      <w:r>
+        <w:t>FastAPI</w:t>
+      </w:r>
+      <w:proofErr w:type="spellEnd"/>
+      <w:r>
+        <w:t>, lo que proporciona tipado estricto, serialización/deserialización automática de JSON y validación en tiempo de ejecución.</w:t>
+      </w:r>
+    </w:p>
+    <w:p>
+      <w:pPr>
+        <w:pStyle w:val="Prrafodelista"/>
+        <w:numPr>
+          <w:ilvl w:val="0"/>
+          <w:numId w:val="40"/>
+        </w:numPr>
+        <w:spacing w:line="360" w:lineRule="auto"/>
+      </w:pPr>
+      <w:proofErr w:type="spellStart"/>
+      <w:r>
+        <w:t>Ports</w:t>
+      </w:r>
+      <w:proofErr w:type="spellEnd"/>
+      <w:r>
+        <w:t xml:space="preserve"> and </w:t>
+      </w:r>
+      <w:proofErr w:type="spellStart"/>
+      <w:r>
+        <w:t>Adapters</w:t>
+      </w:r>
+      <w:proofErr w:type="spellEnd"/>
+      <w:r>
+        <w:t xml:space="preserve">: </w:t>
+      </w:r>
+      <w:r>
+        <w:t xml:space="preserve">Este patrón desacopla el núcleo del negocio (Dominio) de cualquier elemento o infraestructura externa (Framework web, bases de datos, </w:t>
+      </w:r>
+      <w:proofErr w:type="spellStart"/>
+      <w:r>
+        <w:t>APIs</w:t>
+      </w:r>
+      <w:proofErr w:type="spellEnd"/>
+      <w:r>
+        <w:t xml:space="preserve"> de terceros). Los Puertos son interfaces abstractas dentro del dominio que definen las operaciones de entrada/salida (</w:t>
+      </w:r>
+      <w:proofErr w:type="spellStart"/>
+      <w:r>
+        <w:rPr>
+          <w:i/>
+          <w:iCs/>
+        </w:rPr>
+        <w:t>Inbound</w:t>
+      </w:r>
+      <w:proofErr w:type="spellEnd"/>
+      <w:r>
+        <w:rPr>
+          <w:i/>
+          <w:iCs/>
+        </w:rPr>
+        <w:t>/</w:t>
+      </w:r>
+      <w:proofErr w:type="spellStart"/>
+      <w:r>
+        <w:rPr>
+          <w:i/>
+          <w:iCs/>
+        </w:rPr>
+        <w:t>Outbound</w:t>
+      </w:r>
+      <w:proofErr w:type="spellEnd"/>
+      <w:r>
+        <w:t xml:space="preserve">), mientras que los Adaptadores son la implementación concreta que conecta la tecnología externa (como </w:t>
+      </w:r>
+      <w:proofErr w:type="spellStart"/>
+      <w:r>
+        <w:t>FastAPI</w:t>
+      </w:r>
+      <w:proofErr w:type="spellEnd"/>
+      <w:r>
+        <w:t xml:space="preserve"> para HTTP o </w:t>
+      </w:r>
+      <w:proofErr w:type="spellStart"/>
+      <w:r>
+        <w:t>SQLAlchemy</w:t>
+      </w:r>
+      <w:proofErr w:type="spellEnd"/>
+      <w:r>
+        <w:t xml:space="preserve"> para la base de datos) con dichos puertos.</w:t>
       </w:r>
     </w:p>
     <w:p>
@@ -1977,11 +3174,10 @@
           <w:ilvl w:val="0"/>
           <w:numId w:val="13"/>
         </w:numPr>
+        <w:spacing w:line="360" w:lineRule="auto"/>
         <w:jc w:val="both"/>
         <w:rPr>
           <w:rFonts w:asciiTheme="minorHAnsi" w:hAnsiTheme="minorHAnsi" w:cstheme="minorHAnsi"/>
-          <w:b w:val="0"/>
-          <w:bCs w:val="0"/>
           <w:sz w:val="32"/>
           <w:szCs w:val="32"/>
         </w:rPr>
@@ -1989,8 +3185,6 @@
       <w:r>
         <w:rPr>
           <w:rFonts w:asciiTheme="minorHAnsi" w:hAnsiTheme="minorHAnsi" w:cstheme="minorHAnsi"/>
-          <w:b w:val="0"/>
-          <w:bCs w:val="0"/>
           <w:sz w:val="32"/>
           <w:szCs w:val="32"/>
         </w:rPr>
@@ -2000,8 +3194,6 @@
       <w:r>
         <w:rPr>
           <w:rFonts w:asciiTheme="minorHAnsi" w:hAnsiTheme="minorHAnsi" w:cstheme="minorHAnsi"/>
-          <w:b w:val="0"/>
-          <w:bCs w:val="0"/>
           <w:sz w:val="32"/>
           <w:szCs w:val="32"/>
         </w:rPr>
@@ -2011,12 +3203,554 @@
       <w:r>
         <w:rPr>
           <w:rFonts w:asciiTheme="minorHAnsi" w:hAnsiTheme="minorHAnsi" w:cstheme="minorHAnsi"/>
-          <w:b w:val="0"/>
-          <w:bCs w:val="0"/>
           <w:sz w:val="32"/>
           <w:szCs w:val="32"/>
         </w:rPr>
         <w:t xml:space="preserve"> – ADR</w:t>
+      </w:r>
+    </w:p>
+    <w:p>
+      <w:pPr>
+        <w:pStyle w:val="Prrafodelista"/>
+        <w:numPr>
+          <w:ilvl w:val="1"/>
+          <w:numId w:val="13"/>
+        </w:numPr>
+        <w:rPr>
+          <w:color w:val="215868" w:themeColor="accent5" w:themeShade="80"/>
+          <w:sz w:val="28"/>
+          <w:szCs w:val="28"/>
+        </w:rPr>
+      </w:pPr>
+      <w:r>
+        <w:rPr>
+          <w:color w:val="215868" w:themeColor="accent5" w:themeShade="80"/>
+          <w:sz w:val="28"/>
+          <w:szCs w:val="28"/>
+        </w:rPr>
+        <w:t xml:space="preserve"> </w:t>
+      </w:r>
+      <w:r>
+        <w:rPr>
+          <w:color w:val="215868" w:themeColor="accent5" w:themeShade="80"/>
+          <w:sz w:val="28"/>
+          <w:szCs w:val="28"/>
+        </w:rPr>
+        <w:t xml:space="preserve">Arquitectura Modular por Dominio con Smart and </w:t>
+      </w:r>
+      <w:proofErr w:type="spellStart"/>
+      <w:r>
+        <w:rPr>
+          <w:color w:val="215868" w:themeColor="accent5" w:themeShade="80"/>
+          <w:sz w:val="28"/>
+          <w:szCs w:val="28"/>
+        </w:rPr>
+        <w:t>Dumb</w:t>
+      </w:r>
+      <w:proofErr w:type="spellEnd"/>
+      <w:r>
+        <w:rPr>
+          <w:color w:val="215868" w:themeColor="accent5" w:themeShade="80"/>
+          <w:sz w:val="28"/>
+          <w:szCs w:val="28"/>
+        </w:rPr>
+        <w:t xml:space="preserve"> </w:t>
+      </w:r>
+      <w:proofErr w:type="spellStart"/>
+      <w:r>
+        <w:rPr>
+          <w:color w:val="215868" w:themeColor="accent5" w:themeShade="80"/>
+          <w:sz w:val="28"/>
+          <w:szCs w:val="28"/>
+        </w:rPr>
+        <w:t>Components</w:t>
+      </w:r>
+      <w:proofErr w:type="spellEnd"/>
+    </w:p>
+    <w:p>
+      <w:pPr>
+        <w:rPr>
+          <w:color w:val="000000" w:themeColor="text1"/>
+        </w:rPr>
+      </w:pPr>
+      <w:r>
+        <w:t xml:space="preserve">Para construir una interfaz cliente escalable, mantenible y segura en Angular para la plataforma </w:t>
+      </w:r>
+      <w:proofErr w:type="spellStart"/>
+      <w:r>
+        <w:t>PideAlToke</w:t>
+      </w:r>
+      <w:proofErr w:type="spellEnd"/>
+      <w:r>
+        <w:t>, se aplican los siguientes patrones de diseño desacoplados</w:t>
+      </w:r>
+      <w:r>
+        <w:rPr>
+          <w:color w:val="000000" w:themeColor="text1"/>
+        </w:rPr>
+        <w:t xml:space="preserve">. Se descarta el enfoque simple de componentes planos y se implementa una Arquitectura Modular orientada a Dominio (Core / </w:t>
+      </w:r>
+      <w:proofErr w:type="spellStart"/>
+      <w:r>
+        <w:rPr>
+          <w:color w:val="000000" w:themeColor="text1"/>
+        </w:rPr>
+        <w:t>Shared</w:t>
+      </w:r>
+      <w:proofErr w:type="spellEnd"/>
+      <w:r>
+        <w:rPr>
+          <w:color w:val="000000" w:themeColor="text1"/>
+        </w:rPr>
+        <w:t xml:space="preserve"> / </w:t>
+      </w:r>
+      <w:proofErr w:type="spellStart"/>
+      <w:r>
+        <w:rPr>
+          <w:color w:val="000000" w:themeColor="text1"/>
+        </w:rPr>
+        <w:t>Features</w:t>
+      </w:r>
+      <w:proofErr w:type="spellEnd"/>
+      <w:r>
+        <w:rPr>
+          <w:color w:val="000000" w:themeColor="text1"/>
+        </w:rPr>
+        <w:t>):</w:t>
+      </w:r>
+    </w:p>
+    <w:p>
+      <w:pPr>
+        <w:rPr>
+          <w:color w:val="000000" w:themeColor="text1"/>
+        </w:rPr>
+      </w:pPr>
+      <w:r>
+        <w:rPr>
+          <w:color w:val="000000" w:themeColor="text1"/>
+        </w:rPr>
+        <w:t xml:space="preserve">Modulo Core: Contiene los servicios globales de infraestructura: Configuración de la librería @azure/msal-angular, definición del </w:t>
+      </w:r>
+      <w:proofErr w:type="spellStart"/>
+      <w:r>
+        <w:rPr>
+          <w:color w:val="000000" w:themeColor="text1"/>
+        </w:rPr>
+        <w:t>MsalInterceptor</w:t>
+      </w:r>
+      <w:proofErr w:type="spellEnd"/>
+      <w:r>
+        <w:rPr>
+          <w:color w:val="000000" w:themeColor="text1"/>
+        </w:rPr>
+        <w:t xml:space="preserve"> para la inyección de JWT y </w:t>
+      </w:r>
+      <w:proofErr w:type="spellStart"/>
+      <w:r>
+        <w:rPr>
+          <w:color w:val="000000" w:themeColor="text1"/>
+        </w:rPr>
+        <w:t>MsalGuard</w:t>
+      </w:r>
+      <w:proofErr w:type="spellEnd"/>
+      <w:r>
+        <w:rPr>
+          <w:color w:val="000000" w:themeColor="text1"/>
+        </w:rPr>
+        <w:t xml:space="preserve"> para la protección de rutas.</w:t>
+      </w:r>
+    </w:p>
+    <w:p>
+      <w:pPr>
+        <w:rPr>
+          <w:color w:val="000000" w:themeColor="text1"/>
+        </w:rPr>
+      </w:pPr>
+      <w:r>
+        <w:rPr>
+          <w:color w:val="000000" w:themeColor="text1"/>
+        </w:rPr>
+        <w:t xml:space="preserve">Modulo </w:t>
+      </w:r>
+      <w:proofErr w:type="spellStart"/>
+      <w:r>
+        <w:rPr>
+          <w:color w:val="000000" w:themeColor="text1"/>
+        </w:rPr>
+        <w:t>Shared</w:t>
+      </w:r>
+      <w:proofErr w:type="spellEnd"/>
+      <w:r>
+        <w:rPr>
+          <w:color w:val="000000" w:themeColor="text1"/>
+        </w:rPr>
+        <w:t>: Componentes puramente visuales, directivas y tuberías (pipes) reutilizables por cualquier vista.</w:t>
+      </w:r>
+    </w:p>
+    <w:p>
+      <w:pPr>
+        <w:rPr>
+          <w:color w:val="000000" w:themeColor="text1"/>
+        </w:rPr>
+      </w:pPr>
+      <w:r>
+        <w:rPr>
+          <w:color w:val="000000" w:themeColor="text1"/>
+        </w:rPr>
+        <w:t xml:space="preserve">Módulos </w:t>
+      </w:r>
+      <w:proofErr w:type="spellStart"/>
+      <w:r>
+        <w:rPr>
+          <w:color w:val="000000" w:themeColor="text1"/>
+        </w:rPr>
+        <w:t>Features</w:t>
+      </w:r>
+      <w:proofErr w:type="spellEnd"/>
+      <w:r>
+        <w:rPr>
+          <w:color w:val="000000" w:themeColor="text1"/>
+        </w:rPr>
+        <w:t xml:space="preserve">: Módulos independientes y desacoplados para cada contexto del sistema.  </w:t>
+      </w:r>
+    </w:p>
+    <w:p>
+      <w:pPr>
+        <w:pStyle w:val="Prrafodelista"/>
+        <w:numPr>
+          <w:ilvl w:val="1"/>
+          <w:numId w:val="13"/>
+        </w:numPr>
+        <w:rPr>
+          <w:color w:val="215868" w:themeColor="accent5" w:themeShade="80"/>
+          <w:sz w:val="28"/>
+          <w:szCs w:val="28"/>
+        </w:rPr>
+      </w:pPr>
+      <w:r>
+        <w:rPr>
+          <w:color w:val="215868" w:themeColor="accent5" w:themeShade="80"/>
+          <w:sz w:val="28"/>
+          <w:szCs w:val="28"/>
+        </w:rPr>
+        <w:lastRenderedPageBreak/>
+        <w:t xml:space="preserve"> Patrones de diseño de </w:t>
+      </w:r>
+      <w:proofErr w:type="spellStart"/>
+      <w:r>
+        <w:rPr>
+          <w:color w:val="215868" w:themeColor="accent5" w:themeShade="80"/>
+          <w:sz w:val="28"/>
+          <w:szCs w:val="28"/>
+        </w:rPr>
+        <w:t>Frontend</w:t>
+      </w:r>
+      <w:proofErr w:type="spellEnd"/>
+      <w:r>
+        <w:rPr>
+          <w:color w:val="215868" w:themeColor="accent5" w:themeShade="80"/>
+          <w:sz w:val="28"/>
+          <w:szCs w:val="28"/>
+        </w:rPr>
+        <w:t xml:space="preserve"> Aplicados</w:t>
+      </w:r>
+    </w:p>
+    <w:p>
+      <w:pPr>
+        <w:pStyle w:val="Prrafodelista"/>
+        <w:numPr>
+          <w:ilvl w:val="0"/>
+          <w:numId w:val="42"/>
+        </w:numPr>
+      </w:pPr>
+      <w:r>
+        <w:rPr>
+          <w:color w:val="000000" w:themeColor="text1"/>
+        </w:rPr>
+        <w:t xml:space="preserve">Smart </w:t>
+      </w:r>
+      <w:proofErr w:type="spellStart"/>
+      <w:r>
+        <w:rPr>
+          <w:color w:val="000000" w:themeColor="text1"/>
+        </w:rPr>
+        <w:t>Components</w:t>
+      </w:r>
+      <w:proofErr w:type="spellEnd"/>
+      <w:r>
+        <w:rPr>
+          <w:color w:val="000000" w:themeColor="text1"/>
+        </w:rPr>
+        <w:t xml:space="preserve">: </w:t>
+      </w:r>
+      <w:r>
+        <w:t xml:space="preserve">Componentes con lógica de negocio visual encargados de orquestar el estado de la aplicación. Se suscriben a </w:t>
+      </w:r>
+      <w:r>
+        <w:rPr>
+          <w:i/>
+          <w:iCs/>
+        </w:rPr>
+        <w:t>Observables</w:t>
+      </w:r>
+      <w:r>
+        <w:t xml:space="preserve"> (</w:t>
+      </w:r>
+      <w:proofErr w:type="spellStart"/>
+      <w:r>
+        <w:t>RxJS</w:t>
+      </w:r>
+      <w:proofErr w:type="spellEnd"/>
+      <w:r>
+        <w:t>), consumen los servicios HTTP, inyectan dependencias de infraestructura y gestionan el flujo de datos.</w:t>
+      </w:r>
+    </w:p>
+    <w:p>
+      <w:pPr>
+        <w:pStyle w:val="Prrafodelista"/>
+        <w:numPr>
+          <w:ilvl w:val="0"/>
+          <w:numId w:val="42"/>
+        </w:numPr>
+      </w:pPr>
+      <w:proofErr w:type="spellStart"/>
+      <w:r>
+        <w:t>Dumb</w:t>
+      </w:r>
+      <w:proofErr w:type="spellEnd"/>
+      <w:r>
+        <w:t xml:space="preserve"> </w:t>
+      </w:r>
+      <w:proofErr w:type="spellStart"/>
+      <w:r>
+        <w:t>Components</w:t>
+      </w:r>
+      <w:proofErr w:type="spellEnd"/>
+      <w:r>
+        <w:t xml:space="preserve">: </w:t>
+      </w:r>
+      <w:r>
+        <w:t>Componentes enfocados exclusivamente en la presentación gráfica (UI/UX). Son agnósticos de la capa de red, de los servicios de Angular y del token JWT. Reciben sus datos de forma reactiva mediante la directiva</w:t>
+      </w:r>
+      <w:r>
+        <w:t xml:space="preserve"> @</w:t>
+      </w:r>
+      <w:proofErr w:type="gramStart"/>
+      <w:r>
+        <w:t>Input(</w:t>
+      </w:r>
+      <w:proofErr w:type="gramEnd"/>
+      <w:r>
+        <w:t>) y comunican las acciones del usuario hacia arriba a través de eventos con @Output().</w:t>
+      </w:r>
+    </w:p>
+    <w:p>
+      <w:pPr>
+        <w:pStyle w:val="Prrafodelista"/>
+        <w:numPr>
+          <w:ilvl w:val="0"/>
+          <w:numId w:val="42"/>
+        </w:numPr>
+      </w:pPr>
+      <w:r>
+        <w:t xml:space="preserve">Arquitectura Modular por Dominio (Core / </w:t>
+      </w:r>
+      <w:proofErr w:type="spellStart"/>
+      <w:r>
+        <w:t>Shared</w:t>
+      </w:r>
+      <w:proofErr w:type="spellEnd"/>
+      <w:r>
+        <w:t xml:space="preserve"> / </w:t>
+      </w:r>
+      <w:proofErr w:type="spellStart"/>
+      <w:r>
+        <w:t>Features</w:t>
+      </w:r>
+      <w:proofErr w:type="spellEnd"/>
+      <w:r>
+        <w:t>):</w:t>
+      </w:r>
+      <w:r>
+        <w:t xml:space="preserve"> </w:t>
+      </w:r>
+      <w:r>
+        <w:t>Estructura organizativa que agrupa el código según su responsabilidad dentro de la aplicación, evitando dependencias circulares y facilitando la carga perezosa (</w:t>
+      </w:r>
+      <w:proofErr w:type="spellStart"/>
+      <w:r>
+        <w:rPr>
+          <w:i/>
+          <w:iCs/>
+        </w:rPr>
+        <w:t>Lazy</w:t>
+      </w:r>
+      <w:proofErr w:type="spellEnd"/>
+      <w:r>
+        <w:rPr>
+          <w:i/>
+          <w:iCs/>
+        </w:rPr>
+        <w:t xml:space="preserve"> </w:t>
+      </w:r>
+      <w:proofErr w:type="spellStart"/>
+      <w:r>
+        <w:rPr>
+          <w:i/>
+          <w:iCs/>
+        </w:rPr>
+        <w:t>Loading</w:t>
+      </w:r>
+      <w:proofErr w:type="spellEnd"/>
+      <w:r>
+        <w:t>).</w:t>
+      </w:r>
+    </w:p>
+    <w:p>
+      <w:pPr>
+        <w:pStyle w:val="Prrafodelista"/>
+        <w:numPr>
+          <w:ilvl w:val="0"/>
+          <w:numId w:val="42"/>
+        </w:numPr>
+        <w:rPr>
+          <w:color w:val="000000" w:themeColor="text1"/>
+        </w:rPr>
+      </w:pPr>
+      <w:r>
+        <w:rPr>
+          <w:color w:val="000000" w:themeColor="text1"/>
+        </w:rPr>
+        <w:t xml:space="preserve">GTTP Interceptor &amp; </w:t>
+      </w:r>
+      <w:proofErr w:type="spellStart"/>
+      <w:r>
+        <w:rPr>
+          <w:color w:val="000000" w:themeColor="text1"/>
+        </w:rPr>
+        <w:t>Route</w:t>
+      </w:r>
+      <w:proofErr w:type="spellEnd"/>
+      <w:r>
+        <w:rPr>
+          <w:color w:val="000000" w:themeColor="text1"/>
+        </w:rPr>
+        <w:t xml:space="preserve"> </w:t>
+      </w:r>
+      <w:proofErr w:type="spellStart"/>
+      <w:r>
+        <w:rPr>
+          <w:color w:val="000000" w:themeColor="text1"/>
+        </w:rPr>
+        <w:t>Guard</w:t>
+      </w:r>
+      <w:proofErr w:type="spellEnd"/>
+      <w:r>
+        <w:rPr>
+          <w:color w:val="000000" w:themeColor="text1"/>
+        </w:rPr>
+        <w:t xml:space="preserve"> </w:t>
+      </w:r>
+      <w:proofErr w:type="spellStart"/>
+      <w:r>
+        <w:rPr>
+          <w:color w:val="000000" w:themeColor="text1"/>
+        </w:rPr>
+        <w:t>Patterns</w:t>
+      </w:r>
+      <w:proofErr w:type="spellEnd"/>
+      <w:r>
+        <w:rPr>
+          <w:color w:val="000000" w:themeColor="text1"/>
+        </w:rPr>
+        <w:t xml:space="preserve"> (MSAL / Azure AD): </w:t>
+      </w:r>
+      <w:r>
+        <w:t>Patrones para el manejo transversal de aspectos de seguridad (</w:t>
+      </w:r>
+      <w:r>
+        <w:rPr>
+          <w:i/>
+          <w:iCs/>
+        </w:rPr>
+        <w:t>Cross-</w:t>
+      </w:r>
+      <w:proofErr w:type="spellStart"/>
+      <w:r>
+        <w:rPr>
+          <w:i/>
+          <w:iCs/>
+        </w:rPr>
+        <w:t>Cutting</w:t>
+      </w:r>
+      <w:proofErr w:type="spellEnd"/>
+      <w:r>
+        <w:rPr>
+          <w:i/>
+          <w:iCs/>
+        </w:rPr>
+        <w:t xml:space="preserve"> </w:t>
+      </w:r>
+      <w:proofErr w:type="spellStart"/>
+      <w:r>
+        <w:rPr>
+          <w:i/>
+          <w:iCs/>
+        </w:rPr>
+        <w:t>Concerns</w:t>
+      </w:r>
+      <w:proofErr w:type="spellEnd"/>
+      <w:r>
+        <w:t>). El</w:t>
+      </w:r>
+      <w:r>
+        <w:t xml:space="preserve"> </w:t>
+      </w:r>
+      <w:proofErr w:type="spellStart"/>
+      <w:r>
+        <w:t>MsalInterceptor</w:t>
+      </w:r>
+      <w:proofErr w:type="spellEnd"/>
+      <w:r>
+        <w:t xml:space="preserve"> </w:t>
+      </w:r>
+      <w:r>
+        <w:t>intercepta automáticamente cada petición HTTP enviada al API Gateway para inyectar la cabecera</w:t>
+      </w:r>
+      <w:r>
+        <w:t xml:space="preserve"> </w:t>
+      </w:r>
+      <w:proofErr w:type="spellStart"/>
+      <w:r>
+        <w:t>Authorization</w:t>
+      </w:r>
+      <w:proofErr w:type="spellEnd"/>
+      <w:r>
+        <w:t xml:space="preserve">: </w:t>
+      </w:r>
+      <w:proofErr w:type="spellStart"/>
+      <w:r>
+        <w:t>Bearer</w:t>
+      </w:r>
+      <w:proofErr w:type="spellEnd"/>
+      <w:r>
+        <w:t xml:space="preserve"> &lt;JWT&gt;, mientras que el </w:t>
+      </w:r>
+      <w:proofErr w:type="spellStart"/>
+      <w:r>
+        <w:t>MsalGuard</w:t>
+      </w:r>
+      <w:proofErr w:type="spellEnd"/>
+      <w:r>
+        <w:t xml:space="preserve"> </w:t>
+      </w:r>
+      <w:proofErr w:type="spellStart"/>
+      <w:r>
+        <w:t>proyege</w:t>
+      </w:r>
+      <w:proofErr w:type="spellEnd"/>
+      <w:r>
+        <w:t xml:space="preserve"> la navegabilidad bloqueando el acceso a rutas no autorizadas si no existe un token válido. </w:t>
       </w:r>
     </w:p>
     <w:p>
@@ -2026,6 +3760,7 @@
           <w:ilvl w:val="0"/>
           <w:numId w:val="13"/>
         </w:numPr>
+        <w:spacing w:line="360" w:lineRule="auto"/>
         <w:jc w:val="both"/>
         <w:rPr>
           <w:rFonts w:asciiTheme="minorHAnsi" w:hAnsiTheme="minorHAnsi" w:cstheme="minorHAnsi"/>
@@ -2040,6 +3775,80 @@
           <w:szCs w:val="32"/>
         </w:rPr>
         <w:t xml:space="preserve">Estrategia de Persistencia y Caché </w:t>
+      </w:r>
+    </w:p>
+    <w:p>
+      <w:pPr>
+        <w:pStyle w:val="Prrafodelista"/>
+        <w:numPr>
+          <w:ilvl w:val="0"/>
+          <w:numId w:val="41"/>
+        </w:numPr>
+      </w:pPr>
+      <w:r>
+        <w:t xml:space="preserve">Estrategia de Persistencia: Base de datos relacional Cloud (ej. Amazon RDS PostgreSQL/MySQL) mapeada mediante el ORM </w:t>
+      </w:r>
+      <w:proofErr w:type="spellStart"/>
+      <w:r>
+        <w:t>SQLAlchemy</w:t>
+      </w:r>
+      <w:proofErr w:type="spellEnd"/>
+      <w:r>
+        <w:t xml:space="preserve"> en </w:t>
+      </w:r>
+      <w:proofErr w:type="spellStart"/>
+      <w:r>
+        <w:t>FastAPI</w:t>
+      </w:r>
+      <w:proofErr w:type="spellEnd"/>
+      <w:r>
+        <w:t>.</w:t>
+      </w:r>
+    </w:p>
+    <w:p>
+      <w:pPr>
+        <w:pStyle w:val="Prrafodelista"/>
+        <w:numPr>
+          <w:ilvl w:val="0"/>
+          <w:numId w:val="41"/>
+        </w:numPr>
+      </w:pPr>
+      <w:r>
+        <w:t>Mapeo de Entidades: Configuración explícita de entidades y esquemas de conexión dinámicos parametrizados mediante variables de entorno</w:t>
+      </w:r>
+      <w:r>
+        <w:t xml:space="preserve"> (.</w:t>
+      </w:r>
+      <w:proofErr w:type="spellStart"/>
+      <w:r>
+        <w:t>env</w:t>
+      </w:r>
+      <w:proofErr w:type="spellEnd"/>
+      <w:r>
+        <w:t>)</w:t>
+      </w:r>
+      <w:r>
+        <w:t>, aislando las credenciales del código fuente entregado en GitHub.</w:t>
+      </w:r>
+    </w:p>
+    <w:p>
+      <w:pPr>
+        <w:pStyle w:val="Prrafodelista"/>
+        <w:numPr>
+          <w:ilvl w:val="0"/>
+          <w:numId w:val="41"/>
+        </w:numPr>
+      </w:pPr>
+      <w:r>
+        <w:t xml:space="preserve">Estrategia de Caché: Los </w:t>
+      </w:r>
+      <w:proofErr w:type="spellStart"/>
+      <w:r>
+        <w:t>endpoints</w:t>
+      </w:r>
+      <w:proofErr w:type="spellEnd"/>
+      <w:r>
+        <w:t xml:space="preserve"> de lectura intensiva y baja frecuencia de cambio (como el Catálogo de Productos) incorporarán almacenamiento en caché en memoria dentro del API Gateway o capa de servicio para reducir el número de lecturas a la base de datos.</w:t>
       </w:r>
     </w:p>
     <w:p>
@@ -2049,6 +3858,7 @@
           <w:ilvl w:val="0"/>
           <w:numId w:val="13"/>
         </w:numPr>
+        <w:spacing w:line="360" w:lineRule="auto"/>
         <w:jc w:val="both"/>
         <w:rPr>
           <w:rFonts w:asciiTheme="minorHAnsi" w:hAnsiTheme="minorHAnsi" w:cstheme="minorHAnsi"/>
@@ -2065,7 +3875,322 @@
         <w:t>Estrategia de Ciberseguridad y Auditoría</w:t>
       </w:r>
     </w:p>
-    <w:p/>
+    <w:p>
+      <w:pPr>
+        <w:spacing w:line="360" w:lineRule="auto"/>
+      </w:pPr>
+      <w:r>
+        <w:t xml:space="preserve">Autenticación </w:t>
+      </w:r>
+      <w:proofErr w:type="gramStart"/>
+      <w:r>
+        <w:t>Delegada</w:t>
+      </w:r>
+      <w:proofErr w:type="gramEnd"/>
+      <w:r>
+        <w:t xml:space="preserve"> (</w:t>
+      </w:r>
+      <w:proofErr w:type="spellStart"/>
+      <w:r>
+        <w:t>IDaaS</w:t>
+      </w:r>
+      <w:proofErr w:type="spellEnd"/>
+      <w:r>
+        <w:t xml:space="preserve">): El </w:t>
+      </w:r>
+      <w:proofErr w:type="spellStart"/>
+      <w:r>
+        <w:t>frontend</w:t>
+      </w:r>
+      <w:proofErr w:type="spellEnd"/>
+      <w:r>
+        <w:t xml:space="preserve"> realiza la autenticación contra Azure AD (Microsoft Entra ID) mediante el flujo OAuth 2.0 + </w:t>
+      </w:r>
+      <w:proofErr w:type="spellStart"/>
+      <w:r>
+        <w:t>Authorization</w:t>
+      </w:r>
+      <w:proofErr w:type="spellEnd"/>
+      <w:r>
+        <w:t xml:space="preserve"> </w:t>
+      </w:r>
+      <w:proofErr w:type="spellStart"/>
+      <w:r>
+        <w:t>Code</w:t>
+      </w:r>
+      <w:proofErr w:type="spellEnd"/>
+      <w:r>
+        <w:t xml:space="preserve"> con PKCE usando MSAL Angular.</w:t>
+      </w:r>
+    </w:p>
+    <w:p>
+      <w:pPr>
+        <w:spacing w:line="360" w:lineRule="auto"/>
+      </w:pPr>
+      <w:r>
+        <w:t>Inyección de Tokens: El</w:t>
+      </w:r>
+      <w:r>
+        <w:t xml:space="preserve"> </w:t>
+      </w:r>
+      <w:proofErr w:type="spellStart"/>
+      <w:r>
+        <w:t>MsalInterceptor</w:t>
+      </w:r>
+      <w:proofErr w:type="spellEnd"/>
+      <w:r>
+        <w:t xml:space="preserve"> </w:t>
+      </w:r>
+      <w:r>
+        <w:t>captura cada solicitud HTTP emitida desde la SPA hacia las rutas protegidas del API Gateway e inyecta la cabecer</w:t>
+      </w:r>
+      <w:r>
+        <w:t xml:space="preserve">a </w:t>
+      </w:r>
+      <w:proofErr w:type="spellStart"/>
+      <w:r>
+        <w:t>Autorization</w:t>
+      </w:r>
+      <w:proofErr w:type="spellEnd"/>
+      <w:r>
+        <w:t xml:space="preserve">: </w:t>
+      </w:r>
+      <w:proofErr w:type="spellStart"/>
+      <w:r>
+        <w:t>Bearer</w:t>
+      </w:r>
+      <w:proofErr w:type="spellEnd"/>
+      <w:r>
+        <w:t xml:space="preserve"> &lt;JWT&gt;</w:t>
+      </w:r>
+      <w:r>
+        <w:t>.</w:t>
+      </w:r>
+    </w:p>
+    <w:p>
+      <w:pPr>
+        <w:spacing w:line="360" w:lineRule="auto"/>
+      </w:pPr>
+    </w:p>
+    <w:p>
+      <w:pPr>
+        <w:spacing w:line="360" w:lineRule="auto"/>
+      </w:pPr>
+    </w:p>
+    <w:p>
+      <w:pPr>
+        <w:spacing w:line="360" w:lineRule="auto"/>
+        <w:ind w:firstLine="360"/>
+        <w:rPr>
+          <w:color w:val="215868" w:themeColor="accent5" w:themeShade="80"/>
+          <w:sz w:val="28"/>
+          <w:szCs w:val="28"/>
+        </w:rPr>
+      </w:pPr>
+      <w:r>
+        <w:rPr>
+          <w:color w:val="215868" w:themeColor="accent5" w:themeShade="80"/>
+          <w:sz w:val="28"/>
+          <w:szCs w:val="28"/>
+        </w:rPr>
+        <w:lastRenderedPageBreak/>
+        <w:t xml:space="preserve">6.1 </w:t>
+      </w:r>
+      <w:r>
+        <w:rPr>
+          <w:color w:val="215868" w:themeColor="accent5" w:themeShade="80"/>
+          <w:sz w:val="28"/>
+          <w:szCs w:val="28"/>
+        </w:rPr>
+        <w:t xml:space="preserve">Validación de JWT en </w:t>
+      </w:r>
+      <w:proofErr w:type="spellStart"/>
+      <w:r>
+        <w:rPr>
+          <w:color w:val="215868" w:themeColor="accent5" w:themeShade="80"/>
+          <w:sz w:val="28"/>
+          <w:szCs w:val="28"/>
+        </w:rPr>
+        <w:t>FastAPI</w:t>
+      </w:r>
+      <w:proofErr w:type="spellEnd"/>
+      <w:r>
+        <w:rPr>
+          <w:color w:val="215868" w:themeColor="accent5" w:themeShade="80"/>
+          <w:sz w:val="28"/>
+          <w:szCs w:val="28"/>
+        </w:rPr>
+        <w:t xml:space="preserve"> / BFF</w:t>
+      </w:r>
+    </w:p>
+    <w:p>
+      <w:pPr>
+        <w:pStyle w:val="Prrafodelista"/>
+        <w:numPr>
+          <w:ilvl w:val="0"/>
+          <w:numId w:val="43"/>
+        </w:numPr>
+        <w:spacing w:line="360" w:lineRule="auto"/>
+      </w:pPr>
+      <w:r>
+        <w:t>Verificación de Firma: Descarga periódica de claves públicas JWKS desde Microsoft Azure AD para validar criptográficamente la firma RS256 del token.</w:t>
+      </w:r>
+    </w:p>
+    <w:p>
+      <w:pPr>
+        <w:pStyle w:val="Prrafodelista"/>
+        <w:numPr>
+          <w:ilvl w:val="0"/>
+          <w:numId w:val="43"/>
+        </w:numPr>
+        <w:spacing w:line="360" w:lineRule="auto"/>
+      </w:pPr>
+      <w:r>
+        <w:t xml:space="preserve">Verificación de </w:t>
+      </w:r>
+      <w:proofErr w:type="spellStart"/>
+      <w:r>
+        <w:t>Claims</w:t>
+      </w:r>
+      <w:proofErr w:type="spellEnd"/>
+      <w:r>
+        <w:t xml:space="preserve">: Validación estricta de vigencia, emisor </w:t>
+      </w:r>
+      <w:r>
+        <w:t>(</w:t>
+      </w:r>
+      <w:proofErr w:type="spellStart"/>
+      <w:r>
+        <w:t>iss</w:t>
+      </w:r>
+      <w:proofErr w:type="spellEnd"/>
+      <w:r>
+        <w:t xml:space="preserve"> </w:t>
+      </w:r>
+      <w:r>
+        <w:t xml:space="preserve">== Azure AD </w:t>
+      </w:r>
+      <w:proofErr w:type="spellStart"/>
+      <w:r>
+        <w:t>Tenant</w:t>
+      </w:r>
+      <w:proofErr w:type="spellEnd"/>
+      <w:r>
+        <w:t xml:space="preserve">) y audiencia </w:t>
+      </w:r>
+      <w:r>
+        <w:t>(</w:t>
+      </w:r>
+      <w:proofErr w:type="spellStart"/>
+      <w:r>
+        <w:t>aud</w:t>
+      </w:r>
+      <w:proofErr w:type="spellEnd"/>
+      <w:r>
+        <w:t xml:space="preserve"> </w:t>
+      </w:r>
+      <w:r>
+        <w:t xml:space="preserve">== Client ID del </w:t>
+      </w:r>
+      <w:proofErr w:type="spellStart"/>
+      <w:r>
+        <w:t>Backend</w:t>
+      </w:r>
+      <w:proofErr w:type="spellEnd"/>
+      <w:r>
+        <w:t>).</w:t>
+      </w:r>
+    </w:p>
+    <w:p>
+      <w:pPr>
+        <w:pStyle w:val="Prrafodelista"/>
+        <w:numPr>
+          <w:ilvl w:val="0"/>
+          <w:numId w:val="43"/>
+        </w:numPr>
+        <w:spacing w:line="360" w:lineRule="auto"/>
+      </w:pPr>
+      <w:r>
+        <w:t xml:space="preserve">Autorización Basada en Roles (RBAC): Extracción de los </w:t>
+      </w:r>
+      <w:proofErr w:type="spellStart"/>
+      <w:r>
+        <w:rPr>
+          <w:i/>
+          <w:iCs/>
+        </w:rPr>
+        <w:t>claims</w:t>
+      </w:r>
+      <w:proofErr w:type="spellEnd"/>
+      <w:r>
+        <w:t xml:space="preserve"> de roles/</w:t>
+      </w:r>
+      <w:proofErr w:type="spellStart"/>
+      <w:r>
+        <w:t>scopes</w:t>
+      </w:r>
+      <w:proofErr w:type="spellEnd"/>
+      <w:r>
+        <w:t xml:space="preserve"> dentro del JWT para autorizar únicamente el acceso a </w:t>
+      </w:r>
+      <w:proofErr w:type="spellStart"/>
+      <w:r>
+        <w:t>endpoints</w:t>
+      </w:r>
+      <w:proofErr w:type="spellEnd"/>
+      <w:r>
+        <w:t xml:space="preserve"> según el nivel del usuario registrado.</w:t>
+      </w:r>
+    </w:p>
+    <w:p>
+      <w:pPr>
+        <w:spacing w:line="360" w:lineRule="auto"/>
+        <w:ind w:firstLine="360"/>
+        <w:rPr>
+          <w:color w:val="215868" w:themeColor="accent5" w:themeShade="80"/>
+          <w:sz w:val="28"/>
+          <w:szCs w:val="28"/>
+        </w:rPr>
+      </w:pPr>
+      <w:r>
+        <w:rPr>
+          <w:color w:val="215868" w:themeColor="accent5" w:themeShade="80"/>
+          <w:sz w:val="28"/>
+          <w:szCs w:val="28"/>
+        </w:rPr>
+        <w:t xml:space="preserve">6.2 </w:t>
+      </w:r>
+      <w:r>
+        <w:rPr>
+          <w:color w:val="215868" w:themeColor="accent5" w:themeShade="80"/>
+          <w:sz w:val="28"/>
+          <w:szCs w:val="28"/>
+        </w:rPr>
+        <w:t>Auditoría y Registros</w:t>
+      </w:r>
+    </w:p>
+    <w:p>
+      <w:pPr>
+        <w:spacing w:line="360" w:lineRule="auto"/>
+      </w:pPr>
+      <w:r>
+        <w:t xml:space="preserve">Manejo de excepciones centralizado en </w:t>
+      </w:r>
+      <w:proofErr w:type="spellStart"/>
+      <w:r>
+        <w:t>FastAPI</w:t>
+      </w:r>
+      <w:proofErr w:type="spellEnd"/>
+      <w:r>
+        <w:t xml:space="preserve"> que responde con códigos de estado HTTP estandarizados </w:t>
+      </w:r>
+      <w:r>
+        <w:t>(Familia 400</w:t>
+      </w:r>
+      <w:r>
+        <w:t>) y registra logs estructurados para auditoría de seguridad sin exponer datos sensibles.</w:t>
+      </w:r>
+    </w:p>
     <w:sectPr>
       <w:headerReference w:type="default" r:id="rId12"/>
       <w:footerReference w:type="default" r:id="rId13"/>
@@ -2081,7 +4206,7 @@
 </file>
 
 <file path=word/endnotes.xml><?xml version="1.0" encoding="utf-8"?>
-<w:endnotes xmlns:wpc="http://schemas.microsoft.com/office/word/2010/wordprocessingCanvas" xmlns:cx="http://schemas.microsoft.com/office/drawing/2014/chartex" xmlns:cx1="http://schemas.microsoft.com/office/drawing/2015/9/8/chartex" xmlns:cx2="http://schemas.microsoft.com/office/drawing/2015/10/21/chartex" xmlns:cx3="http://schemas.microsoft.com/office/drawing/2016/5/9/chartex" xmlns:cx4="http://schemas.microsoft.com/office/drawing/2016/5/10/chartex" xmlns:cx5="http://schemas.microsoft.com/office/drawing/2016/5/11/chartex" xmlns:cx6="http://schemas.microsoft.com/office/drawing/2016/5/12/chartex" xmlns:cx7="http://schemas.microsoft.com/office/drawing/2016/5/13/chartex" xmlns:cx8="http://schemas.microsoft.com/office/drawing/2016/5/14/chartex" xmlns:mc="http://schemas.openxmlformats.org/markup-compatibility/2006" xmlns:aink="http://schemas.microsoft.com/office/drawing/2016/ink" xmlns:am3d="http://schemas.microsoft.com/office/drawing/2017/model3d" xmlns:o="urn:schemas-microsoft-com:office:office" xmlns:oel="http://schemas.microsoft.com/office/2019/extlst" xmlns:r="http://schemas.openxmlformats.org/officeDocument/2006/relationships" xmlns:m="http://schemas.openxmlformats.org/officeDocument/2006/math" xmlns:v="urn:schemas-microsoft-com:vml" xmlns:wp14="http://schemas.microsoft.com/office/word/2010/wordprocessingDrawing" xmlns:wp="http://schemas.openxmlformats.org/drawingml/2006/wordprocessingDrawing" xmlns:w10="urn:schemas-microsoft-com:office:word" xmlns:w="http://schemas.openxmlformats.org/wordprocessingml/2006/main" xmlns:w14="http://schemas.microsoft.com/office/word/2010/wordml" xmlns:w15="http://schemas.microsoft.com/office/word/2012/wordml" xmlns:w16cex="http://schemas.microsoft.com/office/word/2018/wordml/cex" xmlns:w16cid="http://schemas.microsoft.com/office/word/2016/wordml/cid" xmlns:w16="http://schemas.microsoft.com/office/word/2018/wordml" xmlns:w16du="http://schemas.microsoft.com/office/word/2023/wordml/word16du" xmlns:w16sdtdh="http://schemas.microsoft.com/office/word/2020/wordml/sdtdatahash" xmlns:w16sdtfl="http://schemas.microsoft.com/office/word/2024/wordml/sdtformatlock" xmlns:w16se="http://schemas.microsoft.com/office/word/2015/wordml/symex" xmlns:wpg="http://schemas.microsoft.com/office/word/2010/wordprocessingGroup" xmlns:wpi="http://schemas.microsoft.com/office/word/2010/wordprocessingInk" xmlns:wne="http://schemas.microsoft.com/office/word/2006/wordml" xmlns:wps="http://schemas.microsoft.com/office/word/2010/wordprocessingShape" mc:Ignorable="w14 w15 w16se w16cid w16 w16cex w16sdtdh w16sdtfl w16du wp14">
+<w:endnotes xmlns:wpc="http://schemas.microsoft.com/office/word/2010/wordprocessingCanvas" xmlns:cx="http://schemas.microsoft.com/office/drawing/2014/chartex" xmlns:cx1="http://schemas.microsoft.com/office/drawing/2015/9/8/chartex" xmlns:cx2="http://schemas.microsoft.com/office/drawing/2015/10/21/chartex" xmlns:cx3="http://schemas.microsoft.com/office/drawing/2016/5/9/chartex" xmlns:cx4="http://schemas.microsoft.com/office/drawing/2016/5/10/chartex" xmlns:cx5="http://schemas.microsoft.com/office/drawing/2016/5/11/chartex" xmlns:cx6="http://schemas.microsoft.com/office/drawing/2016/5/12/chartex" xmlns:cx7="http://schemas.microsoft.com/office/drawing/2016/5/13/chartex" xmlns:cx8="http://schemas.microsoft.com/office/drawing/2016/5/14/chartex" xmlns:mc="http://schemas.openxmlformats.org/markup-compatibility/2006" xmlns:aink="http://schemas.microsoft.com/office/drawing/2016/ink" xmlns:am3d="http://schemas.microsoft.com/office/drawing/2017/model3d" xmlns:o="urn:schemas-microsoft-com:office:office" xmlns:r="http://schemas.openxmlformats.org/officeDocument/2006/relationships" xmlns:m="http://schemas.openxmlformats.org/officeDocument/2006/math" xmlns:v="urn:schemas-microsoft-com:vml" xmlns:wp14="http://schemas.microsoft.com/office/word/2010/wordprocessingDrawing" xmlns:wp="http://schemas.openxmlformats.org/drawingml/2006/wordprocessingDrawing" xmlns:w10="urn:schemas-microsoft-com:office:word" xmlns:w="http://schemas.openxmlformats.org/wordprocessingml/2006/main" xmlns:w14="http://schemas.microsoft.com/office/word/2010/wordml" xmlns:w15="http://schemas.microsoft.com/office/word/2012/wordml" xmlns:w16cex="http://schemas.microsoft.com/office/word/2018/wordml/cex" xmlns:w16cid="http://schemas.microsoft.com/office/word/2016/wordml/cid" xmlns:w16="http://schemas.microsoft.com/office/word/2018/wordml" xmlns:w16sdtdh="http://schemas.microsoft.com/office/word/2020/wordml/sdtdatahash" xmlns:w16se="http://schemas.microsoft.com/office/word/2015/wordml/symex" xmlns:wpg="http://schemas.microsoft.com/office/word/2010/wordprocessingGroup" xmlns:wpi="http://schemas.microsoft.com/office/word/2010/wordprocessingInk" xmlns:wne="http://schemas.microsoft.com/office/word/2006/wordml" xmlns:wps="http://schemas.microsoft.com/office/word/2010/wordprocessingShape" mc:Ignorable="w14 w15 w16se w16cid w16 w16cex w16sdtdh wp14">
   <w:endnote w:type="separator" w:id="-1">
     <w:p>
       <w:pPr>
@@ -2106,7 +4231,7 @@
 </file>
 
 <file path=word/footer1.xml><?xml version="1.0" encoding="utf-8"?>
-<w:ftr xmlns:wpc="http://schemas.microsoft.com/office/word/2010/wordprocessingCanvas" xmlns:cx="http://schemas.microsoft.com/office/drawing/2014/chartex" xmlns:cx1="http://schemas.microsoft.com/office/drawing/2015/9/8/chartex" xmlns:cx2="http://schemas.microsoft.com/office/drawing/2015/10/21/chartex" xmlns:cx3="http://schemas.microsoft.com/office/drawing/2016/5/9/chartex" xmlns:cx4="http://schemas.microsoft.com/office/drawing/2016/5/10/chartex" xmlns:cx5="http://schemas.microsoft.com/office/drawing/2016/5/11/chartex" xmlns:cx6="http://schemas.microsoft.com/office/drawing/2016/5/12/chartex" xmlns:cx7="http://schemas.microsoft.com/office/drawing/2016/5/13/chartex" xmlns:cx8="http://schemas.microsoft.com/office/drawing/2016/5/14/chartex" xmlns:mc="http://schemas.openxmlformats.org/markup-compatibility/2006" xmlns:aink="http://schemas.microsoft.com/office/drawing/2016/ink" xmlns:am3d="http://schemas.microsoft.com/office/drawing/2017/model3d" xmlns:o="urn:schemas-microsoft-com:office:office" xmlns:oel="http://schemas.microsoft.com/office/2019/extlst" xmlns:r="http://schemas.openxmlformats.org/officeDocument/2006/relationships" xmlns:m="http://schemas.openxmlformats.org/officeDocument/2006/math" xmlns:v="urn:schemas-microsoft-com:vml" xmlns:wp14="http://schemas.microsoft.com/office/word/2010/wordprocessingDrawing" xmlns:wp="http://schemas.openxmlformats.org/drawingml/2006/wordprocessingDrawing" xmlns:w10="urn:schemas-microsoft-com:office:word" xmlns:w="http://schemas.openxmlformats.org/wordprocessingml/2006/main" xmlns:w14="http://schemas.microsoft.com/office/word/2010/wordml" xmlns:w15="http://schemas.microsoft.com/office/word/2012/wordml" xmlns:w16cex="http://schemas.microsoft.com/office/word/2018/wordml/cex" xmlns:w16cid="http://schemas.microsoft.com/office/word/2016/wordml/cid" xmlns:w16="http://schemas.microsoft.com/office/word/2018/wordml" xmlns:w16du="http://schemas.microsoft.com/office/word/2023/wordml/word16du" xmlns:w16sdtdh="http://schemas.microsoft.com/office/word/2020/wordml/sdtdatahash" xmlns:w16sdtfl="http://schemas.microsoft.com/office/word/2024/wordml/sdtformatlock" xmlns:w16se="http://schemas.microsoft.com/office/word/2015/wordml/symex" xmlns:wpg="http://schemas.microsoft.com/office/word/2010/wordprocessingGroup" xmlns:wpi="http://schemas.microsoft.com/office/word/2010/wordprocessingInk" xmlns:wne="http://schemas.microsoft.com/office/word/2006/wordml" xmlns:wps="http://schemas.microsoft.com/office/word/2010/wordprocessingShape" mc:Ignorable="w14 w15 w16se w16cid w16 w16cex w16sdtdh w16sdtfl w16du wp14">
+<w:ftr xmlns:wpc="http://schemas.microsoft.com/office/word/2010/wordprocessingCanvas" xmlns:cx="http://schemas.microsoft.com/office/drawing/2014/chartex" xmlns:cx1="http://schemas.microsoft.com/office/drawing/2015/9/8/chartex" xmlns:cx2="http://schemas.microsoft.com/office/drawing/2015/10/21/chartex" xmlns:cx3="http://schemas.microsoft.com/office/drawing/2016/5/9/chartex" xmlns:cx4="http://schemas.microsoft.com/office/drawing/2016/5/10/chartex" xmlns:cx5="http://schemas.microsoft.com/office/drawing/2016/5/11/chartex" xmlns:cx6="http://schemas.microsoft.com/office/drawing/2016/5/12/chartex" xmlns:cx7="http://schemas.microsoft.com/office/drawing/2016/5/13/chartex" xmlns:cx8="http://schemas.microsoft.com/office/drawing/2016/5/14/chartex" xmlns:mc="http://schemas.openxmlformats.org/markup-compatibility/2006" xmlns:aink="http://schemas.microsoft.com/office/drawing/2016/ink" xmlns:am3d="http://schemas.microsoft.com/office/drawing/2017/model3d" xmlns:o="urn:schemas-microsoft-com:office:office" xmlns:r="http://schemas.openxmlformats.org/officeDocument/2006/relationships" xmlns:m="http://schemas.openxmlformats.org/officeDocument/2006/math" xmlns:v="urn:schemas-microsoft-com:vml" xmlns:wp14="http://schemas.microsoft.com/office/word/2010/wordprocessingDrawing" xmlns:wp="http://schemas.openxmlformats.org/drawingml/2006/wordprocessingDrawing" xmlns:w10="urn:schemas-microsoft-com:office:word" xmlns:w="http://schemas.openxmlformats.org/wordprocessingml/2006/main" xmlns:w14="http://schemas.microsoft.com/office/word/2010/wordml" xmlns:w15="http://schemas.microsoft.com/office/word/2012/wordml" xmlns:w16cex="http://schemas.microsoft.com/office/word/2018/wordml/cex" xmlns:w16cid="http://schemas.microsoft.com/office/word/2016/wordml/cid" xmlns:w16="http://schemas.microsoft.com/office/word/2018/wordml" xmlns:w16sdtdh="http://schemas.microsoft.com/office/word/2020/wordml/sdtdatahash" xmlns:w16se="http://schemas.microsoft.com/office/word/2015/wordml/symex" xmlns:wpg="http://schemas.microsoft.com/office/word/2010/wordprocessingGroup" xmlns:wpi="http://schemas.microsoft.com/office/word/2010/wordprocessingInk" xmlns:wne="http://schemas.microsoft.com/office/word/2006/wordml" xmlns:wps="http://schemas.microsoft.com/office/word/2010/wordprocessingShape" mc:Ignorable="w14 w15 w16se w16cid w16 w16cex w16sdtdh wp14">
   <w:sdt>
     <w:sdtPr>
       <w:id w:val="14532529"/>
@@ -2115,6 +4240,7 @@
         <w:docPartUnique/>
       </w:docPartObj>
     </w:sdtPr>
+    <w:sdtEndPr/>
     <w:sdtContent>
       <w:p>
         <w:pPr>
@@ -2154,7 +4280,7 @@
 </file>
 
 <file path=word/footnotes.xml><?xml version="1.0" encoding="utf-8"?>
-<w:footnotes xmlns:wpc="http://schemas.microsoft.com/office/word/2010/wordprocessingCanvas" xmlns:cx="http://schemas.microsoft.com/office/drawing/2014/chartex" xmlns:cx1="http://schemas.microsoft.com/office/drawing/2015/9/8/chartex" xmlns:cx2="http://schemas.microsoft.com/office/drawing/2015/10/21/chartex" xmlns:cx3="http://schemas.microsoft.com/office/drawing/2016/5/9/chartex" xmlns:cx4="http://schemas.microsoft.com/office/drawing/2016/5/10/chartex" xmlns:cx5="http://schemas.microsoft.com/office/drawing/2016/5/11/chartex" xmlns:cx6="http://schemas.microsoft.com/office/drawing/2016/5/12/chartex" xmlns:cx7="http://schemas.microsoft.com/office/drawing/2016/5/13/chartex" xmlns:cx8="http://schemas.microsoft.com/office/drawing/2016/5/14/chartex" xmlns:mc="http://schemas.openxmlformats.org/markup-compatibility/2006" xmlns:aink="http://schemas.microsoft.com/office/drawing/2016/ink" xmlns:am3d="http://schemas.microsoft.com/office/drawing/2017/model3d" xmlns:o="urn:schemas-microsoft-com:office:office" xmlns:oel="http://schemas.microsoft.com/office/2019/extlst" xmlns:r="http://schemas.openxmlformats.org/officeDocument/2006/relationships" xmlns:m="http://schemas.openxmlformats.org/officeDocument/2006/math" xmlns:v="urn:schemas-microsoft-com:vml" xmlns:wp14="http://schemas.microsoft.com/office/word/2010/wordprocessingDrawing" xmlns:wp="http://schemas.openxmlformats.org/drawingml/2006/wordprocessingDrawing" xmlns:w10="urn:schemas-microsoft-com:office:word" xmlns:w="http://schemas.openxmlformats.org/wordprocessingml/2006/main" xmlns:w14="http://schemas.microsoft.com/office/word/2010/wordml" xmlns:w15="http://schemas.microsoft.com/office/word/2012/wordml" xmlns:w16cex="http://schemas.microsoft.com/office/word/2018/wordml/cex" xmlns:w16cid="http://schemas.microsoft.com/office/word/2016/wordml/cid" xmlns:w16="http://schemas.microsoft.com/office/word/2018/wordml" xmlns:w16du="http://schemas.microsoft.com/office/word/2023/wordml/word16du" xmlns:w16sdtdh="http://schemas.microsoft.com/office/word/2020/wordml/sdtdatahash" xmlns:w16sdtfl="http://schemas.microsoft.com/office/word/2024/wordml/sdtformatlock" xmlns:w16se="http://schemas.microsoft.com/office/word/2015/wordml/symex" xmlns:wpg="http://schemas.microsoft.com/office/word/2010/wordprocessingGroup" xmlns:wpi="http://schemas.microsoft.com/office/word/2010/wordprocessingInk" xmlns:wne="http://schemas.microsoft.com/office/word/2006/wordml" xmlns:wps="http://schemas.microsoft.com/office/word/2010/wordprocessingShape" mc:Ignorable="w14 w15 w16se w16cid w16 w16cex w16sdtdh w16sdtfl w16du wp14">
+<w:footnotes xmlns:wpc="http://schemas.microsoft.com/office/word/2010/wordprocessingCanvas" xmlns:cx="http://schemas.microsoft.com/office/drawing/2014/chartex" xmlns:cx1="http://schemas.microsoft.com/office/drawing/2015/9/8/chartex" xmlns:cx2="http://schemas.microsoft.com/office/drawing/2015/10/21/chartex" xmlns:cx3="http://schemas.microsoft.com/office/drawing/2016/5/9/chartex" xmlns:cx4="http://schemas.microsoft.com/office/drawing/2016/5/10/chartex" xmlns:cx5="http://schemas.microsoft.com/office/drawing/2016/5/11/chartex" xmlns:cx6="http://schemas.microsoft.com/office/drawing/2016/5/12/chartex" xmlns:cx7="http://schemas.microsoft.com/office/drawing/2016/5/13/chartex" xmlns:cx8="http://schemas.microsoft.com/office/drawing/2016/5/14/chartex" xmlns:mc="http://schemas.openxmlformats.org/markup-compatibility/2006" xmlns:aink="http://schemas.microsoft.com/office/drawing/2016/ink" xmlns:am3d="http://schemas.microsoft.com/office/drawing/2017/model3d" xmlns:o="urn:schemas-microsoft-com:office:office" xmlns:r="http://schemas.openxmlformats.org/officeDocument/2006/relationships" xmlns:m="http://schemas.openxmlformats.org/officeDocument/2006/math" xmlns:v="urn:schemas-microsoft-com:vml" xmlns:wp14="http://schemas.microsoft.com/office/word/2010/wordprocessingDrawing" xmlns:wp="http://schemas.openxmlformats.org/drawingml/2006/wordprocessingDrawing" xmlns:w10="urn:schemas-microsoft-com:office:word" xmlns:w="http://schemas.openxmlformats.org/wordprocessingml/2006/main" xmlns:w14="http://schemas.microsoft.com/office/word/2010/wordml" xmlns:w15="http://schemas.microsoft.com/office/word/2012/wordml" xmlns:w16cex="http://schemas.microsoft.com/office/word/2018/wordml/cex" xmlns:w16cid="http://schemas.microsoft.com/office/word/2016/wordml/cid" xmlns:w16="http://schemas.microsoft.com/office/word/2018/wordml" xmlns:w16sdtdh="http://schemas.microsoft.com/office/word/2020/wordml/sdtdatahash" xmlns:w16se="http://schemas.microsoft.com/office/word/2015/wordml/symex" xmlns:wpg="http://schemas.microsoft.com/office/word/2010/wordprocessingGroup" xmlns:wpi="http://schemas.microsoft.com/office/word/2010/wordprocessingInk" xmlns:wne="http://schemas.microsoft.com/office/word/2006/wordml" xmlns:wps="http://schemas.microsoft.com/office/word/2010/wordprocessingShape" mc:Ignorable="w14 w15 w16se w16cid w16 w16cex w16sdtdh wp14">
   <w:footnote w:type="separator" w:id="-1">
     <w:p>
       <w:pPr>
@@ -2179,7 +4305,7 @@
 </file>
 
 <file path=word/header1.xml><?xml version="1.0" encoding="utf-8"?>
-<w:hdr xmlns:wpc="http://schemas.microsoft.com/office/word/2010/wordprocessingCanvas" xmlns:cx="http://schemas.microsoft.com/office/drawing/2014/chartex" xmlns:cx1="http://schemas.microsoft.com/office/drawing/2015/9/8/chartex" xmlns:cx2="http://schemas.microsoft.com/office/drawing/2015/10/21/chartex" xmlns:cx3="http://schemas.microsoft.com/office/drawing/2016/5/9/chartex" xmlns:cx4="http://schemas.microsoft.com/office/drawing/2016/5/10/chartex" xmlns:cx5="http://schemas.microsoft.com/office/drawing/2016/5/11/chartex" xmlns:cx6="http://schemas.microsoft.com/office/drawing/2016/5/12/chartex" xmlns:cx7="http://schemas.microsoft.com/office/drawing/2016/5/13/chartex" xmlns:cx8="http://schemas.microsoft.com/office/drawing/2016/5/14/chartex" xmlns:mc="http://schemas.openxmlformats.org/markup-compatibility/2006" xmlns:aink="http://schemas.microsoft.com/office/drawing/2016/ink" xmlns:am3d="http://schemas.microsoft.com/office/drawing/2017/model3d" xmlns:o="urn:schemas-microsoft-com:office:office" xmlns:oel="http://schemas.microsoft.com/office/2019/extlst" xmlns:r="http://schemas.openxmlformats.org/officeDocument/2006/relationships" xmlns:m="http://schemas.openxmlformats.org/officeDocument/2006/math" xmlns:v="urn:schemas-microsoft-com:vml" xmlns:wp14="http://schemas.microsoft.com/office/word/2010/wordprocessingDrawing" xmlns:wp="http://schemas.openxmlformats.org/drawingml/2006/wordprocessingDrawing" xmlns:w10="urn:schemas-microsoft-com:office:word" xmlns:w="http://schemas.openxmlformats.org/wordprocessingml/2006/main" xmlns:w14="http://schemas.microsoft.com/office/word/2010/wordml" xmlns:w15="http://schemas.microsoft.com/office/word/2012/wordml" xmlns:w16cex="http://schemas.microsoft.com/office/word/2018/wordml/cex" xmlns:w16cid="http://schemas.microsoft.com/office/word/2016/wordml/cid" xmlns:w16="http://schemas.microsoft.com/office/word/2018/wordml" xmlns:w16du="http://schemas.microsoft.com/office/word/2023/wordml/word16du" xmlns:w16sdtdh="http://schemas.microsoft.com/office/word/2020/wordml/sdtdatahash" xmlns:w16sdtfl="http://schemas.microsoft.com/office/word/2024/wordml/sdtformatlock" xmlns:w16se="http://schemas.microsoft.com/office/word/2015/wordml/symex" xmlns:wpg="http://schemas.microsoft.com/office/word/2010/wordprocessingGroup" xmlns:wpi="http://schemas.microsoft.com/office/word/2010/wordprocessingInk" xmlns:wne="http://schemas.microsoft.com/office/word/2006/wordml" xmlns:wps="http://schemas.microsoft.com/office/word/2010/wordprocessingShape" mc:Ignorable="w14 w15 w16se w16cid w16 w16cex w16sdtdh w16sdtfl w16du wp14">
+<w:hdr xmlns:wpc="http://schemas.microsoft.com/office/word/2010/wordprocessingCanvas" xmlns:cx="http://schemas.microsoft.com/office/drawing/2014/chartex" xmlns:cx1="http://schemas.microsoft.com/office/drawing/2015/9/8/chartex" xmlns:cx2="http://schemas.microsoft.com/office/drawing/2015/10/21/chartex" xmlns:cx3="http://schemas.microsoft.com/office/drawing/2016/5/9/chartex" xmlns:cx4="http://schemas.microsoft.com/office/drawing/2016/5/10/chartex" xmlns:cx5="http://schemas.microsoft.com/office/drawing/2016/5/11/chartex" xmlns:cx6="http://schemas.microsoft.com/office/drawing/2016/5/12/chartex" xmlns:cx7="http://schemas.microsoft.com/office/drawing/2016/5/13/chartex" xmlns:cx8="http://schemas.microsoft.com/office/drawing/2016/5/14/chartex" xmlns:mc="http://schemas.openxmlformats.org/markup-compatibility/2006" xmlns:aink="http://schemas.microsoft.com/office/drawing/2016/ink" xmlns:am3d="http://schemas.microsoft.com/office/drawing/2017/model3d" xmlns:o="urn:schemas-microsoft-com:office:office" xmlns:r="http://schemas.openxmlformats.org/officeDocument/2006/relationships" xmlns:m="http://schemas.openxmlformats.org/officeDocument/2006/math" xmlns:v="urn:schemas-microsoft-com:vml" xmlns:wp14="http://schemas.microsoft.com/office/word/2010/wordprocessingDrawing" xmlns:wp="http://schemas.openxmlformats.org/drawingml/2006/wordprocessingDrawing" xmlns:w10="urn:schemas-microsoft-com:office:word" xmlns:w="http://schemas.openxmlformats.org/wordprocessingml/2006/main" xmlns:w14="http://schemas.microsoft.com/office/word/2010/wordml" xmlns:w15="http://schemas.microsoft.com/office/word/2012/wordml" xmlns:w16cex="http://schemas.microsoft.com/office/word/2018/wordml/cex" xmlns:w16cid="http://schemas.microsoft.com/office/word/2016/wordml/cid" xmlns:w16="http://schemas.microsoft.com/office/word/2018/wordml" xmlns:w16sdtdh="http://schemas.microsoft.com/office/word/2020/wordml/sdtdatahash" xmlns:w16se="http://schemas.microsoft.com/office/word/2015/wordml/symex" xmlns:wpg="http://schemas.microsoft.com/office/word/2010/wordprocessingGroup" xmlns:wpi="http://schemas.microsoft.com/office/word/2010/wordprocessingInk" xmlns:wne="http://schemas.microsoft.com/office/word/2006/wordml" xmlns:wps="http://schemas.microsoft.com/office/word/2010/wordprocessingShape" mc:Ignorable="w14 w15 w16se w16cid w16 w16cex w16sdtdh wp14">
   <w:p>
     <w:pPr>
       <w:pStyle w:val="Encabezado"/>
@@ -2278,7 +4404,7 @@
 </file>
 
 <file path=word/header2.xml><?xml version="1.0" encoding="utf-8"?>
-<w:hdr xmlns:wpc="http://schemas.microsoft.com/office/word/2010/wordprocessingCanvas" xmlns:cx="http://schemas.microsoft.com/office/drawing/2014/chartex" xmlns:cx1="http://schemas.microsoft.com/office/drawing/2015/9/8/chartex" xmlns:cx2="http://schemas.microsoft.com/office/drawing/2015/10/21/chartex" xmlns:cx3="http://schemas.microsoft.com/office/drawing/2016/5/9/chartex" xmlns:cx4="http://schemas.microsoft.com/office/drawing/2016/5/10/chartex" xmlns:cx5="http://schemas.microsoft.com/office/drawing/2016/5/11/chartex" xmlns:cx6="http://schemas.microsoft.com/office/drawing/2016/5/12/chartex" xmlns:cx7="http://schemas.microsoft.com/office/drawing/2016/5/13/chartex" xmlns:cx8="http://schemas.microsoft.com/office/drawing/2016/5/14/chartex" xmlns:mc="http://schemas.openxmlformats.org/markup-compatibility/2006" xmlns:aink="http://schemas.microsoft.com/office/drawing/2016/ink" xmlns:am3d="http://schemas.microsoft.com/office/drawing/2017/model3d" xmlns:o="urn:schemas-microsoft-com:office:office" xmlns:oel="http://schemas.microsoft.com/office/2019/extlst" xmlns:r="http://schemas.openxmlformats.org/officeDocument/2006/relationships" xmlns:m="http://schemas.openxmlformats.org/officeDocument/2006/math" xmlns:v="urn:schemas-microsoft-com:vml" xmlns:wp14="http://schemas.microsoft.com/office/word/2010/wordprocessingDrawing" xmlns:wp="http://schemas.openxmlformats.org/drawingml/2006/wordprocessingDrawing" xmlns:w10="urn:schemas-microsoft-com:office:word" xmlns:w="http://schemas.openxmlformats.org/wordprocessingml/2006/main" xmlns:w14="http://schemas.microsoft.com/office/word/2010/wordml" xmlns:w15="http://schemas.microsoft.com/office/word/2012/wordml" xmlns:w16cex="http://schemas.microsoft.com/office/word/2018/wordml/cex" xmlns:w16cid="http://schemas.microsoft.com/office/word/2016/wordml/cid" xmlns:w16="http://schemas.microsoft.com/office/word/2018/wordml" xmlns:w16du="http://schemas.microsoft.com/office/word/2023/wordml/word16du" xmlns:w16sdtdh="http://schemas.microsoft.com/office/word/2020/wordml/sdtdatahash" xmlns:w16sdtfl="http://schemas.microsoft.com/office/word/2024/wordml/sdtformatlock" xmlns:w16se="http://schemas.microsoft.com/office/word/2015/wordml/symex" xmlns:wpg="http://schemas.microsoft.com/office/word/2010/wordprocessingGroup" xmlns:wpi="http://schemas.microsoft.com/office/word/2010/wordprocessingInk" xmlns:wne="http://schemas.microsoft.com/office/word/2006/wordml" xmlns:wps="http://schemas.microsoft.com/office/word/2010/wordprocessingShape" mc:Ignorable="w14 w15 w16se w16cid w16 w16cex w16sdtdh w16sdtfl w16du wp14">
+<w:hdr xmlns:wpc="http://schemas.microsoft.com/office/word/2010/wordprocessingCanvas" xmlns:cx="http://schemas.microsoft.com/office/drawing/2014/chartex" xmlns:cx1="http://schemas.microsoft.com/office/drawing/2015/9/8/chartex" xmlns:cx2="http://schemas.microsoft.com/office/drawing/2015/10/21/chartex" xmlns:cx3="http://schemas.microsoft.com/office/drawing/2016/5/9/chartex" xmlns:cx4="http://schemas.microsoft.com/office/drawing/2016/5/10/chartex" xmlns:cx5="http://schemas.microsoft.com/office/drawing/2016/5/11/chartex" xmlns:cx6="http://schemas.microsoft.com/office/drawing/2016/5/12/chartex" xmlns:cx7="http://schemas.microsoft.com/office/drawing/2016/5/13/chartex" xmlns:cx8="http://schemas.microsoft.com/office/drawing/2016/5/14/chartex" xmlns:mc="http://schemas.openxmlformats.org/markup-compatibility/2006" xmlns:aink="http://schemas.microsoft.com/office/drawing/2016/ink" xmlns:am3d="http://schemas.microsoft.com/office/drawing/2017/model3d" xmlns:o="urn:schemas-microsoft-com:office:office" xmlns:r="http://schemas.openxmlformats.org/officeDocument/2006/relationships" xmlns:m="http://schemas.openxmlformats.org/officeDocument/2006/math" xmlns:v="urn:schemas-microsoft-com:vml" xmlns:wp14="http://schemas.microsoft.com/office/word/2010/wordprocessingDrawing" xmlns:wp="http://schemas.openxmlformats.org/drawingml/2006/wordprocessingDrawing" xmlns:w10="urn:schemas-microsoft-com:office:word" xmlns:w="http://schemas.openxmlformats.org/wordprocessingml/2006/main" xmlns:w14="http://schemas.microsoft.com/office/word/2010/wordml" xmlns:w15="http://schemas.microsoft.com/office/word/2012/wordml" xmlns:w16cex="http://schemas.microsoft.com/office/word/2018/wordml/cex" xmlns:w16cid="http://schemas.microsoft.com/office/word/2016/wordml/cid" xmlns:w16="http://schemas.microsoft.com/office/word/2018/wordml" xmlns:w16sdtdh="http://schemas.microsoft.com/office/word/2020/wordml/sdtdatahash" xmlns:w16se="http://schemas.microsoft.com/office/word/2015/wordml/symex" xmlns:wpg="http://schemas.microsoft.com/office/word/2010/wordprocessingGroup" xmlns:wpi="http://schemas.microsoft.com/office/word/2010/wordprocessingInk" xmlns:wne="http://schemas.microsoft.com/office/word/2006/wordml" xmlns:wps="http://schemas.microsoft.com/office/word/2010/wordprocessingShape" mc:Ignorable="w14 w15 w16se w16cid w16 w16cex w16sdtdh wp14">
   <w:p>
     <w:pPr>
       <w:pStyle w:val="Encabezado"/>
@@ -2330,8 +4456,121 @@
 </file>
 
 <file path=word/numbering.xml><?xml version="1.0" encoding="utf-8"?>
-<w:numbering xmlns:wpc="http://schemas.microsoft.com/office/word/2010/wordprocessingCanvas" xmlns:cx="http://schemas.microsoft.com/office/drawing/2014/chartex" xmlns:cx1="http://schemas.microsoft.com/office/drawing/2015/9/8/chartex" xmlns:cx2="http://schemas.microsoft.com/office/drawing/2015/10/21/chartex" xmlns:cx3="http://schemas.microsoft.com/office/drawing/2016/5/9/chartex" xmlns:cx4="http://schemas.microsoft.com/office/drawing/2016/5/10/chartex" xmlns:cx5="http://schemas.microsoft.com/office/drawing/2016/5/11/chartex" xmlns:cx6="http://schemas.microsoft.com/office/drawing/2016/5/12/chartex" xmlns:cx7="http://schemas.microsoft.com/office/drawing/2016/5/13/chartex" xmlns:cx8="http://schemas.microsoft.com/office/drawing/2016/5/14/chartex" xmlns:mc="http://schemas.openxmlformats.org/markup-compatibility/2006" xmlns:aink="http://schemas.microsoft.com/office/drawing/2016/ink" xmlns:am3d="http://schemas.microsoft.com/office/drawing/2017/model3d" xmlns:o="urn:schemas-microsoft-com:office:office" xmlns:oel="http://schemas.microsoft.com/office/2019/extlst" xmlns:r="http://schemas.openxmlformats.org/officeDocument/2006/relationships" xmlns:m="http://schemas.openxmlformats.org/officeDocument/2006/math" xmlns:v="urn:schemas-microsoft-com:vml" xmlns:wp14="http://schemas.microsoft.com/office/word/2010/wordprocessingDrawing" xmlns:wp="http://schemas.openxmlformats.org/drawingml/2006/wordprocessingDrawing" xmlns:w10="urn:schemas-microsoft-com:office:word" xmlns:w="http://schemas.openxmlformats.org/wordprocessingml/2006/main" xmlns:w14="http://schemas.microsoft.com/office/word/2010/wordml" xmlns:w15="http://schemas.microsoft.com/office/word/2012/wordml" xmlns:w16cex="http://schemas.microsoft.com/office/word/2018/wordml/cex" xmlns:w16cid="http://schemas.microsoft.com/office/word/2016/wordml/cid" xmlns:w16="http://schemas.microsoft.com/office/word/2018/wordml" xmlns:w16du="http://schemas.microsoft.com/office/word/2023/wordml/word16du" xmlns:w16sdtdh="http://schemas.microsoft.com/office/word/2020/wordml/sdtdatahash" xmlns:w16sdtfl="http://schemas.microsoft.com/office/word/2024/wordml/sdtformatlock" xmlns:w16se="http://schemas.microsoft.com/office/word/2015/wordml/symex" xmlns:wpg="http://schemas.microsoft.com/office/word/2010/wordprocessingGroup" xmlns:wpi="http://schemas.microsoft.com/office/word/2010/wordprocessingInk" xmlns:wne="http://schemas.microsoft.com/office/word/2006/wordml" xmlns:wps="http://schemas.microsoft.com/office/word/2010/wordprocessingShape" mc:Ignorable="w14 w15 w16se w16cid w16 w16cex w16sdtdh w16sdtfl w16du wp14">
+<w:numbering xmlns:wpc="http://schemas.microsoft.com/office/word/2010/wordprocessingCanvas" xmlns:cx="http://schemas.microsoft.com/office/drawing/2014/chartex" xmlns:cx1="http://schemas.microsoft.com/office/drawing/2015/9/8/chartex" xmlns:cx2="http://schemas.microsoft.com/office/drawing/2015/10/21/chartex" xmlns:cx3="http://schemas.microsoft.com/office/drawing/2016/5/9/chartex" xmlns:cx4="http://schemas.microsoft.com/office/drawing/2016/5/10/chartex" xmlns:cx5="http://schemas.microsoft.com/office/drawing/2016/5/11/chartex" xmlns:cx6="http://schemas.microsoft.com/office/drawing/2016/5/12/chartex" xmlns:cx7="http://schemas.microsoft.com/office/drawing/2016/5/13/chartex" xmlns:cx8="http://schemas.microsoft.com/office/drawing/2016/5/14/chartex" xmlns:mc="http://schemas.openxmlformats.org/markup-compatibility/2006" xmlns:aink="http://schemas.microsoft.com/office/drawing/2016/ink" xmlns:am3d="http://schemas.microsoft.com/office/drawing/2017/model3d" xmlns:o="urn:schemas-microsoft-com:office:office" xmlns:r="http://schemas.openxmlformats.org/officeDocument/2006/relationships" xmlns:m="http://schemas.openxmlformats.org/officeDocument/2006/math" xmlns:v="urn:schemas-microsoft-com:vml" xmlns:wp14="http://schemas.microsoft.com/office/word/2010/wordprocessingDrawing" xmlns:wp="http://schemas.openxmlformats.org/drawingml/2006/wordprocessingDrawing" xmlns:w10="urn:schemas-microsoft-com:office:word" xmlns:w="http://schemas.openxmlformats.org/wordprocessingml/2006/main" xmlns:w14="http://schemas.microsoft.com/office/word/2010/wordml" xmlns:w15="http://schemas.microsoft.com/office/word/2012/wordml" xmlns:w16cex="http://schemas.microsoft.com/office/word/2018/wordml/cex" xmlns:w16cid="http://schemas.microsoft.com/office/word/2016/wordml/cid" xmlns:w16="http://schemas.microsoft.com/office/word/2018/wordml" xmlns:w16sdtdh="http://schemas.microsoft.com/office/word/2020/wordml/sdtdatahash" xmlns:w16se="http://schemas.microsoft.com/office/word/2015/wordml/symex" xmlns:wpg="http://schemas.microsoft.com/office/word/2010/wordprocessingGroup" xmlns:wpi="http://schemas.microsoft.com/office/word/2010/wordprocessingInk" xmlns:wne="http://schemas.microsoft.com/office/word/2006/wordml" xmlns:wps="http://schemas.microsoft.com/office/word/2010/wordprocessingShape" mc:Ignorable="w14 w15 w16se w16cid w16 w16cex w16sdtdh wp14">
   <w:abstractNum w:abstractNumId="0" w15:restartNumberingAfterBreak="0">
+    <w:nsid w:val="032E3B10"/>
+    <w:multiLevelType w:val="hybridMultilevel"/>
+    <w:tmpl w:val="1444BE7A"/>
+    <w:lvl w:ilvl="0" w:tplc="340A0001">
+      <w:start w:val="1"/>
+      <w:numFmt w:val="bullet"/>
+      <w:lvlText w:val=""/>
+      <w:lvlJc w:val="left"/>
+      <w:pPr>
+        <w:ind w:left="720" w:hanging="360"/>
+      </w:pPr>
+      <w:rPr>
+        <w:rFonts w:ascii="Symbol" w:hAnsi="Symbol" w:hint="default"/>
+      </w:rPr>
+    </w:lvl>
+    <w:lvl w:ilvl="1" w:tplc="340A0003" w:tentative="1">
+      <w:start w:val="1"/>
+      <w:numFmt w:val="bullet"/>
+      <w:lvlText w:val="o"/>
+      <w:lvlJc w:val="left"/>
+      <w:pPr>
+        <w:ind w:left="1440" w:hanging="360"/>
+      </w:pPr>
+      <w:rPr>
+        <w:rFonts w:ascii="Courier New" w:hAnsi="Courier New" w:cs="Courier New" w:hint="default"/>
+      </w:rPr>
+    </w:lvl>
+    <w:lvl w:ilvl="2" w:tplc="340A0005" w:tentative="1">
+      <w:start w:val="1"/>
+      <w:numFmt w:val="bullet"/>
+      <w:lvlText w:val=""/>
+      <w:lvlJc w:val="left"/>
+      <w:pPr>
+        <w:ind w:left="2160" w:hanging="360"/>
+      </w:pPr>
+      <w:rPr>
+        <w:rFonts w:ascii="Wingdings" w:hAnsi="Wingdings" w:hint="default"/>
+      </w:rPr>
+    </w:lvl>
+    <w:lvl w:ilvl="3" w:tplc="340A0001" w:tentative="1">
+      <w:start w:val="1"/>
+      <w:numFmt w:val="bullet"/>
+      <w:lvlText w:val=""/>
+      <w:lvlJc w:val="left"/>
+      <w:pPr>
+        <w:ind w:left="2880" w:hanging="360"/>
+      </w:pPr>
+      <w:rPr>
+        <w:rFonts w:ascii="Symbol" w:hAnsi="Symbol" w:hint="default"/>
+      </w:rPr>
+    </w:lvl>
+    <w:lvl w:ilvl="4" w:tplc="340A0003" w:tentative="1">
+      <w:start w:val="1"/>
+      <w:numFmt w:val="bullet"/>
+      <w:lvlText w:val="o"/>
+      <w:lvlJc w:val="left"/>
+      <w:pPr>
+        <w:ind w:left="3600" w:hanging="360"/>
+      </w:pPr>
+      <w:rPr>
+        <w:rFonts w:ascii="Courier New" w:hAnsi="Courier New" w:cs="Courier New" w:hint="default"/>
+      </w:rPr>
+    </w:lvl>
+    <w:lvl w:ilvl="5" w:tplc="340A0005" w:tentative="1">
+      <w:start w:val="1"/>
+      <w:numFmt w:val="bullet"/>
+      <w:lvlText w:val=""/>
+      <w:lvlJc w:val="left"/>
+      <w:pPr>
+        <w:ind w:left="4320" w:hanging="360"/>
+      </w:pPr>
+      <w:rPr>
+        <w:rFonts w:ascii="Wingdings" w:hAnsi="Wingdings" w:hint="default"/>
+      </w:rPr>
+    </w:lvl>
+    <w:lvl w:ilvl="6" w:tplc="340A0001" w:tentative="1">
+      <w:start w:val="1"/>
+      <w:numFmt w:val="bullet"/>
+      <w:lvlText w:val=""/>
+      <w:lvlJc w:val="left"/>
+      <w:pPr>
+        <w:ind w:left="5040" w:hanging="360"/>
+      </w:pPr>
+      <w:rPr>
+        <w:rFonts w:ascii="Symbol" w:hAnsi="Symbol" w:hint="default"/>
+      </w:rPr>
+    </w:lvl>
+    <w:lvl w:ilvl="7" w:tplc="340A0003" w:tentative="1">
+      <w:start w:val="1"/>
+      <w:numFmt w:val="bullet"/>
+      <w:lvlText w:val="o"/>
+      <w:lvlJc w:val="left"/>
+      <w:pPr>
+        <w:ind w:left="5760" w:hanging="360"/>
+      </w:pPr>
+      <w:rPr>
+        <w:rFonts w:ascii="Courier New" w:hAnsi="Courier New" w:cs="Courier New" w:hint="default"/>
+      </w:rPr>
+    </w:lvl>
+    <w:lvl w:ilvl="8" w:tplc="340A0005" w:tentative="1">
+      <w:start w:val="1"/>
+      <w:numFmt w:val="bullet"/>
+      <w:lvlText w:val=""/>
+      <w:lvlJc w:val="left"/>
+      <w:pPr>
+        <w:ind w:left="6480" w:hanging="360"/>
+      </w:pPr>
+      <w:rPr>
+        <w:rFonts w:ascii="Wingdings" w:hAnsi="Wingdings" w:hint="default"/>
+      </w:rPr>
+    </w:lvl>
+  </w:abstractNum>
+  <w:abstractNum w:abstractNumId="1" w15:restartNumberingAfterBreak="0">
     <w:nsid w:val="042A6B37"/>
     <w:multiLevelType w:val="hybridMultilevel"/>
     <w:tmpl w:val="16C834E8"/>
@@ -2417,7 +4656,7 @@
       </w:pPr>
     </w:lvl>
   </w:abstractNum>
-  <w:abstractNum w:abstractNumId="1" w15:restartNumberingAfterBreak="0">
+  <w:abstractNum w:abstractNumId="2" w15:restartNumberingAfterBreak="0">
     <w:nsid w:val="064542F6"/>
     <w:multiLevelType w:val="hybridMultilevel"/>
     <w:tmpl w:val="F4340976"/>
@@ -2506,7 +4745,120 @@
       </w:pPr>
     </w:lvl>
   </w:abstractNum>
-  <w:abstractNum w:abstractNumId="2" w15:restartNumberingAfterBreak="0">
+  <w:abstractNum w:abstractNumId="3" w15:restartNumberingAfterBreak="0">
+    <w:nsid w:val="0667528D"/>
+    <w:multiLevelType w:val="hybridMultilevel"/>
+    <w:tmpl w:val="5CF6C8F8"/>
+    <w:lvl w:ilvl="0" w:tplc="340A0001">
+      <w:start w:val="1"/>
+      <w:numFmt w:val="bullet"/>
+      <w:lvlText w:val=""/>
+      <w:lvlJc w:val="left"/>
+      <w:pPr>
+        <w:ind w:left="720" w:hanging="360"/>
+      </w:pPr>
+      <w:rPr>
+        <w:rFonts w:ascii="Symbol" w:hAnsi="Symbol" w:hint="default"/>
+      </w:rPr>
+    </w:lvl>
+    <w:lvl w:ilvl="1" w:tplc="340A0003" w:tentative="1">
+      <w:start w:val="1"/>
+      <w:numFmt w:val="bullet"/>
+      <w:lvlText w:val="o"/>
+      <w:lvlJc w:val="left"/>
+      <w:pPr>
+        <w:ind w:left="1440" w:hanging="360"/>
+      </w:pPr>
+      <w:rPr>
+        <w:rFonts w:ascii="Courier New" w:hAnsi="Courier New" w:cs="Courier New" w:hint="default"/>
+      </w:rPr>
+    </w:lvl>
+    <w:lvl w:ilvl="2" w:tplc="340A0005" w:tentative="1">
+      <w:start w:val="1"/>
+      <w:numFmt w:val="bullet"/>
+      <w:lvlText w:val=""/>
+      <w:lvlJc w:val="left"/>
+      <w:pPr>
+        <w:ind w:left="2160" w:hanging="360"/>
+      </w:pPr>
+      <w:rPr>
+        <w:rFonts w:ascii="Wingdings" w:hAnsi="Wingdings" w:hint="default"/>
+      </w:rPr>
+    </w:lvl>
+    <w:lvl w:ilvl="3" w:tplc="340A0001" w:tentative="1">
+      <w:start w:val="1"/>
+      <w:numFmt w:val="bullet"/>
+      <w:lvlText w:val=""/>
+      <w:lvlJc w:val="left"/>
+      <w:pPr>
+        <w:ind w:left="2880" w:hanging="360"/>
+      </w:pPr>
+      <w:rPr>
+        <w:rFonts w:ascii="Symbol" w:hAnsi="Symbol" w:hint="default"/>
+      </w:rPr>
+    </w:lvl>
+    <w:lvl w:ilvl="4" w:tplc="340A0003" w:tentative="1">
+      <w:start w:val="1"/>
+      <w:numFmt w:val="bullet"/>
+      <w:lvlText w:val="o"/>
+      <w:lvlJc w:val="left"/>
+      <w:pPr>
+        <w:ind w:left="3600" w:hanging="360"/>
+      </w:pPr>
+      <w:rPr>
+        <w:rFonts w:ascii="Courier New" w:hAnsi="Courier New" w:cs="Courier New" w:hint="default"/>
+      </w:rPr>
+    </w:lvl>
+    <w:lvl w:ilvl="5" w:tplc="340A0005" w:tentative="1">
+      <w:start w:val="1"/>
+      <w:numFmt w:val="bullet"/>
+      <w:lvlText w:val=""/>
+      <w:lvlJc w:val="left"/>
+      <w:pPr>
+        <w:ind w:left="4320" w:hanging="360"/>
+      </w:pPr>
+      <w:rPr>
+        <w:rFonts w:ascii="Wingdings" w:hAnsi="Wingdings" w:hint="default"/>
+      </w:rPr>
+    </w:lvl>
+    <w:lvl w:ilvl="6" w:tplc="340A0001" w:tentative="1">
+      <w:start w:val="1"/>
+      <w:numFmt w:val="bullet"/>
+      <w:lvlText w:val=""/>
+      <w:lvlJc w:val="left"/>
+      <w:pPr>
+        <w:ind w:left="5040" w:hanging="360"/>
+      </w:pPr>
+      <w:rPr>
+        <w:rFonts w:ascii="Symbol" w:hAnsi="Symbol" w:hint="default"/>
+      </w:rPr>
+    </w:lvl>
+    <w:lvl w:ilvl="7" w:tplc="340A0003" w:tentative="1">
+      <w:start w:val="1"/>
+      <w:numFmt w:val="bullet"/>
+      <w:lvlText w:val="o"/>
+      <w:lvlJc w:val="left"/>
+      <w:pPr>
+        <w:ind w:left="5760" w:hanging="360"/>
+      </w:pPr>
+      <w:rPr>
+        <w:rFonts w:ascii="Courier New" w:hAnsi="Courier New" w:cs="Courier New" w:hint="default"/>
+      </w:rPr>
+    </w:lvl>
+    <w:lvl w:ilvl="8" w:tplc="340A0005" w:tentative="1">
+      <w:start w:val="1"/>
+      <w:numFmt w:val="bullet"/>
+      <w:lvlText w:val=""/>
+      <w:lvlJc w:val="left"/>
+      <w:pPr>
+        <w:ind w:left="6480" w:hanging="360"/>
+      </w:pPr>
+      <w:rPr>
+        <w:rFonts w:ascii="Wingdings" w:hAnsi="Wingdings" w:hint="default"/>
+      </w:rPr>
+    </w:lvl>
+  </w:abstractNum>
+  <w:abstractNum w:abstractNumId="4" w15:restartNumberingAfterBreak="0">
     <w:nsid w:val="07DC2BA5"/>
     <w:multiLevelType w:val="hybridMultilevel"/>
     <w:tmpl w:val="17601596"/>
@@ -2619,7 +4971,7 @@
       </w:rPr>
     </w:lvl>
   </w:abstractNum>
-  <w:abstractNum w:abstractNumId="3" w15:restartNumberingAfterBreak="0">
+  <w:abstractNum w:abstractNumId="5" w15:restartNumberingAfterBreak="0">
     <w:nsid w:val="0BDB7FA6"/>
     <w:multiLevelType w:val="multilevel"/>
     <w:tmpl w:val="9F782758"/>
@@ -2768,7 +5120,7 @@
       </w:rPr>
     </w:lvl>
   </w:abstractNum>
-  <w:abstractNum w:abstractNumId="4" w15:restartNumberingAfterBreak="0">
+  <w:abstractNum w:abstractNumId="6" w15:restartNumberingAfterBreak="0">
     <w:nsid w:val="0E092840"/>
     <w:multiLevelType w:val="hybridMultilevel"/>
     <w:tmpl w:val="9A0669F2"/>
@@ -2854,7 +5206,120 @@
       </w:pPr>
     </w:lvl>
   </w:abstractNum>
-  <w:abstractNum w:abstractNumId="5" w15:restartNumberingAfterBreak="0">
+  <w:abstractNum w:abstractNumId="7" w15:restartNumberingAfterBreak="0">
+    <w:nsid w:val="1A3A53D0"/>
+    <w:multiLevelType w:val="hybridMultilevel"/>
+    <w:tmpl w:val="406E4912"/>
+    <w:lvl w:ilvl="0" w:tplc="340A0001">
+      <w:start w:val="1"/>
+      <w:numFmt w:val="bullet"/>
+      <w:lvlText w:val=""/>
+      <w:lvlJc w:val="left"/>
+      <w:pPr>
+        <w:ind w:left="720" w:hanging="360"/>
+      </w:pPr>
+      <w:rPr>
+        <w:rFonts w:ascii="Symbol" w:hAnsi="Symbol" w:hint="default"/>
+      </w:rPr>
+    </w:lvl>
+    <w:lvl w:ilvl="1" w:tplc="340A0003" w:tentative="1">
+      <w:start w:val="1"/>
+      <w:numFmt w:val="bullet"/>
+      <w:lvlText w:val="o"/>
+      <w:lvlJc w:val="left"/>
+      <w:pPr>
+        <w:ind w:left="1440" w:hanging="360"/>
+      </w:pPr>
+      <w:rPr>
+        <w:rFonts w:ascii="Courier New" w:hAnsi="Courier New" w:cs="Courier New" w:hint="default"/>
+      </w:rPr>
+    </w:lvl>
+    <w:lvl w:ilvl="2" w:tplc="340A0005" w:tentative="1">
+      <w:start w:val="1"/>
+      <w:numFmt w:val="bullet"/>
+      <w:lvlText w:val=""/>
+      <w:lvlJc w:val="left"/>
+      <w:pPr>
+        <w:ind w:left="2160" w:hanging="360"/>
+      </w:pPr>
+      <w:rPr>
+        <w:rFonts w:ascii="Wingdings" w:hAnsi="Wingdings" w:hint="default"/>
+      </w:rPr>
+    </w:lvl>
+    <w:lvl w:ilvl="3" w:tplc="340A0001" w:tentative="1">
+      <w:start w:val="1"/>
+      <w:numFmt w:val="bullet"/>
+      <w:lvlText w:val=""/>
+      <w:lvlJc w:val="left"/>
+      <w:pPr>
+        <w:ind w:left="2880" w:hanging="360"/>
+      </w:pPr>
+      <w:rPr>
+        <w:rFonts w:ascii="Symbol" w:hAnsi="Symbol" w:hint="default"/>
+      </w:rPr>
+    </w:lvl>
+    <w:lvl w:ilvl="4" w:tplc="340A0003" w:tentative="1">
+      <w:start w:val="1"/>
+      <w:numFmt w:val="bullet"/>
+      <w:lvlText w:val="o"/>
+      <w:lvlJc w:val="left"/>
+      <w:pPr>
+        <w:ind w:left="3600" w:hanging="360"/>
+      </w:pPr>
+      <w:rPr>
+        <w:rFonts w:ascii="Courier New" w:hAnsi="Courier New" w:cs="Courier New" w:hint="default"/>
+      </w:rPr>
+    </w:lvl>
+    <w:lvl w:ilvl="5" w:tplc="340A0005" w:tentative="1">
+      <w:start w:val="1"/>
+      <w:numFmt w:val="bullet"/>
+      <w:lvlText w:val=""/>
+      <w:lvlJc w:val="left"/>
+      <w:pPr>
+        <w:ind w:left="4320" w:hanging="360"/>
+      </w:pPr>
+      <w:rPr>
+        <w:rFonts w:ascii="Wingdings" w:hAnsi="Wingdings" w:hint="default"/>
+      </w:rPr>
+    </w:lvl>
+    <w:lvl w:ilvl="6" w:tplc="340A0001" w:tentative="1">
+      <w:start w:val="1"/>
+      <w:numFmt w:val="bullet"/>
+      <w:lvlText w:val=""/>
+      <w:lvlJc w:val="left"/>
+      <w:pPr>
+        <w:ind w:left="5040" w:hanging="360"/>
+      </w:pPr>
+      <w:rPr>
+        <w:rFonts w:ascii="Symbol" w:hAnsi="Symbol" w:hint="default"/>
+      </w:rPr>
+    </w:lvl>
+    <w:lvl w:ilvl="7" w:tplc="340A0003" w:tentative="1">
+      <w:start w:val="1"/>
+      <w:numFmt w:val="bullet"/>
+      <w:lvlText w:val="o"/>
+      <w:lvlJc w:val="left"/>
+      <w:pPr>
+        <w:ind w:left="5760" w:hanging="360"/>
+      </w:pPr>
+      <w:rPr>
+        <w:rFonts w:ascii="Courier New" w:hAnsi="Courier New" w:cs="Courier New" w:hint="default"/>
+      </w:rPr>
+    </w:lvl>
+    <w:lvl w:ilvl="8" w:tplc="340A0005" w:tentative="1">
+      <w:start w:val="1"/>
+      <w:numFmt w:val="bullet"/>
+      <w:lvlText w:val=""/>
+      <w:lvlJc w:val="left"/>
+      <w:pPr>
+        <w:ind w:left="6480" w:hanging="360"/>
+      </w:pPr>
+      <w:rPr>
+        <w:rFonts w:ascii="Wingdings" w:hAnsi="Wingdings" w:hint="default"/>
+      </w:rPr>
+    </w:lvl>
+  </w:abstractNum>
+  <w:abstractNum w:abstractNumId="8" w15:restartNumberingAfterBreak="0">
     <w:nsid w:val="1A8520B2"/>
     <w:multiLevelType w:val="multilevel"/>
     <w:tmpl w:val="232A4AFE"/>
@@ -3003,7 +5468,7 @@
       </w:rPr>
     </w:lvl>
   </w:abstractNum>
-  <w:abstractNum w:abstractNumId="6" w15:restartNumberingAfterBreak="0">
+  <w:abstractNum w:abstractNumId="9" w15:restartNumberingAfterBreak="0">
     <w:nsid w:val="1AB1225A"/>
     <w:multiLevelType w:val="hybridMultilevel"/>
     <w:tmpl w:val="CCE60C5A"/>
@@ -3092,7 +5557,7 @@
       </w:pPr>
     </w:lvl>
   </w:abstractNum>
-  <w:abstractNum w:abstractNumId="7" w15:restartNumberingAfterBreak="0">
+  <w:abstractNum w:abstractNumId="10" w15:restartNumberingAfterBreak="0">
     <w:nsid w:val="1CCF70E6"/>
     <w:multiLevelType w:val="multilevel"/>
     <w:tmpl w:val="F914415C"/>
@@ -3241,7 +5706,7 @@
       </w:rPr>
     </w:lvl>
   </w:abstractNum>
-  <w:abstractNum w:abstractNumId="8" w15:restartNumberingAfterBreak="0">
+  <w:abstractNum w:abstractNumId="11" w15:restartNumberingAfterBreak="0">
     <w:nsid w:val="1E9A2C69"/>
     <w:multiLevelType w:val="hybridMultilevel"/>
     <w:tmpl w:val="E70AFA4C"/>
@@ -3354,7 +5819,7 @@
       </w:rPr>
     </w:lvl>
   </w:abstractNum>
-  <w:abstractNum w:abstractNumId="9" w15:restartNumberingAfterBreak="0">
+  <w:abstractNum w:abstractNumId="12" w15:restartNumberingAfterBreak="0">
     <w:nsid w:val="22607C1F"/>
     <w:multiLevelType w:val="multilevel"/>
     <w:tmpl w:val="DE0C31B0"/>
@@ -3475,7 +5940,7 @@
       </w:rPr>
     </w:lvl>
   </w:abstractNum>
-  <w:abstractNum w:abstractNumId="10" w15:restartNumberingAfterBreak="0">
+  <w:abstractNum w:abstractNumId="13" w15:restartNumberingAfterBreak="0">
     <w:nsid w:val="273F5792"/>
     <w:multiLevelType w:val="hybridMultilevel"/>
     <w:tmpl w:val="A706FB68"/>
@@ -3588,7 +6053,7 @@
       </w:rPr>
     </w:lvl>
   </w:abstractNum>
-  <w:abstractNum w:abstractNumId="11" w15:restartNumberingAfterBreak="0">
+  <w:abstractNum w:abstractNumId="14" w15:restartNumberingAfterBreak="0">
     <w:nsid w:val="27AE77F4"/>
     <w:multiLevelType w:val="hybridMultilevel"/>
     <w:tmpl w:val="43404632"/>
@@ -3701,7 +6166,7 @@
       </w:rPr>
     </w:lvl>
   </w:abstractNum>
-  <w:abstractNum w:abstractNumId="12" w15:restartNumberingAfterBreak="0">
+  <w:abstractNum w:abstractNumId="15" w15:restartNumberingAfterBreak="0">
     <w:nsid w:val="28410F07"/>
     <w:multiLevelType w:val="hybridMultilevel"/>
     <w:tmpl w:val="2D349498"/>
@@ -3790,7 +6255,120 @@
       </w:pPr>
     </w:lvl>
   </w:abstractNum>
-  <w:abstractNum w:abstractNumId="13" w15:restartNumberingAfterBreak="0">
+  <w:abstractNum w:abstractNumId="16" w15:restartNumberingAfterBreak="0">
+    <w:nsid w:val="300604F6"/>
+    <w:multiLevelType w:val="hybridMultilevel"/>
+    <w:tmpl w:val="0B92308C"/>
+    <w:lvl w:ilvl="0" w:tplc="340A0001">
+      <w:start w:val="1"/>
+      <w:numFmt w:val="bullet"/>
+      <w:lvlText w:val=""/>
+      <w:lvlJc w:val="left"/>
+      <w:pPr>
+        <w:ind w:left="720" w:hanging="360"/>
+      </w:pPr>
+      <w:rPr>
+        <w:rFonts w:ascii="Symbol" w:hAnsi="Symbol" w:hint="default"/>
+      </w:rPr>
+    </w:lvl>
+    <w:lvl w:ilvl="1" w:tplc="340A0003" w:tentative="1">
+      <w:start w:val="1"/>
+      <w:numFmt w:val="bullet"/>
+      <w:lvlText w:val="o"/>
+      <w:lvlJc w:val="left"/>
+      <w:pPr>
+        <w:ind w:left="1440" w:hanging="360"/>
+      </w:pPr>
+      <w:rPr>
+        <w:rFonts w:ascii="Courier New" w:hAnsi="Courier New" w:cs="Courier New" w:hint="default"/>
+      </w:rPr>
+    </w:lvl>
+    <w:lvl w:ilvl="2" w:tplc="340A0005" w:tentative="1">
+      <w:start w:val="1"/>
+      <w:numFmt w:val="bullet"/>
+      <w:lvlText w:val=""/>
+      <w:lvlJc w:val="left"/>
+      <w:pPr>
+        <w:ind w:left="2160" w:hanging="360"/>
+      </w:pPr>
+      <w:rPr>
+        <w:rFonts w:ascii="Wingdings" w:hAnsi="Wingdings" w:hint="default"/>
+      </w:rPr>
+    </w:lvl>
+    <w:lvl w:ilvl="3" w:tplc="340A0001" w:tentative="1">
+      <w:start w:val="1"/>
+      <w:numFmt w:val="bullet"/>
+      <w:lvlText w:val=""/>
+      <w:lvlJc w:val="left"/>
+      <w:pPr>
+        <w:ind w:left="2880" w:hanging="360"/>
+      </w:pPr>
+      <w:rPr>
+        <w:rFonts w:ascii="Symbol" w:hAnsi="Symbol" w:hint="default"/>
+      </w:rPr>
+    </w:lvl>
+    <w:lvl w:ilvl="4" w:tplc="340A0003" w:tentative="1">
+      <w:start w:val="1"/>
+      <w:numFmt w:val="bullet"/>
+      <w:lvlText w:val="o"/>
+      <w:lvlJc w:val="left"/>
+      <w:pPr>
+        <w:ind w:left="3600" w:hanging="360"/>
+      </w:pPr>
+      <w:rPr>
+        <w:rFonts w:ascii="Courier New" w:hAnsi="Courier New" w:cs="Courier New" w:hint="default"/>
+      </w:rPr>
+    </w:lvl>
+    <w:lvl w:ilvl="5" w:tplc="340A0005" w:tentative="1">
+      <w:start w:val="1"/>
+      <w:numFmt w:val="bullet"/>
+      <w:lvlText w:val=""/>
+      <w:lvlJc w:val="left"/>
+      <w:pPr>
+        <w:ind w:left="4320" w:hanging="360"/>
+      </w:pPr>
+      <w:rPr>
+        <w:rFonts w:ascii="Wingdings" w:hAnsi="Wingdings" w:hint="default"/>
+      </w:rPr>
+    </w:lvl>
+    <w:lvl w:ilvl="6" w:tplc="340A0001" w:tentative="1">
+      <w:start w:val="1"/>
+      <w:numFmt w:val="bullet"/>
+      <w:lvlText w:val=""/>
+      <w:lvlJc w:val="left"/>
+      <w:pPr>
+        <w:ind w:left="5040" w:hanging="360"/>
+      </w:pPr>
+      <w:rPr>
+        <w:rFonts w:ascii="Symbol" w:hAnsi="Symbol" w:hint="default"/>
+      </w:rPr>
+    </w:lvl>
+    <w:lvl w:ilvl="7" w:tplc="340A0003" w:tentative="1">
+      <w:start w:val="1"/>
+      <w:numFmt w:val="bullet"/>
+      <w:lvlText w:val="o"/>
+      <w:lvlJc w:val="left"/>
+      <w:pPr>
+        <w:ind w:left="5760" w:hanging="360"/>
+      </w:pPr>
+      <w:rPr>
+        <w:rFonts w:ascii="Courier New" w:hAnsi="Courier New" w:cs="Courier New" w:hint="default"/>
+      </w:rPr>
+    </w:lvl>
+    <w:lvl w:ilvl="8" w:tplc="340A0005" w:tentative="1">
+      <w:start w:val="1"/>
+      <w:numFmt w:val="bullet"/>
+      <w:lvlText w:val=""/>
+      <w:lvlJc w:val="left"/>
+      <w:pPr>
+        <w:ind w:left="6480" w:hanging="360"/>
+      </w:pPr>
+      <w:rPr>
+        <w:rFonts w:ascii="Wingdings" w:hAnsi="Wingdings" w:hint="default"/>
+      </w:rPr>
+    </w:lvl>
+  </w:abstractNum>
+  <w:abstractNum w:abstractNumId="17" w15:restartNumberingAfterBreak="0">
     <w:nsid w:val="368122D0"/>
     <w:multiLevelType w:val="multilevel"/>
     <w:tmpl w:val="7D385504"/>
@@ -3939,7 +6517,7 @@
       </w:rPr>
     </w:lvl>
   </w:abstractNum>
-  <w:abstractNum w:abstractNumId="14" w15:restartNumberingAfterBreak="0">
+  <w:abstractNum w:abstractNumId="18" w15:restartNumberingAfterBreak="0">
     <w:nsid w:val="3D937DFF"/>
     <w:multiLevelType w:val="hybridMultilevel"/>
     <w:tmpl w:val="FF66B06C"/>
@@ -4052,7 +6630,7 @@
       </w:rPr>
     </w:lvl>
   </w:abstractNum>
-  <w:abstractNum w:abstractNumId="15" w15:restartNumberingAfterBreak="0">
+  <w:abstractNum w:abstractNumId="19" w15:restartNumberingAfterBreak="0">
     <w:nsid w:val="45D12BE1"/>
     <w:multiLevelType w:val="hybridMultilevel"/>
     <w:tmpl w:val="44B2ED9C"/>
@@ -4165,7 +6743,7 @@
       </w:rPr>
     </w:lvl>
   </w:abstractNum>
-  <w:abstractNum w:abstractNumId="16" w15:restartNumberingAfterBreak="0">
+  <w:abstractNum w:abstractNumId="20" w15:restartNumberingAfterBreak="0">
     <w:nsid w:val="45DB1F84"/>
     <w:multiLevelType w:val="hybridMultilevel"/>
     <w:tmpl w:val="7CF2EF4E"/>
@@ -4251,7 +6829,7 @@
       </w:pPr>
     </w:lvl>
   </w:abstractNum>
-  <w:abstractNum w:abstractNumId="17" w15:restartNumberingAfterBreak="0">
+  <w:abstractNum w:abstractNumId="21" w15:restartNumberingAfterBreak="0">
     <w:nsid w:val="480E1741"/>
     <w:multiLevelType w:val="multilevel"/>
     <w:tmpl w:val="8D3A7A18"/>
@@ -4400,7 +6978,7 @@
       </w:rPr>
     </w:lvl>
   </w:abstractNum>
-  <w:abstractNum w:abstractNumId="18" w15:restartNumberingAfterBreak="0">
+  <w:abstractNum w:abstractNumId="22" w15:restartNumberingAfterBreak="0">
     <w:nsid w:val="4FCA426E"/>
     <w:multiLevelType w:val="hybridMultilevel"/>
     <w:tmpl w:val="95880A32"/>
@@ -4513,7 +7091,120 @@
       </w:rPr>
     </w:lvl>
   </w:abstractNum>
-  <w:abstractNum w:abstractNumId="19" w15:restartNumberingAfterBreak="0">
+  <w:abstractNum w:abstractNumId="23" w15:restartNumberingAfterBreak="0">
+    <w:nsid w:val="4FD7202A"/>
+    <w:multiLevelType w:val="hybridMultilevel"/>
+    <w:tmpl w:val="26562920"/>
+    <w:lvl w:ilvl="0" w:tplc="340A0001">
+      <w:start w:val="1"/>
+      <w:numFmt w:val="bullet"/>
+      <w:lvlText w:val=""/>
+      <w:lvlJc w:val="left"/>
+      <w:pPr>
+        <w:ind w:left="720" w:hanging="360"/>
+      </w:pPr>
+      <w:rPr>
+        <w:rFonts w:ascii="Symbol" w:hAnsi="Symbol" w:hint="default"/>
+      </w:rPr>
+    </w:lvl>
+    <w:lvl w:ilvl="1" w:tplc="340A0003" w:tentative="1">
+      <w:start w:val="1"/>
+      <w:numFmt w:val="bullet"/>
+      <w:lvlText w:val="o"/>
+      <w:lvlJc w:val="left"/>
+      <w:pPr>
+        <w:ind w:left="1440" w:hanging="360"/>
+      </w:pPr>
+      <w:rPr>
+        <w:rFonts w:ascii="Courier New" w:hAnsi="Courier New" w:cs="Courier New" w:hint="default"/>
+      </w:rPr>
+    </w:lvl>
+    <w:lvl w:ilvl="2" w:tplc="340A0005" w:tentative="1">
+      <w:start w:val="1"/>
+      <w:numFmt w:val="bullet"/>
+      <w:lvlText w:val=""/>
+      <w:lvlJc w:val="left"/>
+      <w:pPr>
+        <w:ind w:left="2160" w:hanging="360"/>
+      </w:pPr>
+      <w:rPr>
+        <w:rFonts w:ascii="Wingdings" w:hAnsi="Wingdings" w:hint="default"/>
+      </w:rPr>
+    </w:lvl>
+    <w:lvl w:ilvl="3" w:tplc="340A0001" w:tentative="1">
+      <w:start w:val="1"/>
+      <w:numFmt w:val="bullet"/>
+      <w:lvlText w:val=""/>
+      <w:lvlJc w:val="left"/>
+      <w:pPr>
+        <w:ind w:left="2880" w:hanging="360"/>
+      </w:pPr>
+      <w:rPr>
+        <w:rFonts w:ascii="Symbol" w:hAnsi="Symbol" w:hint="default"/>
+      </w:rPr>
+    </w:lvl>
+    <w:lvl w:ilvl="4" w:tplc="340A0003" w:tentative="1">
+      <w:start w:val="1"/>
+      <w:numFmt w:val="bullet"/>
+      <w:lvlText w:val="o"/>
+      <w:lvlJc w:val="left"/>
+      <w:pPr>
+        <w:ind w:left="3600" w:hanging="360"/>
+      </w:pPr>
+      <w:rPr>
+        <w:rFonts w:ascii="Courier New" w:hAnsi="Courier New" w:cs="Courier New" w:hint="default"/>
+      </w:rPr>
+    </w:lvl>
+    <w:lvl w:ilvl="5" w:tplc="340A0005" w:tentative="1">
+      <w:start w:val="1"/>
+      <w:numFmt w:val="bullet"/>
+      <w:lvlText w:val=""/>
+      <w:lvlJc w:val="left"/>
+      <w:pPr>
+        <w:ind w:left="4320" w:hanging="360"/>
+      </w:pPr>
+      <w:rPr>
+        <w:rFonts w:ascii="Wingdings" w:hAnsi="Wingdings" w:hint="default"/>
+      </w:rPr>
+    </w:lvl>
+    <w:lvl w:ilvl="6" w:tplc="340A0001" w:tentative="1">
+      <w:start w:val="1"/>
+      <w:numFmt w:val="bullet"/>
+      <w:lvlText w:val=""/>
+      <w:lvlJc w:val="left"/>
+      <w:pPr>
+        <w:ind w:left="5040" w:hanging="360"/>
+      </w:pPr>
+      <w:rPr>
+        <w:rFonts w:ascii="Symbol" w:hAnsi="Symbol" w:hint="default"/>
+      </w:rPr>
+    </w:lvl>
+    <w:lvl w:ilvl="7" w:tplc="340A0003" w:tentative="1">
+      <w:start w:val="1"/>
+      <w:numFmt w:val="bullet"/>
+      <w:lvlText w:val="o"/>
+      <w:lvlJc w:val="left"/>
+      <w:pPr>
+        <w:ind w:left="5760" w:hanging="360"/>
+      </w:pPr>
+      <w:rPr>
+        <w:rFonts w:ascii="Courier New" w:hAnsi="Courier New" w:cs="Courier New" w:hint="default"/>
+      </w:rPr>
+    </w:lvl>
+    <w:lvl w:ilvl="8" w:tplc="340A0005" w:tentative="1">
+      <w:start w:val="1"/>
+      <w:numFmt w:val="bullet"/>
+      <w:lvlText w:val=""/>
+      <w:lvlJc w:val="left"/>
+      <w:pPr>
+        <w:ind w:left="6480" w:hanging="360"/>
+      </w:pPr>
+      <w:rPr>
+        <w:rFonts w:ascii="Wingdings" w:hAnsi="Wingdings" w:hint="default"/>
+      </w:rPr>
+    </w:lvl>
+  </w:abstractNum>
+  <w:abstractNum w:abstractNumId="24" w15:restartNumberingAfterBreak="0">
     <w:nsid w:val="52541E27"/>
     <w:multiLevelType w:val="hybridMultilevel"/>
     <w:tmpl w:val="05585B4E"/>
@@ -4602,7 +7293,7 @@
       </w:pPr>
     </w:lvl>
   </w:abstractNum>
-  <w:abstractNum w:abstractNumId="20" w15:restartNumberingAfterBreak="0">
+  <w:abstractNum w:abstractNumId="25" w15:restartNumberingAfterBreak="0">
     <w:nsid w:val="56E558E9"/>
     <w:multiLevelType w:val="hybridMultilevel"/>
     <w:tmpl w:val="72B4ECF0"/>
@@ -4715,7 +7406,7 @@
       </w:rPr>
     </w:lvl>
   </w:abstractNum>
-  <w:abstractNum w:abstractNumId="21" w15:restartNumberingAfterBreak="0">
+  <w:abstractNum w:abstractNumId="26" w15:restartNumberingAfterBreak="0">
     <w:nsid w:val="5B4952F3"/>
     <w:multiLevelType w:val="hybridMultilevel"/>
     <w:tmpl w:val="2B408F18"/>
@@ -4804,7 +7495,7 @@
       </w:pPr>
     </w:lvl>
   </w:abstractNum>
-  <w:abstractNum w:abstractNumId="22" w15:restartNumberingAfterBreak="0">
+  <w:abstractNum w:abstractNumId="27" w15:restartNumberingAfterBreak="0">
     <w:nsid w:val="5D9152D4"/>
     <w:multiLevelType w:val="hybridMultilevel"/>
     <w:tmpl w:val="B89495E4"/>
@@ -4917,7 +7608,7 @@
       </w:rPr>
     </w:lvl>
   </w:abstractNum>
-  <w:abstractNum w:abstractNumId="23" w15:restartNumberingAfterBreak="0">
+  <w:abstractNum w:abstractNumId="28" w15:restartNumberingAfterBreak="0">
     <w:nsid w:val="622C02EB"/>
     <w:multiLevelType w:val="hybridMultilevel"/>
     <w:tmpl w:val="3C4E0D66"/>
@@ -5030,7 +7721,7 @@
       </w:rPr>
     </w:lvl>
   </w:abstractNum>
-  <w:abstractNum w:abstractNumId="24" w15:restartNumberingAfterBreak="0">
+  <w:abstractNum w:abstractNumId="29" w15:restartNumberingAfterBreak="0">
     <w:nsid w:val="65BA6DC5"/>
     <w:multiLevelType w:val="hybridMultilevel"/>
     <w:tmpl w:val="BE0A0C50"/>
@@ -5143,7 +7834,7 @@
       </w:rPr>
     </w:lvl>
   </w:abstractNum>
-  <w:abstractNum w:abstractNumId="25" w15:restartNumberingAfterBreak="0">
+  <w:abstractNum w:abstractNumId="30" w15:restartNumberingAfterBreak="0">
     <w:nsid w:val="66DF51EF"/>
     <w:multiLevelType w:val="hybridMultilevel"/>
     <w:tmpl w:val="780E1FC6"/>
@@ -5232,7 +7923,120 @@
       </w:pPr>
     </w:lvl>
   </w:abstractNum>
-  <w:abstractNum w:abstractNumId="26" w15:restartNumberingAfterBreak="0">
+  <w:abstractNum w:abstractNumId="31" w15:restartNumberingAfterBreak="0">
+    <w:nsid w:val="670C0652"/>
+    <w:multiLevelType w:val="hybridMultilevel"/>
+    <w:tmpl w:val="5198908A"/>
+    <w:lvl w:ilvl="0" w:tplc="340A0001">
+      <w:start w:val="1"/>
+      <w:numFmt w:val="bullet"/>
+      <w:lvlText w:val=""/>
+      <w:lvlJc w:val="left"/>
+      <w:pPr>
+        <w:ind w:left="720" w:hanging="360"/>
+      </w:pPr>
+      <w:rPr>
+        <w:rFonts w:ascii="Symbol" w:hAnsi="Symbol" w:hint="default"/>
+      </w:rPr>
+    </w:lvl>
+    <w:lvl w:ilvl="1" w:tplc="340A0003" w:tentative="1">
+      <w:start w:val="1"/>
+      <w:numFmt w:val="bullet"/>
+      <w:lvlText w:val="o"/>
+      <w:lvlJc w:val="left"/>
+      <w:pPr>
+        <w:ind w:left="1440" w:hanging="360"/>
+      </w:pPr>
+      <w:rPr>
+        <w:rFonts w:ascii="Courier New" w:hAnsi="Courier New" w:cs="Courier New" w:hint="default"/>
+      </w:rPr>
+    </w:lvl>
+    <w:lvl w:ilvl="2" w:tplc="340A0005" w:tentative="1">
+      <w:start w:val="1"/>
+      <w:numFmt w:val="bullet"/>
+      <w:lvlText w:val=""/>
+      <w:lvlJc w:val="left"/>
+      <w:pPr>
+        <w:ind w:left="2160" w:hanging="360"/>
+      </w:pPr>
+      <w:rPr>
+        <w:rFonts w:ascii="Wingdings" w:hAnsi="Wingdings" w:hint="default"/>
+      </w:rPr>
+    </w:lvl>
+    <w:lvl w:ilvl="3" w:tplc="340A0001" w:tentative="1">
+      <w:start w:val="1"/>
+      <w:numFmt w:val="bullet"/>
+      <w:lvlText w:val=""/>
+      <w:lvlJc w:val="left"/>
+      <w:pPr>
+        <w:ind w:left="2880" w:hanging="360"/>
+      </w:pPr>
+      <w:rPr>
+        <w:rFonts w:ascii="Symbol" w:hAnsi="Symbol" w:hint="default"/>
+      </w:rPr>
+    </w:lvl>
+    <w:lvl w:ilvl="4" w:tplc="340A0003" w:tentative="1">
+      <w:start w:val="1"/>
+      <w:numFmt w:val="bullet"/>
+      <w:lvlText w:val="o"/>
+      <w:lvlJc w:val="left"/>
+      <w:pPr>
+        <w:ind w:left="3600" w:hanging="360"/>
+      </w:pPr>
+      <w:rPr>
+        <w:rFonts w:ascii="Courier New" w:hAnsi="Courier New" w:cs="Courier New" w:hint="default"/>
+      </w:rPr>
+    </w:lvl>
+    <w:lvl w:ilvl="5" w:tplc="340A0005" w:tentative="1">
+      <w:start w:val="1"/>
+      <w:numFmt w:val="bullet"/>
+      <w:lvlText w:val=""/>
+      <w:lvlJc w:val="left"/>
+      <w:pPr>
+        <w:ind w:left="4320" w:hanging="360"/>
+      </w:pPr>
+      <w:rPr>
+        <w:rFonts w:ascii="Wingdings" w:hAnsi="Wingdings" w:hint="default"/>
+      </w:rPr>
+    </w:lvl>
+    <w:lvl w:ilvl="6" w:tplc="340A0001" w:tentative="1">
+      <w:start w:val="1"/>
+      <w:numFmt w:val="bullet"/>
+      <w:lvlText w:val=""/>
+      <w:lvlJc w:val="left"/>
+      <w:pPr>
+        <w:ind w:left="5040" w:hanging="360"/>
+      </w:pPr>
+      <w:rPr>
+        <w:rFonts w:ascii="Symbol" w:hAnsi="Symbol" w:hint="default"/>
+      </w:rPr>
+    </w:lvl>
+    <w:lvl w:ilvl="7" w:tplc="340A0003" w:tentative="1">
+      <w:start w:val="1"/>
+      <w:numFmt w:val="bullet"/>
+      <w:lvlText w:val="o"/>
+      <w:lvlJc w:val="left"/>
+      <w:pPr>
+        <w:ind w:left="5760" w:hanging="360"/>
+      </w:pPr>
+      <w:rPr>
+        <w:rFonts w:ascii="Courier New" w:hAnsi="Courier New" w:cs="Courier New" w:hint="default"/>
+      </w:rPr>
+    </w:lvl>
+    <w:lvl w:ilvl="8" w:tplc="340A0005" w:tentative="1">
+      <w:start w:val="1"/>
+      <w:numFmt w:val="bullet"/>
+      <w:lvlText w:val=""/>
+      <w:lvlJc w:val="left"/>
+      <w:pPr>
+        <w:ind w:left="6480" w:hanging="360"/>
+      </w:pPr>
+      <w:rPr>
+        <w:rFonts w:ascii="Wingdings" w:hAnsi="Wingdings" w:hint="default"/>
+      </w:rPr>
+    </w:lvl>
+  </w:abstractNum>
+  <w:abstractNum w:abstractNumId="32" w15:restartNumberingAfterBreak="0">
     <w:nsid w:val="69616CB8"/>
     <w:multiLevelType w:val="hybridMultilevel"/>
     <w:tmpl w:val="23EC7D4A"/>
@@ -5345,7 +8149,7 @@
       </w:rPr>
     </w:lvl>
   </w:abstractNum>
-  <w:abstractNum w:abstractNumId="27" w15:restartNumberingAfterBreak="0">
+  <w:abstractNum w:abstractNumId="33" w15:restartNumberingAfterBreak="0">
     <w:nsid w:val="6B625092"/>
     <w:multiLevelType w:val="hybridMultilevel"/>
     <w:tmpl w:val="86F61076"/>
@@ -5458,7 +8262,120 @@
       </w:rPr>
     </w:lvl>
   </w:abstractNum>
-  <w:abstractNum w:abstractNumId="28" w15:restartNumberingAfterBreak="0">
+  <w:abstractNum w:abstractNumId="34" w15:restartNumberingAfterBreak="0">
+    <w:nsid w:val="6BFB4AD0"/>
+    <w:multiLevelType w:val="hybridMultilevel"/>
+    <w:tmpl w:val="8B76D7E0"/>
+    <w:lvl w:ilvl="0" w:tplc="340A0001">
+      <w:start w:val="1"/>
+      <w:numFmt w:val="bullet"/>
+      <w:lvlText w:val=""/>
+      <w:lvlJc w:val="left"/>
+      <w:pPr>
+        <w:ind w:left="720" w:hanging="360"/>
+      </w:pPr>
+      <w:rPr>
+        <w:rFonts w:ascii="Symbol" w:hAnsi="Symbol" w:hint="default"/>
+      </w:rPr>
+    </w:lvl>
+    <w:lvl w:ilvl="1" w:tplc="340A0003" w:tentative="1">
+      <w:start w:val="1"/>
+      <w:numFmt w:val="bullet"/>
+      <w:lvlText w:val="o"/>
+      <w:lvlJc w:val="left"/>
+      <w:pPr>
+        <w:ind w:left="1440" w:hanging="360"/>
+      </w:pPr>
+      <w:rPr>
+        <w:rFonts w:ascii="Courier New" w:hAnsi="Courier New" w:cs="Courier New" w:hint="default"/>
+      </w:rPr>
+    </w:lvl>
+    <w:lvl w:ilvl="2" w:tplc="340A0005" w:tentative="1">
+      <w:start w:val="1"/>
+      <w:numFmt w:val="bullet"/>
+      <w:lvlText w:val=""/>
+      <w:lvlJc w:val="left"/>
+      <w:pPr>
+        <w:ind w:left="2160" w:hanging="360"/>
+      </w:pPr>
+      <w:rPr>
+        <w:rFonts w:ascii="Wingdings" w:hAnsi="Wingdings" w:hint="default"/>
+      </w:rPr>
+    </w:lvl>
+    <w:lvl w:ilvl="3" w:tplc="340A0001" w:tentative="1">
+      <w:start w:val="1"/>
+      <w:numFmt w:val="bullet"/>
+      <w:lvlText w:val=""/>
+      <w:lvlJc w:val="left"/>
+      <w:pPr>
+        <w:ind w:left="2880" w:hanging="360"/>
+      </w:pPr>
+      <w:rPr>
+        <w:rFonts w:ascii="Symbol" w:hAnsi="Symbol" w:hint="default"/>
+      </w:rPr>
+    </w:lvl>
+    <w:lvl w:ilvl="4" w:tplc="340A0003" w:tentative="1">
+      <w:start w:val="1"/>
+      <w:numFmt w:val="bullet"/>
+      <w:lvlText w:val="o"/>
+      <w:lvlJc w:val="left"/>
+      <w:pPr>
+        <w:ind w:left="3600" w:hanging="360"/>
+      </w:pPr>
+      <w:rPr>
+        <w:rFonts w:ascii="Courier New" w:hAnsi="Courier New" w:cs="Courier New" w:hint="default"/>
+      </w:rPr>
+    </w:lvl>
+    <w:lvl w:ilvl="5" w:tplc="340A0005" w:tentative="1">
+      <w:start w:val="1"/>
+      <w:numFmt w:val="bullet"/>
+      <w:lvlText w:val=""/>
+      <w:lvlJc w:val="left"/>
+      <w:pPr>
+        <w:ind w:left="4320" w:hanging="360"/>
+      </w:pPr>
+      <w:rPr>
+        <w:rFonts w:ascii="Wingdings" w:hAnsi="Wingdings" w:hint="default"/>
+      </w:rPr>
+    </w:lvl>
+    <w:lvl w:ilvl="6" w:tplc="340A0001" w:tentative="1">
+      <w:start w:val="1"/>
+      <w:numFmt w:val="bullet"/>
+      <w:lvlText w:val=""/>
+      <w:lvlJc w:val="left"/>
+      <w:pPr>
+        <w:ind w:left="5040" w:hanging="360"/>
+      </w:pPr>
+      <w:rPr>
+        <w:rFonts w:ascii="Symbol" w:hAnsi="Symbol" w:hint="default"/>
+      </w:rPr>
+    </w:lvl>
+    <w:lvl w:ilvl="7" w:tplc="340A0003" w:tentative="1">
+      <w:start w:val="1"/>
+      <w:numFmt w:val="bullet"/>
+      <w:lvlText w:val="o"/>
+      <w:lvlJc w:val="left"/>
+      <w:pPr>
+        <w:ind w:left="5760" w:hanging="360"/>
+      </w:pPr>
+      <w:rPr>
+        <w:rFonts w:ascii="Courier New" w:hAnsi="Courier New" w:cs="Courier New" w:hint="default"/>
+      </w:rPr>
+    </w:lvl>
+    <w:lvl w:ilvl="8" w:tplc="340A0005" w:tentative="1">
+      <w:start w:val="1"/>
+      <w:numFmt w:val="bullet"/>
+      <w:lvlText w:val=""/>
+      <w:lvlJc w:val="left"/>
+      <w:pPr>
+        <w:ind w:left="6480" w:hanging="360"/>
+      </w:pPr>
+      <w:rPr>
+        <w:rFonts w:ascii="Wingdings" w:hAnsi="Wingdings" w:hint="default"/>
+      </w:rPr>
+    </w:lvl>
+  </w:abstractNum>
+  <w:abstractNum w:abstractNumId="35" w15:restartNumberingAfterBreak="0">
     <w:nsid w:val="6F4C16CF"/>
     <w:multiLevelType w:val="multilevel"/>
     <w:tmpl w:val="DE0C31B0"/>
@@ -5579,7 +8496,7 @@
       </w:rPr>
     </w:lvl>
   </w:abstractNum>
-  <w:abstractNum w:abstractNumId="29" w15:restartNumberingAfterBreak="0">
+  <w:abstractNum w:abstractNumId="36" w15:restartNumberingAfterBreak="0">
     <w:nsid w:val="70182867"/>
     <w:multiLevelType w:val="hybridMultilevel"/>
     <w:tmpl w:val="558437D6"/>
@@ -5692,7 +8609,7 @@
       </w:rPr>
     </w:lvl>
   </w:abstractNum>
-  <w:abstractNum w:abstractNumId="30" w15:restartNumberingAfterBreak="0">
+  <w:abstractNum w:abstractNumId="37" w15:restartNumberingAfterBreak="0">
     <w:nsid w:val="705D6F20"/>
     <w:multiLevelType w:val="multilevel"/>
     <w:tmpl w:val="DE0C31B0"/>
@@ -5813,7 +8730,120 @@
       </w:rPr>
     </w:lvl>
   </w:abstractNum>
-  <w:abstractNum w:abstractNumId="31" w15:restartNumberingAfterBreak="0">
+  <w:abstractNum w:abstractNumId="38" w15:restartNumberingAfterBreak="0">
+    <w:nsid w:val="70E25D56"/>
+    <w:multiLevelType w:val="hybridMultilevel"/>
+    <w:tmpl w:val="1238343C"/>
+    <w:lvl w:ilvl="0" w:tplc="340A0001">
+      <w:start w:val="1"/>
+      <w:numFmt w:val="bullet"/>
+      <w:lvlText w:val=""/>
+      <w:lvlJc w:val="left"/>
+      <w:pPr>
+        <w:ind w:left="720" w:hanging="360"/>
+      </w:pPr>
+      <w:rPr>
+        <w:rFonts w:ascii="Symbol" w:hAnsi="Symbol" w:hint="default"/>
+      </w:rPr>
+    </w:lvl>
+    <w:lvl w:ilvl="1" w:tplc="340A0003" w:tentative="1">
+      <w:start w:val="1"/>
+      <w:numFmt w:val="bullet"/>
+      <w:lvlText w:val="o"/>
+      <w:lvlJc w:val="left"/>
+      <w:pPr>
+        <w:ind w:left="1440" w:hanging="360"/>
+      </w:pPr>
+      <w:rPr>
+        <w:rFonts w:ascii="Courier New" w:hAnsi="Courier New" w:cs="Courier New" w:hint="default"/>
+      </w:rPr>
+    </w:lvl>
+    <w:lvl w:ilvl="2" w:tplc="340A0005" w:tentative="1">
+      <w:start w:val="1"/>
+      <w:numFmt w:val="bullet"/>
+      <w:lvlText w:val=""/>
+      <w:lvlJc w:val="left"/>
+      <w:pPr>
+        <w:ind w:left="2160" w:hanging="360"/>
+      </w:pPr>
+      <w:rPr>
+        <w:rFonts w:ascii="Wingdings" w:hAnsi="Wingdings" w:hint="default"/>
+      </w:rPr>
+    </w:lvl>
+    <w:lvl w:ilvl="3" w:tplc="340A0001" w:tentative="1">
+      <w:start w:val="1"/>
+      <w:numFmt w:val="bullet"/>
+      <w:lvlText w:val=""/>
+      <w:lvlJc w:val="left"/>
+      <w:pPr>
+        <w:ind w:left="2880" w:hanging="360"/>
+      </w:pPr>
+      <w:rPr>
+        <w:rFonts w:ascii="Symbol" w:hAnsi="Symbol" w:hint="default"/>
+      </w:rPr>
+    </w:lvl>
+    <w:lvl w:ilvl="4" w:tplc="340A0003" w:tentative="1">
+      <w:start w:val="1"/>
+      <w:numFmt w:val="bullet"/>
+      <w:lvlText w:val="o"/>
+      <w:lvlJc w:val="left"/>
+      <w:pPr>
+        <w:ind w:left="3600" w:hanging="360"/>
+      </w:pPr>
+      <w:rPr>
+        <w:rFonts w:ascii="Courier New" w:hAnsi="Courier New" w:cs="Courier New" w:hint="default"/>
+      </w:rPr>
+    </w:lvl>
+    <w:lvl w:ilvl="5" w:tplc="340A0005" w:tentative="1">
+      <w:start w:val="1"/>
+      <w:numFmt w:val="bullet"/>
+      <w:lvlText w:val=""/>
+      <w:lvlJc w:val="left"/>
+      <w:pPr>
+        <w:ind w:left="4320" w:hanging="360"/>
+      </w:pPr>
+      <w:rPr>
+        <w:rFonts w:ascii="Wingdings" w:hAnsi="Wingdings" w:hint="default"/>
+      </w:rPr>
+    </w:lvl>
+    <w:lvl w:ilvl="6" w:tplc="340A0001" w:tentative="1">
+      <w:start w:val="1"/>
+      <w:numFmt w:val="bullet"/>
+      <w:lvlText w:val=""/>
+      <w:lvlJc w:val="left"/>
+      <w:pPr>
+        <w:ind w:left="5040" w:hanging="360"/>
+      </w:pPr>
+      <w:rPr>
+        <w:rFonts w:ascii="Symbol" w:hAnsi="Symbol" w:hint="default"/>
+      </w:rPr>
+    </w:lvl>
+    <w:lvl w:ilvl="7" w:tplc="340A0003" w:tentative="1">
+      <w:start w:val="1"/>
+      <w:numFmt w:val="bullet"/>
+      <w:lvlText w:val="o"/>
+      <w:lvlJc w:val="left"/>
+      <w:pPr>
+        <w:ind w:left="5760" w:hanging="360"/>
+      </w:pPr>
+      <w:rPr>
+        <w:rFonts w:ascii="Courier New" w:hAnsi="Courier New" w:cs="Courier New" w:hint="default"/>
+      </w:rPr>
+    </w:lvl>
+    <w:lvl w:ilvl="8" w:tplc="340A0005" w:tentative="1">
+      <w:start w:val="1"/>
+      <w:numFmt w:val="bullet"/>
+      <w:lvlText w:val=""/>
+      <w:lvlJc w:val="left"/>
+      <w:pPr>
+        <w:ind w:left="6480" w:hanging="360"/>
+      </w:pPr>
+      <w:rPr>
+        <w:rFonts w:ascii="Wingdings" w:hAnsi="Wingdings" w:hint="default"/>
+      </w:rPr>
+    </w:lvl>
+  </w:abstractNum>
+  <w:abstractNum w:abstractNumId="39" w15:restartNumberingAfterBreak="0">
     <w:nsid w:val="73AC4DB1"/>
     <w:multiLevelType w:val="hybridMultilevel"/>
     <w:tmpl w:val="89A85AC2"/>
@@ -5926,7 +8956,7 @@
       </w:rPr>
     </w:lvl>
   </w:abstractNum>
-  <w:abstractNum w:abstractNumId="32" w15:restartNumberingAfterBreak="0">
+  <w:abstractNum w:abstractNumId="40" w15:restartNumberingAfterBreak="0">
     <w:nsid w:val="76304F08"/>
     <w:multiLevelType w:val="hybridMultilevel"/>
     <w:tmpl w:val="BBB47B0A"/>
@@ -6038,7 +9068,120 @@
       </w:rPr>
     </w:lvl>
   </w:abstractNum>
-  <w:abstractNum w:abstractNumId="33" w15:restartNumberingAfterBreak="0">
+  <w:abstractNum w:abstractNumId="41" w15:restartNumberingAfterBreak="0">
+    <w:nsid w:val="79EE6DC3"/>
+    <w:multiLevelType w:val="hybridMultilevel"/>
+    <w:tmpl w:val="3814A4FE"/>
+    <w:lvl w:ilvl="0" w:tplc="340A0001">
+      <w:start w:val="1"/>
+      <w:numFmt w:val="bullet"/>
+      <w:lvlText w:val=""/>
+      <w:lvlJc w:val="left"/>
+      <w:pPr>
+        <w:ind w:left="720" w:hanging="360"/>
+      </w:pPr>
+      <w:rPr>
+        <w:rFonts w:ascii="Symbol" w:hAnsi="Symbol" w:hint="default"/>
+      </w:rPr>
+    </w:lvl>
+    <w:lvl w:ilvl="1" w:tplc="340A0003" w:tentative="1">
+      <w:start w:val="1"/>
+      <w:numFmt w:val="bullet"/>
+      <w:lvlText w:val="o"/>
+      <w:lvlJc w:val="left"/>
+      <w:pPr>
+        <w:ind w:left="1440" w:hanging="360"/>
+      </w:pPr>
+      <w:rPr>
+        <w:rFonts w:ascii="Courier New" w:hAnsi="Courier New" w:cs="Courier New" w:hint="default"/>
+      </w:rPr>
+    </w:lvl>
+    <w:lvl w:ilvl="2" w:tplc="340A0005" w:tentative="1">
+      <w:start w:val="1"/>
+      <w:numFmt w:val="bullet"/>
+      <w:lvlText w:val=""/>
+      <w:lvlJc w:val="left"/>
+      <w:pPr>
+        <w:ind w:left="2160" w:hanging="360"/>
+      </w:pPr>
+      <w:rPr>
+        <w:rFonts w:ascii="Wingdings" w:hAnsi="Wingdings" w:hint="default"/>
+      </w:rPr>
+    </w:lvl>
+    <w:lvl w:ilvl="3" w:tplc="340A0001" w:tentative="1">
+      <w:start w:val="1"/>
+      <w:numFmt w:val="bullet"/>
+      <w:lvlText w:val=""/>
+      <w:lvlJc w:val="left"/>
+      <w:pPr>
+        <w:ind w:left="2880" w:hanging="360"/>
+      </w:pPr>
+      <w:rPr>
+        <w:rFonts w:ascii="Symbol" w:hAnsi="Symbol" w:hint="default"/>
+      </w:rPr>
+    </w:lvl>
+    <w:lvl w:ilvl="4" w:tplc="340A0003" w:tentative="1">
+      <w:start w:val="1"/>
+      <w:numFmt w:val="bullet"/>
+      <w:lvlText w:val="o"/>
+      <w:lvlJc w:val="left"/>
+      <w:pPr>
+        <w:ind w:left="3600" w:hanging="360"/>
+      </w:pPr>
+      <w:rPr>
+        <w:rFonts w:ascii="Courier New" w:hAnsi="Courier New" w:cs="Courier New" w:hint="default"/>
+      </w:rPr>
+    </w:lvl>
+    <w:lvl w:ilvl="5" w:tplc="340A0005" w:tentative="1">
+      <w:start w:val="1"/>
+      <w:numFmt w:val="bullet"/>
+      <w:lvlText w:val=""/>
+      <w:lvlJc w:val="left"/>
+      <w:pPr>
+        <w:ind w:left="4320" w:hanging="360"/>
+      </w:pPr>
+      <w:rPr>
+        <w:rFonts w:ascii="Wingdings" w:hAnsi="Wingdings" w:hint="default"/>
+      </w:rPr>
+    </w:lvl>
+    <w:lvl w:ilvl="6" w:tplc="340A0001" w:tentative="1">
+      <w:start w:val="1"/>
+      <w:numFmt w:val="bullet"/>
+      <w:lvlText w:val=""/>
+      <w:lvlJc w:val="left"/>
+      <w:pPr>
+        <w:ind w:left="5040" w:hanging="360"/>
+      </w:pPr>
+      <w:rPr>
+        <w:rFonts w:ascii="Symbol" w:hAnsi="Symbol" w:hint="default"/>
+      </w:rPr>
+    </w:lvl>
+    <w:lvl w:ilvl="7" w:tplc="340A0003" w:tentative="1">
+      <w:start w:val="1"/>
+      <w:numFmt w:val="bullet"/>
+      <w:lvlText w:val="o"/>
+      <w:lvlJc w:val="left"/>
+      <w:pPr>
+        <w:ind w:left="5760" w:hanging="360"/>
+      </w:pPr>
+      <w:rPr>
+        <w:rFonts w:ascii="Courier New" w:hAnsi="Courier New" w:cs="Courier New" w:hint="default"/>
+      </w:rPr>
+    </w:lvl>
+    <w:lvl w:ilvl="8" w:tplc="340A0005" w:tentative="1">
+      <w:start w:val="1"/>
+      <w:numFmt w:val="bullet"/>
+      <w:lvlText w:val=""/>
+      <w:lvlJc w:val="left"/>
+      <w:pPr>
+        <w:ind w:left="6480" w:hanging="360"/>
+      </w:pPr>
+      <w:rPr>
+        <w:rFonts w:ascii="Wingdings" w:hAnsi="Wingdings" w:hint="default"/>
+      </w:rPr>
+    </w:lvl>
+  </w:abstractNum>
+  <w:abstractNum w:abstractNumId="42" w15:restartNumberingAfterBreak="0">
     <w:nsid w:val="7A4042C0"/>
     <w:multiLevelType w:val="hybridMultilevel"/>
     <w:tmpl w:val="86F4DB30"/>
@@ -6151,113 +9294,140 @@
       </w:rPr>
     </w:lvl>
   </w:abstractNum>
-  <w:num w:numId="1" w16cid:durableId="272633570">
+  <w:num w:numId="1">
+    <w:abstractNumId w:val="1"/>
+  </w:num>
+  <w:num w:numId="2">
+    <w:abstractNumId w:val="20"/>
+  </w:num>
+  <w:num w:numId="3">
+    <w:abstractNumId w:val="2"/>
+  </w:num>
+  <w:num w:numId="4">
+    <w:abstractNumId w:val="33"/>
+  </w:num>
+  <w:num w:numId="5">
+    <w:abstractNumId w:val="40"/>
+  </w:num>
+  <w:num w:numId="6">
+    <w:abstractNumId w:val="4"/>
+  </w:num>
+  <w:num w:numId="7">
+    <w:abstractNumId w:val="19"/>
+  </w:num>
+  <w:num w:numId="8">
+    <w:abstractNumId w:val="29"/>
+  </w:num>
+  <w:num w:numId="9">
+    <w:abstractNumId w:val="14"/>
+  </w:num>
+  <w:num w:numId="10">
+    <w:abstractNumId w:val="13"/>
+  </w:num>
+  <w:num w:numId="11">
+    <w:abstractNumId w:val="32"/>
+  </w:num>
+  <w:num w:numId="12">
+    <w:abstractNumId w:val="6"/>
+  </w:num>
+  <w:num w:numId="13">
+    <w:abstractNumId w:val="37"/>
+  </w:num>
+  <w:num w:numId="14">
+    <w:abstractNumId w:val="24"/>
+  </w:num>
+  <w:num w:numId="15">
+    <w:abstractNumId w:val="26"/>
+  </w:num>
+  <w:num w:numId="16">
+    <w:abstractNumId w:val="9"/>
+  </w:num>
+  <w:num w:numId="17">
+    <w:abstractNumId w:val="35"/>
+  </w:num>
+  <w:num w:numId="18">
+    <w:abstractNumId w:val="39"/>
+  </w:num>
+  <w:num w:numId="19">
+    <w:abstractNumId w:val="15"/>
+  </w:num>
+  <w:num w:numId="20">
+    <w:abstractNumId w:val="27"/>
+  </w:num>
+  <w:num w:numId="21">
+    <w:abstractNumId w:val="36"/>
+  </w:num>
+  <w:num w:numId="22">
+    <w:abstractNumId w:val="12"/>
+  </w:num>
+  <w:num w:numId="23">
+    <w:abstractNumId w:val="25"/>
+  </w:num>
+  <w:num w:numId="24">
+    <w:abstractNumId w:val="11"/>
+  </w:num>
+  <w:num w:numId="25">
+    <w:abstractNumId w:val="18"/>
+  </w:num>
+  <w:num w:numId="26">
+    <w:abstractNumId w:val="28"/>
+  </w:num>
+  <w:num w:numId="27">
+    <w:abstractNumId w:val="30"/>
+  </w:num>
+  <w:num w:numId="28">
+    <w:abstractNumId w:val="42"/>
+  </w:num>
+  <w:num w:numId="29">
+    <w:abstractNumId w:val="8"/>
+  </w:num>
+  <w:num w:numId="30">
+    <w:abstractNumId w:val="10"/>
+  </w:num>
+  <w:num w:numId="31">
+    <w:abstractNumId w:val="21"/>
+  </w:num>
+  <w:num w:numId="32">
+    <w:abstractNumId w:val="17"/>
+  </w:num>
+  <w:num w:numId="33">
+    <w:abstractNumId w:val="5"/>
+  </w:num>
+  <w:num w:numId="34">
+    <w:abstractNumId w:val="22"/>
+  </w:num>
+  <w:num w:numId="35">
+    <w:abstractNumId w:val="3"/>
+  </w:num>
+  <w:num w:numId="36">
+    <w:abstractNumId w:val="31"/>
+  </w:num>
+  <w:num w:numId="37">
     <w:abstractNumId w:val="0"/>
   </w:num>
-  <w:num w:numId="2" w16cid:durableId="1684504031">
-    <w:abstractNumId w:val="16"/>
+  <w:num w:numId="38">
+    <w:abstractNumId w:val="38"/>
   </w:num>
-  <w:num w:numId="3" w16cid:durableId="1414159513">
-    <w:abstractNumId w:val="1"/>
-  </w:num>
-  <w:num w:numId="4" w16cid:durableId="1623654908">
-    <w:abstractNumId w:val="27"/>
-  </w:num>
-  <w:num w:numId="5" w16cid:durableId="1717465272">
-    <w:abstractNumId w:val="32"/>
-  </w:num>
-  <w:num w:numId="6" w16cid:durableId="1041511301">
-    <w:abstractNumId w:val="2"/>
-  </w:num>
-  <w:num w:numId="7" w16cid:durableId="2098675489">
-    <w:abstractNumId w:val="15"/>
-  </w:num>
-  <w:num w:numId="8" w16cid:durableId="90515677">
-    <w:abstractNumId w:val="24"/>
-  </w:num>
-  <w:num w:numId="9" w16cid:durableId="1922055468">
-    <w:abstractNumId w:val="11"/>
-  </w:num>
-  <w:num w:numId="10" w16cid:durableId="1101757714">
-    <w:abstractNumId w:val="10"/>
-  </w:num>
-  <w:num w:numId="11" w16cid:durableId="1866401473">
-    <w:abstractNumId w:val="26"/>
-  </w:num>
-  <w:num w:numId="12" w16cid:durableId="153381691">
-    <w:abstractNumId w:val="4"/>
-  </w:num>
-  <w:num w:numId="13" w16cid:durableId="1562405764">
-    <w:abstractNumId w:val="30"/>
-  </w:num>
-  <w:num w:numId="14" w16cid:durableId="1087462325">
-    <w:abstractNumId w:val="19"/>
-  </w:num>
-  <w:num w:numId="15" w16cid:durableId="357775350">
-    <w:abstractNumId w:val="21"/>
-  </w:num>
-  <w:num w:numId="16" w16cid:durableId="1355375604">
-    <w:abstractNumId w:val="6"/>
-  </w:num>
-  <w:num w:numId="17" w16cid:durableId="1109811429">
-    <w:abstractNumId w:val="28"/>
-  </w:num>
-  <w:num w:numId="18" w16cid:durableId="1876186480">
-    <w:abstractNumId w:val="31"/>
-  </w:num>
-  <w:num w:numId="19" w16cid:durableId="487332445">
-    <w:abstractNumId w:val="12"/>
-  </w:num>
-  <w:num w:numId="20" w16cid:durableId="1192184685">
-    <w:abstractNumId w:val="22"/>
-  </w:num>
-  <w:num w:numId="21" w16cid:durableId="594241338">
-    <w:abstractNumId w:val="29"/>
-  </w:num>
-  <w:num w:numId="22" w16cid:durableId="1974435340">
-    <w:abstractNumId w:val="9"/>
-  </w:num>
-  <w:num w:numId="23" w16cid:durableId="1943491384">
-    <w:abstractNumId w:val="20"/>
-  </w:num>
-  <w:num w:numId="24" w16cid:durableId="1082217151">
-    <w:abstractNumId w:val="8"/>
-  </w:num>
-  <w:num w:numId="25" w16cid:durableId="787117949">
-    <w:abstractNumId w:val="14"/>
-  </w:num>
-  <w:num w:numId="26" w16cid:durableId="1771855276">
+  <w:num w:numId="39">
     <w:abstractNumId w:val="23"/>
   </w:num>
-  <w:num w:numId="27" w16cid:durableId="1509371452">
-    <w:abstractNumId w:val="25"/>
+  <w:num w:numId="40">
+    <w:abstractNumId w:val="41"/>
   </w:num>
-  <w:num w:numId="28" w16cid:durableId="2113895652">
-    <w:abstractNumId w:val="33"/>
-  </w:num>
-  <w:num w:numId="29" w16cid:durableId="1127548112">
-    <w:abstractNumId w:val="5"/>
-  </w:num>
-  <w:num w:numId="30" w16cid:durableId="1862939586">
+  <w:num w:numId="41">
     <w:abstractNumId w:val="7"/>
   </w:num>
-  <w:num w:numId="31" w16cid:durableId="620693121">
-    <w:abstractNumId w:val="17"/>
+  <w:num w:numId="42">
+    <w:abstractNumId w:val="34"/>
   </w:num>
-  <w:num w:numId="32" w16cid:durableId="2034306165">
-    <w:abstractNumId w:val="13"/>
-  </w:num>
-  <w:num w:numId="33" w16cid:durableId="1806971608">
-    <w:abstractNumId w:val="3"/>
-  </w:num>
-  <w:num w:numId="34" w16cid:durableId="102965675">
-    <w:abstractNumId w:val="18"/>
+  <w:num w:numId="43">
+    <w:abstractNumId w:val="16"/>
   </w:num>
 </w:numbering>
 </file>
 
 <file path=word/styles.xml><?xml version="1.0" encoding="utf-8"?>
-<w:styles xmlns:mc="http://schemas.openxmlformats.org/markup-compatibility/2006" xmlns:r="http://schemas.openxmlformats.org/officeDocument/2006/relationships" xmlns:w="http://schemas.openxmlformats.org/wordprocessingml/2006/main" xmlns:w14="http://schemas.microsoft.com/office/word/2010/wordml" xmlns:w15="http://schemas.microsoft.com/office/word/2012/wordml" xmlns:w16cex="http://schemas.microsoft.com/office/word/2018/wordml/cex" xmlns:w16cid="http://schemas.microsoft.com/office/word/2016/wordml/cid" xmlns:w16="http://schemas.microsoft.com/office/word/2018/wordml" xmlns:w16du="http://schemas.microsoft.com/office/word/2023/wordml/word16du" xmlns:w16sdtdh="http://schemas.microsoft.com/office/word/2020/wordml/sdtdatahash" xmlns:w16sdtfl="http://schemas.microsoft.com/office/word/2024/wordml/sdtformatlock" xmlns:w16se="http://schemas.microsoft.com/office/word/2015/wordml/symex" mc:Ignorable="w14 w15 w16se w16cid w16 w16cex w16sdtdh w16sdtfl w16du">
+<w:styles xmlns:mc="http://schemas.openxmlformats.org/markup-compatibility/2006" xmlns:r="http://schemas.openxmlformats.org/officeDocument/2006/relationships" xmlns:w="http://schemas.openxmlformats.org/wordprocessingml/2006/main" xmlns:w14="http://schemas.microsoft.com/office/word/2010/wordml" xmlns:w15="http://schemas.microsoft.com/office/word/2012/wordml" xmlns:w16cex="http://schemas.microsoft.com/office/word/2018/wordml/cex" xmlns:w16cid="http://schemas.microsoft.com/office/word/2016/wordml/cid" xmlns:w16="http://schemas.microsoft.com/office/word/2018/wordml" xmlns:w16sdtdh="http://schemas.microsoft.com/office/word/2020/wordml/sdtdatahash" xmlns:w16se="http://schemas.microsoft.com/office/word/2015/wordml/symex" mc:Ignorable="w14 w15 w16se w16cid w16 w16cex w16sdtdh">
   <w:docDefaults>
     <w:rPrDefault>
       <w:rPr>
@@ -7274,11 +10444,24 @@
       <w:color w:val="365F91" w:themeColor="accent1" w:themeShade="BF"/>
     </w:rPr>
   </w:style>
+  <w:style w:type="character" w:styleId="CdigoHTML">
+    <w:name w:val="HTML Code"/>
+    <w:basedOn w:val="Fuentedeprrafopredeter"/>
+    <w:uiPriority w:val="99"/>
+    <w:semiHidden/>
+    <w:unhideWhenUsed/>
+    <w:rsid w:val="008E2E47"/>
+    <w:rPr>
+      <w:rFonts w:ascii="Courier New" w:eastAsia="Times New Roman" w:hAnsi="Courier New" w:cs="Courier New"/>
+      <w:sz w:val="20"/>
+      <w:szCs w:val="20"/>
+    </w:rPr>
+  </w:style>
 </w:styles>
 </file>
 
 <file path=word/glossary/document.xml><?xml version="1.0" encoding="utf-8"?>
-<w:glossaryDocument xmlns:wpc="http://schemas.microsoft.com/office/word/2010/wordprocessingCanvas" xmlns:cx="http://schemas.microsoft.com/office/drawing/2014/chartex" xmlns:cx1="http://schemas.microsoft.com/office/drawing/2015/9/8/chartex" xmlns:cx2="http://schemas.microsoft.com/office/drawing/2015/10/21/chartex" xmlns:cx3="http://schemas.microsoft.com/office/drawing/2016/5/9/chartex" xmlns:cx4="http://schemas.microsoft.com/office/drawing/2016/5/10/chartex" xmlns:cx5="http://schemas.microsoft.com/office/drawing/2016/5/11/chartex" xmlns:cx6="http://schemas.microsoft.com/office/drawing/2016/5/12/chartex" xmlns:cx7="http://schemas.microsoft.com/office/drawing/2016/5/13/chartex" xmlns:cx8="http://schemas.microsoft.com/office/drawing/2016/5/14/chartex" xmlns:mc="http://schemas.openxmlformats.org/markup-compatibility/2006" xmlns:aink="http://schemas.microsoft.com/office/drawing/2016/ink" xmlns:am3d="http://schemas.microsoft.com/office/drawing/2017/model3d" xmlns:o="urn:schemas-microsoft-com:office:office" xmlns:oel="http://schemas.microsoft.com/office/2019/extlst" xmlns:r="http://schemas.openxmlformats.org/officeDocument/2006/relationships" xmlns:m="http://schemas.openxmlformats.org/officeDocument/2006/math" xmlns:v="urn:schemas-microsoft-com:vml" xmlns:wp14="http://schemas.microsoft.com/office/word/2010/wordprocessingDrawing" xmlns:wp="http://schemas.openxmlformats.org/drawingml/2006/wordprocessingDrawing" xmlns:w10="urn:schemas-microsoft-com:office:word" xmlns:w="http://schemas.openxmlformats.org/wordprocessingml/2006/main" xmlns:w14="http://schemas.microsoft.com/office/word/2010/wordml" xmlns:w15="http://schemas.microsoft.com/office/word/2012/wordml" xmlns:w16cex="http://schemas.microsoft.com/office/word/2018/wordml/cex" xmlns:w16cid="http://schemas.microsoft.com/office/word/2016/wordml/cid" xmlns:w16="http://schemas.microsoft.com/office/word/2018/wordml" xmlns:w16du="http://schemas.microsoft.com/office/word/2023/wordml/word16du" xmlns:w16sdtdh="http://schemas.microsoft.com/office/word/2020/wordml/sdtdatahash" xmlns:w16sdtfl="http://schemas.microsoft.com/office/word/2024/wordml/sdtformatlock" xmlns:w16se="http://schemas.microsoft.com/office/word/2015/wordml/symex" xmlns:wpg="http://schemas.microsoft.com/office/word/2010/wordprocessingGroup" xmlns:wpi="http://schemas.microsoft.com/office/word/2010/wordprocessingInk" xmlns:wne="http://schemas.microsoft.com/office/word/2006/wordml" xmlns:wps="http://schemas.microsoft.com/office/word/2010/wordprocessingShape" mc:Ignorable="w14 w15 w16se w16cid w16 w16cex w16sdtdh w16sdtfl w16du wp14">
+<w:glossaryDocument xmlns:wpc="http://schemas.microsoft.com/office/word/2010/wordprocessingCanvas" xmlns:cx="http://schemas.microsoft.com/office/drawing/2014/chartex" xmlns:cx1="http://schemas.microsoft.com/office/drawing/2015/9/8/chartex" xmlns:cx2="http://schemas.microsoft.com/office/drawing/2015/10/21/chartex" xmlns:cx3="http://schemas.microsoft.com/office/drawing/2016/5/9/chartex" xmlns:cx4="http://schemas.microsoft.com/office/drawing/2016/5/10/chartex" xmlns:cx5="http://schemas.microsoft.com/office/drawing/2016/5/11/chartex" xmlns:cx6="http://schemas.microsoft.com/office/drawing/2016/5/12/chartex" xmlns:cx7="http://schemas.microsoft.com/office/drawing/2016/5/13/chartex" xmlns:cx8="http://schemas.microsoft.com/office/drawing/2016/5/14/chartex" xmlns:mc="http://schemas.openxmlformats.org/markup-compatibility/2006" xmlns:aink="http://schemas.microsoft.com/office/drawing/2016/ink" xmlns:am3d="http://schemas.microsoft.com/office/drawing/2017/model3d" xmlns:o="urn:schemas-microsoft-com:office:office" xmlns:r="http://schemas.openxmlformats.org/officeDocument/2006/relationships" xmlns:m="http://schemas.openxmlformats.org/officeDocument/2006/math" xmlns:v="urn:schemas-microsoft-com:vml" xmlns:wp14="http://schemas.microsoft.com/office/word/2010/wordprocessingDrawing" xmlns:wp="http://schemas.openxmlformats.org/drawingml/2006/wordprocessingDrawing" xmlns:w10="urn:schemas-microsoft-com:office:word" xmlns:w="http://schemas.openxmlformats.org/wordprocessingml/2006/main" xmlns:w14="http://schemas.microsoft.com/office/word/2010/wordml" xmlns:w15="http://schemas.microsoft.com/office/word/2012/wordml" xmlns:w16cex="http://schemas.microsoft.com/office/word/2018/wordml/cex" xmlns:w16cid="http://schemas.microsoft.com/office/word/2016/wordml/cid" xmlns:w16="http://schemas.microsoft.com/office/word/2018/wordml" xmlns:w16sdtdh="http://schemas.microsoft.com/office/word/2020/wordml/sdtdatahash" xmlns:w16se="http://schemas.microsoft.com/office/word/2015/wordml/symex" xmlns:wpg="http://schemas.microsoft.com/office/word/2010/wordprocessingGroup" xmlns:wpi="http://schemas.microsoft.com/office/word/2010/wordprocessingInk" xmlns:wne="http://schemas.microsoft.com/office/word/2006/wordml" xmlns:wps="http://schemas.microsoft.com/office/word/2010/wordprocessingShape" mc:Ignorable="w14 w15 w16se w16cid w16 w16cex w16sdtdh wp14">
   <w:docParts>
     <w:docPart>
       <w:docPartPr>
@@ -7348,20 +10531,20 @@
 </file>
 
 <file path=word/glossary/fontTable.xml><?xml version="1.0" encoding="utf-8"?>
-<w:fonts xmlns:mc="http://schemas.openxmlformats.org/markup-compatibility/2006" xmlns:r="http://schemas.openxmlformats.org/officeDocument/2006/relationships" xmlns:w="http://schemas.openxmlformats.org/wordprocessingml/2006/main" xmlns:w14="http://schemas.microsoft.com/office/word/2010/wordml" xmlns:w15="http://schemas.microsoft.com/office/word/2012/wordml" xmlns:w16cex="http://schemas.microsoft.com/office/word/2018/wordml/cex" xmlns:w16cid="http://schemas.microsoft.com/office/word/2016/wordml/cid" xmlns:w16="http://schemas.microsoft.com/office/word/2018/wordml" xmlns:w16du="http://schemas.microsoft.com/office/word/2023/wordml/word16du" xmlns:w16sdtdh="http://schemas.microsoft.com/office/word/2020/wordml/sdtdatahash" xmlns:w16sdtfl="http://schemas.microsoft.com/office/word/2024/wordml/sdtformatlock" xmlns:w16se="http://schemas.microsoft.com/office/word/2015/wordml/symex" mc:Ignorable="w14 w15 w16se w16cid w16 w16cex w16sdtdh w16sdtfl w16du">
+<w:fonts xmlns:mc="http://schemas.openxmlformats.org/markup-compatibility/2006" xmlns:r="http://schemas.openxmlformats.org/officeDocument/2006/relationships" xmlns:w="http://schemas.openxmlformats.org/wordprocessingml/2006/main" xmlns:w14="http://schemas.microsoft.com/office/word/2010/wordml" xmlns:w15="http://schemas.microsoft.com/office/word/2012/wordml" xmlns:w16cex="http://schemas.microsoft.com/office/word/2018/wordml/cex" xmlns:w16cid="http://schemas.microsoft.com/office/word/2016/wordml/cid" xmlns:w16="http://schemas.microsoft.com/office/word/2018/wordml" xmlns:w16sdtdh="http://schemas.microsoft.com/office/word/2020/wordml/sdtdatahash" xmlns:w16se="http://schemas.microsoft.com/office/word/2015/wordml/symex" mc:Ignorable="w14 w15 w16se w16cid w16 w16cex w16sdtdh">
+  <w:font w:name="Symbol">
+    <w:panose1 w:val="05050102010706020507"/>
+    <w:charset w:val="02"/>
+    <w:family w:val="roman"/>
+    <w:pitch w:val="variable"/>
+    <w:sig w:usb0="00000000" w:usb1="10000000" w:usb2="00000000" w:usb3="00000000" w:csb0="80000000" w:csb1="00000000"/>
+  </w:font>
   <w:font w:name="Times New Roman">
     <w:panose1 w:val="02020603050405020304"/>
     <w:charset w:val="00"/>
     <w:family w:val="roman"/>
     <w:pitch w:val="variable"/>
     <w:sig w:usb0="E0002EFF" w:usb1="C000785B" w:usb2="00000009" w:usb3="00000000" w:csb0="000001FF" w:csb1="00000000"/>
-  </w:font>
-  <w:font w:name="Symbol">
-    <w:panose1 w:val="05050102010706020507"/>
-    <w:charset w:val="02"/>
-    <w:family w:val="roman"/>
-    <w:pitch w:val="variable"/>
-    <w:sig w:usb0="00000000" w:usb1="10000000" w:usb2="00000000" w:usb3="00000000" w:csb0="80000000" w:csb1="00000000"/>
   </w:font>
   <w:font w:name="Courier New">
     <w:panose1 w:val="02070309020205020404"/>
@@ -7414,17 +10597,12 @@
     <w:sig w:usb0="E1002EFF" w:usb1="C000605B" w:usb2="00000029" w:usb3="00000000" w:csb0="000101FF" w:csb1="00000000"/>
   </w:font>
   <w:font w:name="MS Mincho">
+    <w:altName w:val="ＭＳ 明朝"/>
     <w:panose1 w:val="02020609040205080304"/>
     <w:charset w:val="80"/>
     <w:family w:val="modern"/>
     <w:pitch w:val="fixed"/>
     <w:sig w:usb0="E00002FF" w:usb1="6AC7FDFB" w:usb2="08000012" w:usb3="00000000" w:csb0="0002009F" w:csb1="00000000"/>
-  </w:font>
-  <w:font w:name="Aptos">
-    <w:charset w:val="00"/>
-    <w:family w:val="swiss"/>
-    <w:pitch w:val="variable"/>
-    <w:sig w:usb0="20000287" w:usb1="00000003" w:usb2="00000000" w:usb3="00000000" w:csb0="0000019F" w:csb1="00000000"/>
   </w:font>
   <w:font w:name="Yu Mincho">
     <w:charset w:val="80"/>
@@ -7432,11 +10610,12 @@
     <w:pitch w:val="variable"/>
     <w:sig w:usb0="800002E7" w:usb1="2AC7FCFF" w:usb2="00000012" w:usb3="00000000" w:csb0="0002009F" w:csb1="00000000"/>
   </w:font>
-  <w:font w:name="Aptos Display">
+  <w:font w:name="Calibri Light">
+    <w:panose1 w:val="020F0302020204030204"/>
     <w:charset w:val="00"/>
     <w:family w:val="swiss"/>
     <w:pitch w:val="variable"/>
-    <w:sig w:usb0="20000287" w:usb1="00000003" w:usb2="00000000" w:usb3="00000000" w:csb0="0000019F" w:csb1="00000000"/>
+    <w:sig w:usb0="E4002EFF" w:usb1="C200247B" w:usb2="00000009" w:usb3="00000000" w:csb0="000001FF" w:csb1="00000000"/>
   </w:font>
   <w:font w:name="Yu Gothic Light">
     <w:altName w:val="游ゴシック Light"/>
@@ -7450,7 +10629,7 @@
 </file>
 
 <file path=word/glossary/settings.xml><?xml version="1.0" encoding="utf-8"?>
-<w:settings xmlns:mc="http://schemas.openxmlformats.org/markup-compatibility/2006" xmlns:o="urn:schemas-microsoft-com:office:office" xmlns:r="http://schemas.openxmlformats.org/officeDocument/2006/relationships" xmlns:m="http://schemas.openxmlformats.org/officeDocument/2006/math" xmlns:v="urn:schemas-microsoft-com:vml" xmlns:w10="urn:schemas-microsoft-com:office:word" xmlns:w="http://schemas.openxmlformats.org/wordprocessingml/2006/main" xmlns:w14="http://schemas.microsoft.com/office/word/2010/wordml" xmlns:w15="http://schemas.microsoft.com/office/word/2012/wordml" xmlns:w16cex="http://schemas.microsoft.com/office/word/2018/wordml/cex" xmlns:w16cid="http://schemas.microsoft.com/office/word/2016/wordml/cid" xmlns:w16="http://schemas.microsoft.com/office/word/2018/wordml" xmlns:w16du="http://schemas.microsoft.com/office/word/2023/wordml/word16du" xmlns:w16sdtdh="http://schemas.microsoft.com/office/word/2020/wordml/sdtdatahash" xmlns:w16sdtfl="http://schemas.microsoft.com/office/word/2024/wordml/sdtformatlock" xmlns:w16se="http://schemas.microsoft.com/office/word/2015/wordml/symex" xmlns:sl="http://schemas.openxmlformats.org/schemaLibrary/2006/main" mc:Ignorable="w14 w15 w16se w16cid w16 w16cex w16sdtdh w16sdtfl w16du">
+<w:settings xmlns:mc="http://schemas.openxmlformats.org/markup-compatibility/2006" xmlns:o="urn:schemas-microsoft-com:office:office" xmlns:r="http://schemas.openxmlformats.org/officeDocument/2006/relationships" xmlns:m="http://schemas.openxmlformats.org/officeDocument/2006/math" xmlns:v="urn:schemas-microsoft-com:vml" xmlns:w10="urn:schemas-microsoft-com:office:word" xmlns:w="http://schemas.openxmlformats.org/wordprocessingml/2006/main" xmlns:w14="http://schemas.microsoft.com/office/word/2010/wordml" xmlns:w15="http://schemas.microsoft.com/office/word/2012/wordml" xmlns:w16cex="http://schemas.microsoft.com/office/word/2018/wordml/cex" xmlns:w16cid="http://schemas.microsoft.com/office/word/2016/wordml/cid" xmlns:w16="http://schemas.microsoft.com/office/word/2018/wordml" xmlns:w16sdtdh="http://schemas.microsoft.com/office/word/2020/wordml/sdtdatahash" xmlns:w16se="http://schemas.microsoft.com/office/word/2015/wordml/symex" xmlns:sl="http://schemas.openxmlformats.org/schemaLibrary/2006/main" mc:Ignorable="w14 w15 w16se w16cid w16 w16cex w16sdtdh">
   <w:view w:val="normal"/>
   <w:defaultTabStop w:val="708"/>
   <w:hyphenationZone w:val="425"/>
@@ -7475,6 +10654,7 @@
     <w:rsid w:val="00825B36"/>
     <w:rsid w:val="00832103"/>
     <w:rsid w:val="00960213"/>
+    <w:rsid w:val="00A84330"/>
     <w:rsid w:val="00B954B7"/>
     <w:rsid w:val="00BD2436"/>
     <w:rsid w:val="00C40521"/>
@@ -7505,7 +10685,7 @@
 </file>
 
 <file path=word/glossary/styles.xml><?xml version="1.0" encoding="utf-8"?>
-<w:styles xmlns:mc="http://schemas.openxmlformats.org/markup-compatibility/2006" xmlns:r="http://schemas.openxmlformats.org/officeDocument/2006/relationships" xmlns:w="http://schemas.openxmlformats.org/wordprocessingml/2006/main" xmlns:w14="http://schemas.microsoft.com/office/word/2010/wordml" xmlns:w15="http://schemas.microsoft.com/office/word/2012/wordml" xmlns:w16cex="http://schemas.microsoft.com/office/word/2018/wordml/cex" xmlns:w16cid="http://schemas.microsoft.com/office/word/2016/wordml/cid" xmlns:w16="http://schemas.microsoft.com/office/word/2018/wordml" xmlns:w16du="http://schemas.microsoft.com/office/word/2023/wordml/word16du" xmlns:w16sdtdh="http://schemas.microsoft.com/office/word/2020/wordml/sdtdatahash" xmlns:w16sdtfl="http://schemas.microsoft.com/office/word/2024/wordml/sdtformatlock" xmlns:w16se="http://schemas.microsoft.com/office/word/2015/wordml/symex" mc:Ignorable="w14 w15 w16se w16cid w16 w16cex w16sdtdh w16sdtfl w16du">
+<w:styles xmlns:mc="http://schemas.openxmlformats.org/markup-compatibility/2006" xmlns:r="http://schemas.openxmlformats.org/officeDocument/2006/relationships" xmlns:w="http://schemas.openxmlformats.org/wordprocessingml/2006/main" xmlns:w14="http://schemas.microsoft.com/office/word/2010/wordml" xmlns:w15="http://schemas.microsoft.com/office/word/2012/wordml" xmlns:w16cex="http://schemas.microsoft.com/office/word/2018/wordml/cex" xmlns:w16cid="http://schemas.microsoft.com/office/word/2016/wordml/cid" xmlns:w16="http://schemas.microsoft.com/office/word/2018/wordml" xmlns:w16sdtdh="http://schemas.microsoft.com/office/word/2020/wordml/sdtdatahash" xmlns:w16se="http://schemas.microsoft.com/office/word/2015/wordml/symex" mc:Ignorable="w14 w15 w16se w16cid w16 w16cex w16sdtdh">
   <w:docDefaults>
     <w:rPrDefault>
       <w:rPr>
@@ -7934,7 +11114,7 @@
 </file>
 
 <file path=word/glossary/webSettings.xml><?xml version="1.0" encoding="utf-8"?>
-<w:webSettings xmlns:mc="http://schemas.openxmlformats.org/markup-compatibility/2006" xmlns:r="http://schemas.openxmlformats.org/officeDocument/2006/relationships" xmlns:w="http://schemas.openxmlformats.org/wordprocessingml/2006/main" xmlns:w14="http://schemas.microsoft.com/office/word/2010/wordml" xmlns:w15="http://schemas.microsoft.com/office/word/2012/wordml" xmlns:w16cex="http://schemas.microsoft.com/office/word/2018/wordml/cex" xmlns:w16cid="http://schemas.microsoft.com/office/word/2016/wordml/cid" xmlns:w16="http://schemas.microsoft.com/office/word/2018/wordml" xmlns:w16du="http://schemas.microsoft.com/office/word/2023/wordml/word16du" xmlns:w16sdtdh="http://schemas.microsoft.com/office/word/2020/wordml/sdtdatahash" xmlns:w16sdtfl="http://schemas.microsoft.com/office/word/2024/wordml/sdtformatlock" xmlns:w16se="http://schemas.microsoft.com/office/word/2015/wordml/symex" mc:Ignorable="w14 w15 w16se w16cid w16 w16cex w16sdtdh w16sdtfl w16du">
+<w:webSettings xmlns:mc="http://schemas.openxmlformats.org/markup-compatibility/2006" xmlns:r="http://schemas.openxmlformats.org/officeDocument/2006/relationships" xmlns:w="http://schemas.openxmlformats.org/wordprocessingml/2006/main" xmlns:w14="http://schemas.microsoft.com/office/word/2010/wordml" xmlns:w15="http://schemas.microsoft.com/office/word/2012/wordml" xmlns:w16cex="http://schemas.microsoft.com/office/word/2018/wordml/cex" xmlns:w16cid="http://schemas.microsoft.com/office/word/2016/wordml/cid" xmlns:w16="http://schemas.microsoft.com/office/word/2018/wordml" xmlns:w16sdtdh="http://schemas.microsoft.com/office/word/2020/wordml/sdtdatahash" xmlns:w16se="http://schemas.microsoft.com/office/word/2015/wordml/symex" mc:Ignorable="w14 w15 w16se w16cid w16 w16cex w16sdtdh">
   <w:optimizeForBrowser/>
 </w:webSettings>
 </file>
@@ -8224,7 +11404,7 @@
 
 <file path=customXml/item1.xml><?xml version="1.0" encoding="utf-8"?>
 <CoverPageProperties xmlns="http://schemas.microsoft.com/office/2006/coverPageProps">
-  <PublishDate>2026-09-01T00:00:00</PublishDate>
+  <PublishDate>2026-09-02T00:00:00</PublishDate>
   <Abstract>Planificación y Especificación de Requisitos según estándares; IEEE 830, ISO9000 y PMI.</Abstract>
   <CompanyAddress/>
   <CompanyPhone/>
@@ -8238,6 +11418,25 @@
 </file>
 
 <file path=customXml/item3.xml><?xml version="1.0" encoding="utf-8"?>
+<p:properties xmlns:p="http://schemas.microsoft.com/office/2006/metadata/properties" xmlns:xsi="http://www.w3.org/2001/XMLSchema-instance" xmlns:pc="http://schemas.microsoft.com/office/infopath/2007/PartnerControls">
+  <documentManagement>
+    <lcf76f155ced4ddcb4097134ff3c332f xmlns="e1e7bc46-bed0-459f-9452-a76b1c5b695e">
+      <Terms xmlns="http://schemas.microsoft.com/office/infopath/2007/PartnerControls"/>
+    </lcf76f155ced4ddcb4097134ff3c332f>
+  </documentManagement>
+</p:properties>
+</file>
+
+<file path=customXml/item4.xml><?xml version="1.0" encoding="utf-8"?>
+<?mso-contentType ?>
+<FormTemplates xmlns="http://schemas.microsoft.com/sharepoint/v3/contenttype/forms">
+  <Display>DocumentLibraryForm</Display>
+  <Edit>DocumentLibraryForm</Edit>
+  <New>DocumentLibraryForm</New>
+</FormTemplates>
+</file>
+
+<file path=customXml/item5.xml><?xml version="1.0" encoding="utf-8"?>
 <ct:contentTypeSchema xmlns:ct="http://schemas.microsoft.com/office/2006/metadata/contentType" xmlns:ma="http://schemas.microsoft.com/office/2006/metadata/properties/metaAttributes" ct:_="" ma:_="" ma:contentTypeName="Documento" ma:contentTypeID="0x0101005395107FFD641345A10C8A5ACACB9D20" ma:contentTypeVersion="13" ma:contentTypeDescription="Crear nuevo documento." ma:contentTypeScope="" ma:versionID="7407f70e7181b908656026f379795b2c">
   <xsd:schema xmlns:xsd="http://www.w3.org/2001/XMLSchema" xmlns:xs="http://www.w3.org/2001/XMLSchema" xmlns:p="http://schemas.microsoft.com/office/2006/metadata/properties" xmlns:ns2="e1e7bc46-bed0-459f-9452-a76b1c5b695e" xmlns:ns3="bb8cf7e1-610f-40a0-8f00-126b9d139fde" targetNamespace="http://schemas.microsoft.com/office/2006/metadata/properties" ma:root="true" ma:fieldsID="b29ea8901729e1eaaa4e48e09148c760" ns2:_="" ns3:_="">
     <xsd:import namespace="e1e7bc46-bed0-459f-9452-a76b1c5b695e"/>
@@ -8454,25 +11653,6 @@
 </ct:contentTypeSchema>
 </file>
 
-<file path=customXml/item4.xml><?xml version="1.0" encoding="utf-8"?>
-<?mso-contentType ?>
-<FormTemplates xmlns="http://schemas.microsoft.com/sharepoint/v3/contenttype/forms">
-  <Display>DocumentLibraryForm</Display>
-  <Edit>DocumentLibraryForm</Edit>
-  <New>DocumentLibraryForm</New>
-</FormTemplates>
-</file>
-
-<file path=customXml/item5.xml><?xml version="1.0" encoding="utf-8"?>
-<p:properties xmlns:p="http://schemas.microsoft.com/office/2006/metadata/properties" xmlns:xsi="http://www.w3.org/2001/XMLSchema-instance" xmlns:pc="http://schemas.microsoft.com/office/infopath/2007/PartnerControls">
-  <documentManagement>
-    <lcf76f155ced4ddcb4097134ff3c332f xmlns="e1e7bc46-bed0-459f-9452-a76b1c5b695e">
-      <Terms xmlns="http://schemas.microsoft.com/office/infopath/2007/PartnerControls"/>
-    </lcf76f155ced4ddcb4097134ff3c332f>
-  </documentManagement>
-</p:properties>
-</file>
-
 <file path=customXml/itemProps1.xml><?xml version="1.0" encoding="utf-8"?>
 <ds:datastoreItem xmlns:ds="http://schemas.openxmlformats.org/officeDocument/2006/customXml" ds:itemID="{55AF091B-3C7A-41E3-B477-F2FDAA23CFDA}">
   <ds:schemaRefs>
@@ -8490,6 +11670,24 @@
 </file>
 
 <file path=customXml/itemProps3.xml><?xml version="1.0" encoding="utf-8"?>
+<ds:datastoreItem xmlns:ds="http://schemas.openxmlformats.org/officeDocument/2006/customXml" ds:itemID="{E1036DFC-1D85-404D-898C-621D06C0EB1C}">
+  <ds:schemaRefs>
+    <ds:schemaRef ds:uri="http://schemas.microsoft.com/office/2006/metadata/properties"/>
+    <ds:schemaRef ds:uri="http://schemas.microsoft.com/office/infopath/2007/PartnerControls"/>
+    <ds:schemaRef ds:uri="e1e7bc46-bed0-459f-9452-a76b1c5b695e"/>
+  </ds:schemaRefs>
+</ds:datastoreItem>
+</file>
+
+<file path=customXml/itemProps4.xml><?xml version="1.0" encoding="utf-8"?>
+<ds:datastoreItem xmlns:ds="http://schemas.openxmlformats.org/officeDocument/2006/customXml" ds:itemID="{EE9AAF0E-D63F-459F-A0FB-CDCE9F728F33}">
+  <ds:schemaRefs>
+    <ds:schemaRef ds:uri="http://schemas.microsoft.com/sharepoint/v3/contenttype/forms"/>
+  </ds:schemaRefs>
+</ds:datastoreItem>
+</file>
+
+<file path=customXml/itemProps5.xml><?xml version="1.0" encoding="utf-8"?>
 <ds:datastoreItem xmlns:ds="http://schemas.openxmlformats.org/officeDocument/2006/customXml" ds:itemID="{444115BD-C1C6-48AD-B714-E1866627071D}">
   <ds:schemaRefs>
     <ds:schemaRef ds:uri="http://schemas.microsoft.com/office/2006/metadata/contentType"/>
@@ -8506,22 +11704,4 @@
     <ds:schemaRef ds:uri="http://schemas.microsoft.com/internal/obd"/>
   </ds:schemaRefs>
 </ds:datastoreItem>
-</file>
-
-<file path=customXml/itemProps4.xml><?xml version="1.0" encoding="utf-8"?>
-<ds:datastoreItem xmlns:ds="http://schemas.openxmlformats.org/officeDocument/2006/customXml" ds:itemID="{EE9AAF0E-D63F-459F-A0FB-CDCE9F728F33}">
-  <ds:schemaRefs>
-    <ds:schemaRef ds:uri="http://schemas.microsoft.com/sharepoint/v3/contenttype/forms"/>
-  </ds:schemaRefs>
-</ds:datastoreItem>
-</file>
-
-<file path=customXml/itemProps5.xml><?xml version="1.0" encoding="utf-8"?>
-<ds:datastoreItem xmlns:ds="http://schemas.openxmlformats.org/officeDocument/2006/customXml" ds:itemID="{E1036DFC-1D85-404D-898C-621D06C0EB1C}">
-  <ds:schemaRefs>
-    <ds:schemaRef ds:uri="http://schemas.microsoft.com/office/2006/metadata/properties"/>
-    <ds:schemaRef ds:uri="http://schemas.microsoft.com/office/infopath/2007/PartnerControls"/>
-    <ds:schemaRef ds:uri="e1e7bc46-bed0-459f-9452-a76b1c5b695e"/>
-  </ds:schemaRefs>
-</ds:datastoreItem>
 </file>
</xml_diff>